<commit_message>
Version 2 en principal : notebook v2 renommé TP_reco, v1 déplacée dans questionnaire/v1 (_old), rapport v2 relu, README
</commit_message>
<xml_diff>
--- a/questionnaire/v2/rapport_v2.docx
+++ b/questionnaire/v2/rapport_v2.docx
@@ -589,11 +589,9 @@
         </w:numPr>
       </w:pPr>
       <w:r>
-        <w:t>apprendre les cases vides avec un modèle (factorisation matricielle) : c'est l'approche « model-based » du cours, hors du cadre user-based du TP</w:t>
-      </w:r>
-      <w:r>
-        <w:t xml:space="preserve"> on suppose</w:t>
-      </w:r>
+        <w:t>apprendre les cases vides avec un modèle (factorisation matricielle) : c'est l'approche « model-based » du cours, a priori hors du cadre user-based du TP</w:t>
+      </w:r>
+      <w:r/>
     </w:p>
     <w:p>
       <w:pPr>
@@ -1736,12 +1734,12 @@
     <w:p/>
     <w:p>
       <w:r>
-        <w:t>Stabilité. Entre les 5 parts, l'écart-type du NDCG vaut entre 0,002 et 0,008 : deux réglages à moins de 0,01 l'un de l'autre ne sont pas départageables. Le tableau montre que les deux réglages vont ensemble : ce qui compte, c'est le rapport seuil / voisins, autour d'un tiers. Sur cette diagonale, (30, 10), (50, 15) et (100, 35) donnent tous 0,15, et le plateau commence vers k = 25 : (25, 8) et (25, 10) font 0,146, (20, 7) 0,143. Stable. En dehors, c'est instable dans les deux sens : trop de seuil et les listes se vident (à k = 50, passer de 15 à 25 divise le NDCG par 1,6), pas assez de seuil et les listes se remplissent de films vus par un seul voisin ((100, 3) tombe à 0,008 ; à k = 20, le seuil 5 fait perdre 0,017 par rapport au seuil 7). Il faut donc régler les deux ensemble.</w:t>
-      </w:r>
-    </w:p>
-    <w:p>
-      <w:r>
-        <w:t>On a aussi testé un seuil de similarité cosinus pour être voisin. En plus des k voisins, un seuil de 0,10 ne change rien (NDCG 0,145 contre 0,151 à (50, 15)) et 0,15 fait perdre 0,03. À la place des k voisins, le NDCG est divisé par deux (0,070 à 0,10, 0,091 à 0,15) : les similarités sont trop hétérogènes d'un utilisateur à l'autre (le 50e voisin vaut 0,03 chez certains et 0,40 chez d'autres ; à 0,10, de 0 à 522 voisins selon l'utilisateur), et un seuil fixe casse le lien entre k et min_voisins. On garde les k voisins.</w:t>
+        <w:t>Stabilité. Entre les 5 parts, l'écart-type du NDCG vaut entre 0,002 et 0,008 : deux réglages à moins de 0,01 l'un de l'autre ne sont pas départageables. Le tableau montre que les deux réglages vont ensemble : ce qui compte, c'est le rapport seuil / voisins, autour d'un tiers. Sur cette diagonale, (30, 10), (50, 15) et (100, 35) donnent tous 0,15, et le plateau commence vers k = 25 : (25, 8) et (25, 10) font 0,146, (20, 7) 0,143. Stable. En dehors, c'est instable dans les deux sens : trop de seuil et les listes se vident (à k = 50, passer de 15 à 25 divise le NDCG par 1,6), pas assez de seuil et les listes se remplissent de films vus par un seul voisin ((100, 3) tombe à 0,008, et à k = 20 le seuil 5 fait perdre 0,017 par rapport au seuil 7). Il faut donc régler les deux ensemble.</w:t>
+      </w:r>
+    </w:p>
+    <w:p>
+      <w:r>
+        <w:t>On a aussi testé un seuil de similarité cosinus pour être voisin. En plus des k voisins, un seuil de 0,10 ne change rien (NDCG 0,145 contre 0,151 à (50, 15)) et 0,15 fait perdre 0,03. À la place des k voisins, le NDCG est divisé par deux (0,070 à 0,10, 0,091 à 0,15) : les similarités sont trop hétérogènes d'un utilisateur à l'autre (le 50e voisin vaut 0,03 chez certains et 0,40 chez d'autres, et avec un seuil à 0,10 on a de 0 à 522 voisins selon l'utilisateur), et un seuil fixe casse le lien entre k et min_voisins. On garde les k voisins.</w:t>
       </w:r>
     </w:p>
     <w:p>
@@ -2053,7 +2051,7 @@
     <w:p/>
     <w:p>
       <w:r>
-        <w:t>Système retenu : (30, 10). Une limite à connaître : avec 30 voisins et un seuil de 10, 24 utilisateurs sur 671 ont moins de 10 films recommandables, et reçoivent une liste plus courte. La précision@10 divise toujours par 10, donc ces utilisateurs sont pénalisés dans la mesure ; ça n'empêche pas le réglage d'être devant sur le test.</w:t>
+        <w:t>Système retenu : (30, 10). Une limite à connaître : avec 30 voisins et un seuil de 10, 24 utilisateurs sur 671 ont moins de 10 films recommandables, et reçoivent une liste plus courte. La précision@10 divise toujours par 10, donc ces utilisateurs sont pénalisés dans la mesure. Ça n'empêche pas le réglage d'être devant sur le test.</w:t>
       </w:r>
     </w:p>
     <w:p>
@@ -2523,7 +2521,7 @@
     </w:p>
     <w:p>
       <w:r>
-        <w:t>Figure 2, le compromis entre qualité et variété. Un point par réglage. En abscisse, le nombre de films différents proposés dans l'ensemble des 671 listes de validation. En ordonnée, le NDCG@10. La couleur donne la popularité médiane des films proposés, du violet (films quasi inconnus) au jaune (uniquement des classiques). Pour comparer, le film médian du catalogue a 3 avis. Les trois grandeurs bougent ensemble : plus le seuil monte, plus les films proposés sont populaires, moins il y en a de différents, et le NDCG monte jusqu'à un plateau puis retombe. L'étoile rouge est le (30, 10) retenu : sur le plateau, c'est le point le plus à droite. (50, 15) et (100, 35) sont à sa gauche, aussi bons et moins variés ; (25, 8), à sa droite, est un peu moins bon et encore plus varié.</w:t>
+        <w:t>Figure 2, le compromis entre qualité et variété. Un point par réglage. En abscisse, le nombre de films différents proposés dans l'ensemble des 671 listes de validation. En ordonnée, le NDCG@10. La couleur donne la popularité médiane des films proposés, du violet (films quasi inconnus) au jaune (uniquement des classiques). Pour comparer, le film médian du catalogue a 3 avis. Les trois grandeurs bougent ensemble : plus le seuil monte, plus les films proposés sont populaires, moins il y en a de différents, et le NDCG monte jusqu'à un plateau puis retombe. L'étoile rouge est le (30, 10) retenu : sur le plateau, c'est le point le plus à droite. (50, 15) et (100, 35) sont à sa gauche, aussi bons et moins variés. (25, 8), à sa droite, est un peu moins bon et encore plus varié.</w:t>
       </w:r>
     </w:p>
     <w:p>
@@ -4142,7 +4140,7 @@
     <w:p/>
     <w:p>
       <w:r>
-        <w:t>Réponse : diverses en genres, autant que les goûts de l'utilisateur. Un top 10 du système couvre 10,7 genres différents en moyenne et 43 % de ses paires de films n'ont aucun genre en commun, contre 10,3 et 39 % pour les dix films préférés de l'utilisateur. Le système reproduit la variété des goûts de chacun, un peu plus. Le repère des films les plus notés est le plus varié (11,6 et 54 %), ce qui est logique : il mélange tout sans tenir compte de personne, la variété n'est pas un mérite chez lui.</w:t>
+        <w:t>Réponse : diverses en genres, autant que les goûts de l'utilisateur. Un top 10 du système couvre 10,7 genres différents en moyenne et 43 % de ses paires de films n'ont aucun genre en commun, contre 10,3 et 39 % pour les dix films préférés de l'utilisateur. Le système reproduit la variété des goûts de chacun, un peu plus. Le repère des films les plus notés est le plus varié (11,5 et 54 %), ce qui est logique : il mélange tout sans tenir compte de personne, la variété n'est pas un mérite chez lui.</w:t>
       </w:r>
     </w:p>
     <w:p>
@@ -4767,12 +4765,12 @@
     </w:p>
     <w:p>
       <w:r>
-        <w:t>Les trois figures déposées. La première montre les 15 films les plus proposés par le système, avec la part des 671 utilisateurs qui les reçoivent dans leur top 10 : The Shawshank Redemption est proposé à 44 % des utilisateurs, et les cinq premiers films à plus d'un tiers des utilisateurs chacun. En orange, la part pour les mêmes films avec l'item-based : presque toujours bien plus basse, sauf pour deux ou trois films. Il répartit mieux ses recommandations.</w:t>
-      </w:r>
-    </w:p>
-    <w:p>
-      <w:r>
-        <w:t>La seconde montre la concentration de façon globale : on classe les films du plus proposé au moins proposé (en abscisse, échelle logarithmique) et on cumule la part des recommandations qu'ils représentent (en ordonnée). Plus la courbe monte vite, plus le système se concentre sur peu de films. La ligne pointillée est la moitié des recommandations : 8 films pour le repère, 23 pour notre système, 32 pour l'item-based. Aucune des trois courbes n'approche les 8 384 films du catalogue.</w:t>
+        <w:t>Les figures déposées. La première image a deux panneaux. Le panneau de gauche montre les 15 films les plus proposés par le système, avec la part des 671 utilisateurs qui les reçoivent dans leur top 10 : The Shawshank Redemption est proposé à 44 % des utilisateurs, et les cinq premiers films à plus d'un tiers des utilisateurs chacun. En orange, la part pour les mêmes films avec l'item-based : presque toujours bien plus basse, sauf pour deux ou trois films. Il répartit mieux ses recommandations.</w:t>
+      </w:r>
+    </w:p>
+    <w:p>
+      <w:r>
+        <w:t>Le panneau de droite montre la concentration de façon globale : on classe les films du plus proposé au moins proposé (en abscisse, échelle logarithmique) et on cumule la part des recommandations qu'ils représentent (en ordonnée). Plus la courbe monte vite, plus le système se concentre sur peu de films. La ligne pointillée est la moitié des recommandations : 8 films pour le repère, 23 pour notre système, 32 pour l'item-based. Aucune des trois courbes n'approche les 8 384 films du catalogue.</w:t>
       </w:r>
     </w:p>
     <w:p>
@@ -4813,7 +4811,7 @@
     </w:p>
     <w:p>
       <w:r>
-        <w:t>La troisième compare, genre par genre, la part des films qui portent ce genre dans le catalogue (gris clair), dans les avis du train c'est-à-dire ce que les gens notent réellement (gris), dans nos recommandations (bleu) et dans celles de l'item-based (orange). Un film pouvant avoir plusieurs genres, les parts ne font pas 100. On y voit les barres bleues qui dépassent largement le catalogue pour Crime, Thriller et Drama, et qui s'effondrent pour Comedy, Romance, Horror et Documentary.</w:t>
+        <w:t>La seconde image compare, genre par genre, la part des films qui portent ce genre dans le catalogue (gris clair), dans les avis du train c'est-à-dire ce que les gens notent réellement (gris), dans nos recommandations (bleu) et dans celles de l'item-based (orange). Un film pouvant avoir plusieurs genres, les parts ne font pas 100. On y voit les barres bleues qui dépassent largement le catalogue pour Crime, Thriller et Drama, et qui s'effondrent pour Comedy, Romance, Horror et Documentary.</w:t>
       </w:r>
     </w:p>
     <w:p>
@@ -5144,7 +5142,7 @@
     <w:p/>
     <w:p>
       <w:r>
-        <w:t>Fight Club, Star Wars, Se7en et Il faut sauver le soldat Ryan d'un côté ; Le Parrain, Memento, 2001 et Blade Runner de l'autre. Les deux reçoivent un Seigneur des anneaux, mais pas le même. C'est là qu'on voit les sept dixièmes personnalisés ; les trois dixièmes communs sont les classiques que le seuil de voisins fait remonter chez presque tout le monde, et qui ne tombent pas ici dans la même liste.</w:t>
+        <w:t>Fight Club, Star Wars, Se7en et Il faut sauver le soldat Ryan d'un côté, Le Parrain, Memento, 2001 et Blade Runner de l'autre. Les deux reçoivent un Seigneur des anneaux, mais pas le même. C'est là qu'on voit les sept dixièmes personnalisés. Les trois dixièmes communs sont les classiques que le seuil de voisins fait remonter chez presque tout le monde, et qui ne tombent pas ici dans la même liste.</w:t>
       </w:r>
     </w:p>
     <w:p>

</xml_diff>

<commit_message>
Rapport v2 : question 6 resserrée
</commit_message>
<xml_diff>
--- a/questionnaire/v2/rapport_v2.docx
+++ b/questionnaire/v2/rapport_v2.docx
@@ -640,7 +640,7 @@
     </w:p>
     <w:p>
       <w:r>
-        <w:t>Les deux hyperparamètres. k est le nombre de voisins dont on fait la moyenne. min_voisins est le nombre de voisins qui doivent avoir vu un film pour qu'on puisse le recommander. Ce deuxième réglage, on l'a ajouté nous-mêmes à l'algorithme du cours : sans lui, le top 10 était rempli de films vus par un seul voisin qui avait mis 5, et une note prédite de 5 sur un seul avis passait devant Pulp Fiction à 4,6 sur 21 avis. Il ne joue que dans le classement, pas dans la note prédite. On est conscients de son effet de bord : plus il est haut, plus il ne laisse passer que des films très vus, donc il renforce le biais de popularité vu en cours. C'est pour ça qu'on a suivi, pour chaque réglage, la popularité et le nombre de films différents proposés en plus des métriques. Au départ on avait fixé k = 30 et min_voisins = 3 à l'œil. Dans la suite on note un réglage (k, min_voisins).</w:t>
+        <w:t>Les deux hyperparamètres. k est le nombre de voisins dont on fait la moyenne. min_voisins est le nombre de voisins qui doivent avoir vu un film pour qu'on puisse le recommander. Ce deuxième réglage, on l'a ajouté nous-mêmes à l'algorithme du cours : sans lui, le top 10 était rempli de films vus par un seul voisin qui avait mis 5, et une note prédite de 5 sur un seul avis passait devant Pulp Fiction à 4,6 sur 21 avis. On est conscients de son effet de bord : plus il est haut, plus il ne laisse passer que des films très vus, donc il renforce le biais de popularité vu en cours. C'est pour ça qu'on a suivi, pour chaque réglage, la popularité et le nombre de films différents proposés en plus des métriques. Au départ on avait fixé k = 30 et min_voisins = 3 à l'œil. On note un réglage (k, min_voisins).</w:t>
       </w:r>
     </w:p>
     <w:p>
@@ -1237,310 +1237,9 @@
     <w:p/>
     <w:p>
       <w:r>
-        <w:t>Les deux zéros à k = 10 sont normaux : un film ne peut pas avoir été vu par 10 ou 15 voisins sur 10, les listes sont vides. Les quatre réglages ajoutés à petit k, sur la diagonale min_voisins ≈ k / 3 :</w:t>
-      </w:r>
-    </w:p>
-    <w:tbl>
-      <w:tblPr>
-        <w:tblStyle w:val="TableGrid"/>
-        <w:tblW w:type="auto" w:w="0"/>
-        <w:tblLook w:firstColumn="1" w:firstRow="1" w:lastColumn="0" w:lastRow="0" w:noHBand="0" w:noVBand="1" w:val="04A0"/>
-      </w:tblPr>
-      <w:tblGrid>
-        <w:gridCol w:w="1814"/>
-        <w:gridCol w:w="1814"/>
-        <w:gridCol w:w="1814"/>
-        <w:gridCol w:w="1814"/>
-        <w:gridCol w:w="1814"/>
-      </w:tblGrid>
-      <w:tr>
-        <w:tc>
-          <w:tcPr>
-            <w:tcW w:type="dxa" w:w="1814"/>
-          </w:tcPr>
-          <w:p>
-            <w:r>
-              <w:rPr>
-                <w:b/>
-              </w:rPr>
-              <w:t>Réglage</w:t>
-            </w:r>
-          </w:p>
-        </w:tc>
-        <w:tc>
-          <w:tcPr>
-            <w:tcW w:type="dxa" w:w="1814"/>
-          </w:tcPr>
-          <w:p>
-            <w:r>
-              <w:rPr>
-                <w:b/>
-              </w:rPr>
-              <w:t>NDCG@10</w:t>
-            </w:r>
-          </w:p>
-        </w:tc>
-        <w:tc>
-          <w:tcPr>
-            <w:tcW w:type="dxa" w:w="1814"/>
-          </w:tcPr>
-          <w:p>
-            <w:r>
-              <w:rPr>
-                <w:b/>
-              </w:rPr>
-              <w:t>RMSE</w:t>
-            </w:r>
-          </w:p>
-        </w:tc>
-        <w:tc>
-          <w:tcPr>
-            <w:tcW w:type="dxa" w:w="1814"/>
-          </w:tcPr>
-          <w:p>
-            <w:r>
-              <w:rPr>
-                <w:b/>
-              </w:rPr>
-              <w:t>Films différents proposés</w:t>
-            </w:r>
-          </w:p>
-        </w:tc>
-        <w:tc>
-          <w:tcPr>
-            <w:tcW w:type="dxa" w:w="1814"/>
-          </w:tcPr>
-          <w:p>
-            <w:r>
-              <w:rPr>
-                <w:b/>
-              </w:rPr>
-              <w:t>Popularité médiane (avis)</w:t>
-            </w:r>
-          </w:p>
-        </w:tc>
-      </w:tr>
-      <w:tr>
-        <w:tc>
-          <w:tcPr>
-            <w:tcW w:type="dxa" w:w="1814"/>
-          </w:tcPr>
-          <w:p>
-            <w:r>
-              <w:rPr>
-                <w:b/>
-              </w:rPr>
-              <w:t>(20, 7)</w:t>
-            </w:r>
-          </w:p>
-        </w:tc>
-        <w:tc>
-          <w:tcPr>
-            <w:tcW w:type="dxa" w:w="1814"/>
-          </w:tcPr>
-          <w:p>
-            <w:r>
-              <w:t>0,143</w:t>
-            </w:r>
-          </w:p>
-        </w:tc>
-        <w:tc>
-          <w:tcPr>
-            <w:tcW w:type="dxa" w:w="1814"/>
-          </w:tcPr>
-          <w:p>
-            <w:r>
-              <w:t>1,045</w:t>
-            </w:r>
-          </w:p>
-        </w:tc>
-        <w:tc>
-          <w:tcPr>
-            <w:tcW w:type="dxa" w:w="1814"/>
-          </w:tcPr>
-          <w:p>
-            <w:r>
-              <w:t>374</w:t>
-            </w:r>
-          </w:p>
-        </w:tc>
-        <w:tc>
-          <w:tcPr>
-            <w:tcW w:type="dxa" w:w="1814"/>
-          </w:tcPr>
-          <w:p>
-            <w:r>
-              <w:t>124</w:t>
-            </w:r>
-          </w:p>
-        </w:tc>
-      </w:tr>
-      <w:tr>
-        <w:tc>
-          <w:tcPr>
-            <w:tcW w:type="dxa" w:w="1814"/>
-          </w:tcPr>
-          <w:p>
-            <w:r>
-              <w:rPr>
-                <w:b/>
-              </w:rPr>
-              <w:t>(20, 8)</w:t>
-            </w:r>
-          </w:p>
-        </w:tc>
-        <w:tc>
-          <w:tcPr>
-            <w:tcW w:type="dxa" w:w="1814"/>
-          </w:tcPr>
-          <w:p>
-            <w:r>
-              <w:t>0,142</w:t>
-            </w:r>
-          </w:p>
-        </w:tc>
-        <w:tc>
-          <w:tcPr>
-            <w:tcW w:type="dxa" w:w="1814"/>
-          </w:tcPr>
-          <w:p>
-            <w:r>
-              <w:t>1,045</w:t>
-            </w:r>
-          </w:p>
-        </w:tc>
-        <w:tc>
-          <w:tcPr>
-            <w:tcW w:type="dxa" w:w="1814"/>
-          </w:tcPr>
-          <w:p>
-            <w:r>
-              <w:t>337</w:t>
-            </w:r>
-          </w:p>
-        </w:tc>
-        <w:tc>
-          <w:tcPr>
-            <w:tcW w:type="dxa" w:w="1814"/>
-          </w:tcPr>
-          <w:p>
-            <w:r>
-              <w:t>126</w:t>
-            </w:r>
-          </w:p>
-        </w:tc>
-      </w:tr>
-      <w:tr>
-        <w:tc>
-          <w:tcPr>
-            <w:tcW w:type="dxa" w:w="1814"/>
-          </w:tcPr>
-          <w:p>
-            <w:r>
-              <w:rPr>
-                <w:b/>
-              </w:rPr>
-              <w:t>(25, 8)</w:t>
-            </w:r>
-          </w:p>
-        </w:tc>
-        <w:tc>
-          <w:tcPr>
-            <w:tcW w:type="dxa" w:w="1814"/>
-          </w:tcPr>
-          <w:p>
-            <w:r>
-              <w:t>0,146</w:t>
-            </w:r>
-          </w:p>
-        </w:tc>
-        <w:tc>
-          <w:tcPr>
-            <w:tcW w:type="dxa" w:w="1814"/>
-          </w:tcPr>
-          <w:p>
-            <w:r>
-              <w:t>1,037</w:t>
-            </w:r>
-          </w:p>
-        </w:tc>
-        <w:tc>
-          <w:tcPr>
-            <w:tcW w:type="dxa" w:w="1814"/>
-          </w:tcPr>
-          <w:p>
-            <w:r>
-              <w:t>339</w:t>
-            </w:r>
-          </w:p>
-        </w:tc>
-        <w:tc>
-          <w:tcPr>
-            <w:tcW w:type="dxa" w:w="1814"/>
-          </w:tcPr>
-          <w:p>
-            <w:r>
-              <w:t>126</w:t>
-            </w:r>
-          </w:p>
-        </w:tc>
-      </w:tr>
-      <w:tr>
-        <w:tc>
-          <w:tcPr>
-            <w:tcW w:type="dxa" w:w="1814"/>
-          </w:tcPr>
-          <w:p>
-            <w:r>
-              <w:rPr>
-                <w:b/>
-              </w:rPr>
-              <w:t>(25, 10)</w:t>
-            </w:r>
-          </w:p>
-        </w:tc>
-        <w:tc>
-          <w:tcPr>
-            <w:tcW w:type="dxa" w:w="1814"/>
-          </w:tcPr>
-          <w:p>
-            <w:r>
-              <w:t>0,146</w:t>
-            </w:r>
-          </w:p>
-        </w:tc>
-        <w:tc>
-          <w:tcPr>
-            <w:tcW w:type="dxa" w:w="1814"/>
-          </w:tcPr>
-          <w:p>
-            <w:r>
-              <w:t>1,037</w:t>
-            </w:r>
-          </w:p>
-        </w:tc>
-        <w:tc>
-          <w:tcPr>
-            <w:tcW w:type="dxa" w:w="1814"/>
-          </w:tcPr>
-          <w:p>
-            <w:r>
-              <w:t>287</w:t>
-            </w:r>
-          </w:p>
-        </w:tc>
-        <w:tc>
-          <w:tcPr>
-            <w:tcW w:type="dxa" w:w="1814"/>
-          </w:tcPr>
-          <w:p>
-            <w:r>
-              <w:t>128</w:t>
-            </w:r>
-          </w:p>
-        </w:tc>
-      </w:tr>
-    </w:tbl>
+        <w:t>Les deux zéros à k = 10 sont normaux : un film ne peut pas avoir été vu par 10 ou 15 voisins sur 10, les listes sont vides. Les quatre réglages ajoutés à petit k confirment la diagonale, sans faire mieux : (20, 7) 0,143, (25, 8) et (25, 10) 0,146.</w:t>
+      </w:r>
+    </w:p>
     <w:p/>
     <w:p>
       <w:r>
@@ -1734,17 +1433,17 @@
     <w:p/>
     <w:p>
       <w:r>
-        <w:t>Stabilité. Entre les 5 parts, l'écart-type du NDCG vaut entre 0,002 et 0,008 : deux réglages à moins de 0,01 l'un de l'autre ne sont pas départageables. Le tableau montre que les deux réglages vont ensemble : ce qui compte, c'est le rapport seuil / voisins, autour d'un tiers. Sur cette diagonale, (30, 10), (50, 15) et (100, 35) donnent tous 0,15, et le plateau commence vers k = 25 : (25, 8) et (25, 10) font 0,146, (20, 7) 0,143. Stable. En dehors, c'est instable dans les deux sens : trop de seuil et les listes se vident (à k = 50, passer de 15 à 25 divise le NDCG par 1,6), pas assez de seuil et les listes se remplissent de films vus par un seul voisin ((100, 3) tombe à 0,008, et à k = 20 le seuil 5 fait perdre 0,017 par rapport au seuil 7). Il faut donc régler les deux ensemble.</w:t>
-      </w:r>
-    </w:p>
-    <w:p>
-      <w:r>
-        <w:t>On a aussi testé un seuil de similarité cosinus pour être voisin. En plus des k voisins, un seuil de 0,10 ne change rien (NDCG 0,145 contre 0,151 à (50, 15)) et 0,15 fait perdre 0,03. À la place des k voisins, le NDCG est divisé par deux (0,070 à 0,10, 0,091 à 0,15) : les similarités sont trop hétérogènes d'un utilisateur à l'autre (le 50e voisin vaut 0,03 chez certains et 0,40 chez d'autres, et avec un seuil à 0,10 on a de 0 à 522 voisins selon l'utilisateur), et un seuil fixe casse le lien entre k et min_voisins. On garde les k voisins.</w:t>
-      </w:r>
-    </w:p>
-    <w:p>
-      <w:r>
-        <w:t>Choix du système. Le meilleur NDCG moyen est (50, 15), 0,151 ± 0,004. Mais quatre réglages sont à moins d'un écart-type de ce maximum, donc indépartageables sur le critère principal : (30, 10), (50, 15), (50, 20) et (100, 35). On applique alors la règle « à un écart-type », la règle usuelle pour choisir un modèle en validation croisée : parmi les réglages indépartageables, on départage sur un second critère. La RMSE désignerait (100, 35) (1,004), mais avec 126 films différents proposés seulement. La variété désigne (30, 10) : 289 films différents contre 219 pour (50, 15) et 126 pour (100, 35), et les films les moins populaires des quatre (129 avis en médiane contre 134 et 143). On prend la variété comme second critère, parce que le cours et l'exercice 5 pointent le biais de popularité comme la faiblesse principale du filtrage collaboratif, et parce que la RMSE n'est ici qu'un contrôle : elle ne dépend que de k et aucun réglage ne la fait passer sous la moyenne de l'utilisateur.</w:t>
+        <w:t>Stabilité. Entre les 5 parts, l'écart-type du NDCG vaut entre 0,002 et 0,008 : deux réglages à moins de 0,01 l'un de l'autre ne sont pas départageables. Le tableau montre que les deux réglages vont ensemble : ce qui compte, c'est le rapport seuil / voisins, autour d'un tiers. Sur cette diagonale, (30, 10), (50, 15) et (100, 35) donnent tous 0,15, et le plateau commence vers k = 25. Stable. En dehors, c'est instable dans les deux sens : trop de seuil et les listes se vident (à k = 50, passer de 15 à 25 divise le NDCG par 1,6), pas assez de seuil et les listes se remplissent de films vus par un seul voisin ((100, 3) tombe à 0,008). Il faut donc régler les deux ensemble.</w:t>
+      </w:r>
+    </w:p>
+    <w:p>
+      <w:r>
+        <w:t>On a aussi essayé un seuil de similarité pour être voisin, en plus des k voisins ou à la place. En plus, ça ne change rien. À la place, le NDCG est divisé par deux, parce que les similarités sont trop différentes d'un utilisateur à l'autre : avec le même seuil, l'un a 0 voisin et l'autre plus de 500. On garde les k voisins.</w:t>
+      </w:r>
+    </w:p>
+    <w:p>
+      <w:r>
+        <w:t>Choix du système. Le meilleur NDCG moyen est (50, 15), 0,151 ± 0,004, mais quatre réglages sont à moins d'un écart-type de ce maximum, donc indépartageables : (30, 10), (50, 15), (50, 20) et (100, 35). On applique la règle « à un écart-type », la règle usuelle pour choisir un modèle en validation croisée : parmi les réglages indépartageables, on départage sur un second critère. La RMSE désignerait (100, 35), mais avec 126 films différents proposés seulement. La variété désigne (30, 10) : 289 films différents contre 219 pour (50, 15), et les films les moins populaires des quatre (129 avis en médiane contre 134). On prend la variété, parce que le cours et l'exercice 5 pointent le biais de popularité comme la faiblesse principale du filtrage collaboratif, et parce que la RMSE n'est qu'un contrôle : aucun réglage ne la fait passer sous la moyenne de l'utilisateur.</w:t>
       </w:r>
     </w:p>
     <w:tbl>
@@ -2051,7 +1750,7 @@
     <w:p/>
     <w:p>
       <w:r>
-        <w:t>Système retenu : (30, 10). Une limite à connaître : avec 30 voisins et un seuil de 10, 24 utilisateurs sur 671 ont moins de 10 films recommandables, et reçoivent une liste plus courte. La précision@10 divise toujours par 10, donc ces utilisateurs sont pénalisés dans la mesure. Ça n'empêche pas le réglage d'être devant sur le test.</w:t>
+        <w:t>Système retenu : (30, 10). Une limite à connaître : avec 30 voisins et un seuil de 10, 24 utilisateurs sur 671 reçoivent une liste plus courte que 10, ce qui les pénalise dans la précision@10 (qui divise toujours par 10). Ça n'empêche pas le réglage d'être devant sur le test.</w:t>
       </w:r>
     </w:p>
     <w:p>
@@ -2470,7 +2169,7 @@
     <w:p/>
     <w:p>
       <w:r>
-        <w:t>Le système réglé passe devant le repère qui recommande les films les plus notés à tout le monde, et le test confirme que la variété n'a rien coûté : (30, 10) fait même un peu mieux que (50, 15) sur le top 10 (0,201 contre 0,191), pour une RMSE un peu moins bonne (1,011 contre 0,999). Le prix est dans les deux dernières lignes : exiger qu'un film ait été vu par 10 des 30 voisins, c'est ne garder que des films très vus, 151 avis en médiane quand le film médian du catalogue en a 3. On l'assume pour ce TP, parce que le critère demandé est la qualité du top 10, et on y revient dans l'analyse critique.</w:t>
+        <w:t>Le système réglé passe devant le repère qui recommande les films les plus notés à tout le monde, et le test confirme que la variété n'a rien coûté : (30, 10) fait même un peu mieux que (50, 15) sur le top 10 (0,201 contre 0,191), pour une RMSE un peu moins bonne (1,011 contre 0,999). Le prix est dans les deux dernières lignes : exiger qu'un film ait été vu par 10 des 30 voisins, c'est ne garder que des films très vus, 151 avis en médiane quand le film médian du catalogue en a 3. On l'assume pour ce TP, et on y revient dans l'analyse critique.</w:t>
       </w:r>
     </w:p>
     <w:p>
@@ -2521,7 +2220,7 @@
     </w:p>
     <w:p>
       <w:r>
-        <w:t>Figure 2, le compromis entre qualité et variété. Un point par réglage. En abscisse, le nombre de films différents proposés dans l'ensemble des 671 listes de validation. En ordonnée, le NDCG@10. La couleur donne la popularité médiane des films proposés, du violet (films quasi inconnus) au jaune (uniquement des classiques). Pour comparer, le film médian du catalogue a 3 avis. Les trois grandeurs bougent ensemble : plus le seuil monte, plus les films proposés sont populaires, moins il y en a de différents, et le NDCG monte jusqu'à un plateau puis retombe. L'étoile rouge est le (30, 10) retenu : sur le plateau, c'est le point le plus à droite. (50, 15) et (100, 35) sont à sa gauche, aussi bons et moins variés. (25, 8), à sa droite, est un peu moins bon et encore plus varié.</w:t>
+        <w:t>Figure 2, le compromis entre qualité et variété. Un point par réglage. En abscisse, le nombre de films différents proposés dans l'ensemble des 671 listes de validation. En ordonnée, le NDCG@10. La couleur donne la popularité médiane des films proposés, du violet (films quasi inconnus) au jaune (uniquement des classiques). Plus le seuil monte, plus on va vers la gauche et vers le jaune. L'étoile rouge est le (30, 10) retenu : sur le plateau, c'est le point le plus à droite. (50, 15) et (100, 35) sont à sa gauche, aussi bons et moins variés. (25, 8), à sa droite, est un peu moins bon et encore plus varié.</w:t>
       </w:r>
     </w:p>
     <w:p>

</xml_diff>

<commit_message>
Rapport v2 : question 6 réécrite plus naturelle, renvois en avant retirés
</commit_message>
<xml_diff>
--- a/questionnaire/v2/rapport_v2.docx
+++ b/questionnaire/v2/rapport_v2.docx
@@ -640,17 +640,17 @@
     </w:p>
     <w:p>
       <w:r>
-        <w:t>Les deux hyperparamètres. k est le nombre de voisins dont on fait la moyenne. min_voisins est le nombre de voisins qui doivent avoir vu un film pour qu'on puisse le recommander. Ce deuxième réglage, on l'a ajouté nous-mêmes à l'algorithme du cours : sans lui, le top 10 était rempli de films vus par un seul voisin qui avait mis 5, et une note prédite de 5 sur un seul avis passait devant Pulp Fiction à 4,6 sur 21 avis. On est conscients de son effet de bord : plus il est haut, plus il ne laisse passer que des films très vus, donc il renforce le biais de popularité vu en cours. C'est pour ça qu'on a suivi, pour chaque réglage, la popularité et le nombre de films différents proposés en plus des métriques. Au départ on avait fixé k = 30 et min_voisins = 3 à l'œil. On note un réglage (k, min_voisins).</w:t>
-      </w:r>
-    </w:p>
-    <w:p>
-      <w:r>
-        <w:t>Méthode. Pour ne pas choisir les réglages sur le test (ce serait une fuite), on a fait une validation croisée dans le train : le train est découpé en 5 parts, chaque part sert une fois d'ensemble caché pendant que le modèle est entraîné sur les 4 autres, et on moyenne les 5 résultats. Critère principal : le NDCG@10, parce que c'est la liste montrée à l'utilisateur qui compte, avec la RMSE en contrôle. Grille : k dans {10, 20, 30, 50, 100} et min_voisins dans {3, 5, 10, 15}, plus 5 réglages sur le prolongement de la meilleure diagonale et 4 réglages à petit k pour vérifier où commence le plateau, chacun mesuré 5 fois.</w:t>
-      </w:r>
-    </w:p>
-    <w:p>
-      <w:r>
-        <w:t>Résultats. NDCG@10 moyen en validation, grille et prolongement :</w:t>
+        <w:t>Deux hyperparamètres. Le premier est k, le nombre de voisins qu'on moyenne. Le deuxième, min_voisins, on l'a ajouté nous-mêmes : c'est le nombre de voisins qui doivent avoir vu un film pour qu'on ait le droit de le recommander. Sans ce seuil, le top 10 était plein de films vus par un seul voisin qui avait mis 5, et un film noté 5 sur un seul avis passait devant Pulp Fiction à 4,6 sur 21 avis. On sait que ce seuil a un effet de bord : plus il est haut, plus il ne laisse passer que des films très vus, donc il renforce le biais de popularité dont parle le cours. Du coup on a suivi, pour chaque réglage, la popularité des films proposés et le nombre de films différents, en plus des métriques. Au départ on avait mis k = 30 et min_voisins = 3 un peu au doigt mouillé. Pour aller plus vite, on écrit un réglage (k, min_voisins).</w:t>
+      </w:r>
+    </w:p>
+    <w:p>
+      <w:r>
+        <w:t>Comment on a fait. Il ne faut pas choisir les réglages sur le test, sinon c'est une fuite. On a donc fait une validation croisée dans le train : on le découpe en 5 parts, chaque part sert une fois d'ensemble caché pendant que le modèle est entraîné sur les 4 autres, et on prend la moyenne des 5. Le critère principal est le NDCG@10, parce que c'est la liste montrée à l'utilisateur qui compte. On regarde aussi la RMSE, mais en contrôle. On a testé k dans {10, 20, 30, 50, 100} et min_voisins dans {3, 5, 10, 15}, plus 5 réglages qui prolongent la meilleure diagonale et 4 réglages à petit k pour voir où commence le plateau. Chaque réglage est mesuré 5 fois.</w:t>
+      </w:r>
+    </w:p>
+    <w:p>
+      <w:r>
+        <w:t>Résultats. NDCG@10 moyen en validation :</w:t>
       </w:r>
     </w:p>
     <w:tbl>
@@ -1237,13 +1237,13 @@
     <w:p/>
     <w:p>
       <w:r>
-        <w:t>Les deux zéros à k = 10 sont normaux : un film ne peut pas avoir été vu par 10 ou 15 voisins sur 10, les listes sont vides. Les quatre réglages ajoutés à petit k confirment la diagonale, sans faire mieux : (20, 7) 0,143, (25, 8) et (25, 10) 0,146.</w:t>
+        <w:t>Les deux zéros à k = 10 ne sont pas un bug : un film ne peut pas avoir été vu par 10 ou 15 voisins quand on n'en a que 10, les listes sont vides. Les quatre réglages à petit k confirment la diagonale sans faire mieux : (20, 7) donne 0,143, (25, 8) et (25, 10) donnent 0,146.</w:t>
       </w:r>
     </w:p>
     <w:p/>
     <w:p>
       <w:r>
-        <w:t>La RMSE ne dépend que de k, puisque le seuil ne touche pas à la note prédite, et elle baisse régulièrement quand k augmente :</w:t>
+        <w:t>La RMSE, elle, ne dépend que de k, puisque le seuil ne touche pas à la note prédite. Elle baisse tranquillement quand k augmente :</w:t>
       </w:r>
     </w:p>
     <w:tbl>
@@ -1433,17 +1433,12 @@
     <w:p/>
     <w:p>
       <w:r>
-        <w:t>Stabilité. Entre les 5 parts, l'écart-type du NDCG vaut entre 0,002 et 0,008 : deux réglages à moins de 0,01 l'un de l'autre ne sont pas départageables. Le tableau montre que les deux réglages vont ensemble : ce qui compte, c'est le rapport seuil / voisins, autour d'un tiers. Sur cette diagonale, (30, 10), (50, 15) et (100, 35) donnent tous 0,15, et le plateau commence vers k = 25. Stable. En dehors, c'est instable dans les deux sens : trop de seuil et les listes se vident (à k = 50, passer de 15 à 25 divise le NDCG par 1,6), pas assez de seuil et les listes se remplissent de films vus par un seul voisin ((100, 3) tombe à 0,008). Il faut donc régler les deux ensemble.</w:t>
-      </w:r>
-    </w:p>
-    <w:p>
-      <w:r>
-        <w:t>On a aussi essayé un seuil de similarité pour être voisin, en plus des k voisins ou à la place. En plus, ça ne change rien. À la place, le NDCG est divisé par deux, parce que les similarités sont trop différentes d'un utilisateur à l'autre : avec le même seuil, l'un a 0 voisin et l'autre plus de 500. On garde les k voisins.</w:t>
-      </w:r>
-    </w:p>
-    <w:p>
-      <w:r>
-        <w:t>Choix du système. Le meilleur NDCG moyen est (50, 15), 0,151 ± 0,004, mais quatre réglages sont à moins d'un écart-type de ce maximum, donc indépartageables : (30, 10), (50, 15), (50, 20) et (100, 35). On applique la règle « à un écart-type », la règle usuelle pour choisir un modèle en validation croisée : parmi les réglages indépartageables, on départage sur un second critère. La RMSE désignerait (100, 35), mais avec 126 films différents proposés seulement. La variété désigne (30, 10) : 289 films différents contre 219 pour (50, 15), et les films les moins populaires des quatre (129 avis en médiane contre 134). On prend la variété, parce que le cours et l'exercice 5 pointent le biais de popularité comme la faiblesse principale du filtrage collaboratif, et parce que la RMSE n'est qu'un contrôle : aucun réglage ne la fait passer sous la moyenne de l'utilisateur.</w:t>
+        <w:t>Stabilité. Entre les 5 parts, l'écart-type du NDCG est entre 0,002 et 0,008. Donc deux réglages à moins de 0,01 l'un de l'autre, on ne peut pas les départager. Ce qu'on voit dans le tableau, c'est que les deux réglages vont ensemble : ce qui compte, c'est le rapport entre le seuil et le nombre de voisins, à peu près un tiers. Sur cette diagonale, (30, 10), (50, 15) et (100, 35) donnent tous 0,15 et le plateau commence vers k = 25. Là c'est stable. Dès qu'on s'en écarte, ça décroche dans les deux sens : trop de seuil et les listes se vident (à k = 50, passer de 15 à 25 divise le NDCG par 1,6), pas assez de seuil et on retombe sur des films vus par un seul voisin ((100, 3) tombe à 0,008). Il faut donc régler les deux ensemble, pas l'un après l'autre.</w:t>
+      </w:r>
+    </w:p>
+    <w:p>
+      <w:r>
+        <w:t>Choix du système. Le meilleur NDCG moyen est (50, 15), à 0,151 avec un écart-type de 0,004. Mais quatre réglages sont à moins d'un écart-type de ce maximum, donc on ne peut pas les départager sur le critère principal : (30, 10), (50, 15), (50, 20) et (100, 35). Prendre juste le maximum, ce serait choisir sur du bruit. On a donc utilisé la règle « à un écart-type », qui est la règle habituelle pour choisir un modèle en validation croisée : parmi les réglages qu'on ne peut pas départager, on prend celui qui est le meilleur sur un second critère. Avec la RMSE comme second critère, ce serait (100, 35), mais il ne propose plus que 126 films différents. Avec la variété, c'est (30, 10) : 289 films différents contre 219 pour (50, 15), et les films les moins populaires des quatre (129 avis en médiane contre 134). On a pris la variété, parce que le biais de popularité est la faiblesse principale du filtrage collaboratif d'après le cours, et parce que la RMSE n'est chez nous qu'un contrôle : aucun réglage ne la fait passer sous la simple moyenne de l'utilisateur.</w:t>
       </w:r>
     </w:p>
     <w:tbl>
@@ -1750,7 +1745,7 @@
     <w:p/>
     <w:p>
       <w:r>
-        <w:t>Système retenu : (30, 10). Une limite à connaître : avec 30 voisins et un seuil de 10, 24 utilisateurs sur 671 reçoivent une liste plus courte que 10, ce qui les pénalise dans la précision@10 (qui divise toujours par 10). Ça n'empêche pas le réglage d'être devant sur le test.</w:t>
+        <w:t>Système retenu : (30, 10). Une limite à connaître : avec 30 voisins et un seuil de 10, 24 utilisateurs sur 671 ont une liste plus courte que 10, ce qui les pénalise dans la précision@10, qui divise toujours par 10. Ça ne l'empêche pas d'être devant sur le test.</w:t>
       </w:r>
     </w:p>
     <w:p>
@@ -2169,7 +2164,7 @@
     <w:p/>
     <w:p>
       <w:r>
-        <w:t>Le système réglé passe devant le repère qui recommande les films les plus notés à tout le monde, et le test confirme que la variété n'a rien coûté : (30, 10) fait même un peu mieux que (50, 15) sur le top 10 (0,201 contre 0,191), pour une RMSE un peu moins bonne (1,011 contre 0,999). Le prix est dans les deux dernières lignes : exiger qu'un film ait été vu par 10 des 30 voisins, c'est ne garder que des films très vus, 151 avis en médiane quand le film médian du catalogue en a 3. On l'assume pour ce TP, et on y revient dans l'analyse critique.</w:t>
+        <w:t>Le système réglé passe devant le repère qui donne les films les plus notés à tout le monde, et le test confirme que la variété n'a rien coûté : (30, 10) fait même un peu mieux que (50, 15) sur le top 10 (0,201 contre 0,191), avec une RMSE un peu moins bonne (1,011 contre 0,999). Le prix se voit dans les deux dernières lignes : en exigeant qu'un film ait été vu par 10 des 30 voisins, on ne garde que des films très vus, 151 avis en médiane alors que le film médian du catalogue en a 3. On l'assume pour ce TP.</w:t>
       </w:r>
     </w:p>
     <w:p>
@@ -2179,7 +2174,7 @@
     </w:p>
     <w:p>
       <w:r>
-        <w:t>Figure 1, les courbes de la validation croisée. À gauche, le NDCG@10 en fonction de k, une courbe par valeur de min_voisins, les barres d'erreur donnant l'écart entre les 5 parts. Chaque courbe monte puis redescend, et son sommet se déplace vers la droite quand le seuil augmente : c'est le rapport seuil / voisins qui compte. Les barres sont petites : résultat stable. À droite, la RMSE en fonction de k, une seule courbe puisque le seuil n'a pas d'effet dessus.</w:t>
+        <w:t>Figure 1 : les courbes de la validation croisée. À gauche le NDCG@10 en fonction de k, une courbe par valeur de min_voisins, avec les barres d'erreur qui donnent l'écart entre les 5 parts. Chaque courbe monte puis redescend, et le sommet se décale vers la droite quand le seuil augmente : c'est bien le rapport seuil / voisins qui compte. Les barres sont petites, le résultat est stable. À droite la RMSE en fonction de k, une seule courbe puisque le seuil n'a pas d'effet dessus.</w:t>
       </w:r>
     </w:p>
     <w:p>
@@ -2220,7 +2215,7 @@
     </w:p>
     <w:p>
       <w:r>
-        <w:t>Figure 2, le compromis entre qualité et variété. Un point par réglage. En abscisse, le nombre de films différents proposés dans l'ensemble des 671 listes de validation. En ordonnée, le NDCG@10. La couleur donne la popularité médiane des films proposés, du violet (films quasi inconnus) au jaune (uniquement des classiques). Plus le seuil monte, plus on va vers la gauche et vers le jaune. L'étoile rouge est le (30, 10) retenu : sur le plateau, c'est le point le plus à droite. (50, 15) et (100, 35) sont à sa gauche, aussi bons et moins variés. (25, 8), à sa droite, est un peu moins bon et encore plus varié.</w:t>
+        <w:t>Figure 2 : le compromis entre qualité et variété, un point par réglage. En abscisse le nombre de films différents proposés sur les 671 listes de validation, en ordonnée le NDCG@10, et la couleur donne la popularité médiane des films proposés, du violet (films quasi inconnus) au jaune (que des classiques). Plus le seuil monte, plus on part vers la gauche et vers le jaune. L'étoile rouge est le (30, 10) retenu : sur le plateau, c'est le point le plus à droite. (50, 15) et (100, 35) sont à sa gauche, aussi bons mais moins variés. (25, 8) à sa droite est encore plus varié mais un peu moins bon.</w:t>
       </w:r>
     </w:p>
     <w:p>
@@ -2761,7 +2756,7 @@
     </w:p>
     <w:p>
       <w:r>
-        <w:t>Décision. Notre critère est la qualité du top 10, et il donne le système sans centrage, en validation comme sur le test. On le garde pour recommander, et c'est lui qu'on analyse dans la suite. Si l'application était d'afficher une note prédite plutôt qu'une liste, ce serait le centré. Ce qu'on en retient : une amélioration peut aider une métrique et pas l'autre, il faut savoir laquelle compte pour l'usage.</w:t>
+        <w:t>Décision. Notre critère est la qualité du top 10, et il donne le système sans centrage, en validation comme sur le test. On le garde pour recommander. Si l'application était d'afficher une note prédite plutôt qu'une liste, ce serait le centré. Ce qu'on en retient : une amélioration peut aider une métrique et pas l'autre, il faut savoir laquelle compte pour l'usage.</w:t>
       </w:r>
     </w:p>
     <w:p>
@@ -3569,7 +3564,7 @@
     </w:p>
     <w:p>
       <w:r>
-        <w:t>Le système reste personnalisé malgré ça : sept dixièmes de chaque liste sont propres à l'utilisateur, trois dixièmes viennent du top des ventes (question sur la personnalisation).</w:t>
+        <w:t>Le système reste personnalisé malgré ça : sept dixièmes de chaque liste sont propres à l'utilisateur, trois dixièmes viennent du top des ventes.</w:t>
       </w:r>
     </w:p>
     <w:p>
@@ -3584,7 +3579,7 @@
     </w:p>
     <w:p>
       <w:r>
-        <w:t>Pour la plateforme, 96 % du catalogue n'est jamais proposé (question sur la diversité globale). Ces films ne seront jamais valorisés.</w:t>
+        <w:t>Pour la plateforme, 96 % du catalogue n'est jamais proposé. Ces films ne seront jamais valorisés.</w:t>
       </w:r>
     </w:p>
     <w:p>

</xml_diff>

<commit_message>
Script unique tp_reco.py généré depuis le notebook, dossier rendu/ prêt à zipper
</commit_message>
<xml_diff>
--- a/questionnaire/v2/rapport_v2.docx
+++ b/questionnaire/v2/rapport_v2.docx
@@ -12,7 +12,7 @@
     </w:p>
     <w:p>
       <w:pPr>
-        <w:pStyle w:val="Heading2"/>
+        <w:pStyle w:val="Titre2"/>
       </w:pPr>
       <w:r>
         <w:t>Objectifs du T</w:t>
@@ -61,7 +61,7 @@
       <w:hyperlink r:id="rId11">
         <w:r>
           <w:rPr>
-            <w:rStyle w:val="Hyperlink"/>
+            <w:rStyle w:val="Lienhypertexte"/>
             <w:lang w:val="en-US"/>
           </w:rPr>
           <w:t>https://www.kaggle.com/datasets/rounakbanik/the-movies-dataset</w:t>
@@ -91,7 +91,7 @@
       <w:hyperlink r:id="rId12">
         <w:r>
           <w:rPr>
-            <w:rStyle w:val="Hyperlink"/>
+            <w:rStyle w:val="Lienhypertexte"/>
             <w:lang w:val="pt-BR"/>
           </w:rPr>
           <w:t>https://github.com/albanrouault/ESIEA_5A_INF5063_syst-de-reco</w:t>
@@ -134,9 +134,10 @@
     </w:p>
     <w:p>
       <w:pPr>
-        <w:pStyle w:val="Heading2"/>
-      </w:pPr>
-      <w:r>
+        <w:pStyle w:val="Titre2"/>
+      </w:pPr>
+      <w:r>
+        <w:lastRenderedPageBreak/>
         <w:t>Exploration initiale</w:t>
       </w:r>
     </w:p>
@@ -435,6 +436,7 @@
         <w:pStyle w:val="Niveau3"/>
       </w:pPr>
       <w:r>
+        <w:lastRenderedPageBreak/>
         <w:t>Nous aurons besoin d’une séparation entraînement/test pour tester nos modèles. Que</w:t>
       </w:r>
       <w:r>
@@ -556,6 +558,7 @@
     </w:p>
     <w:p>
       <w:r>
+        <w:lastRenderedPageBreak/>
         <w:t>Les autres solutions possibles et pourquoi on ne les a pas gardées :</w:t>
       </w:r>
     </w:p>
@@ -591,7 +594,6 @@
       <w:r>
         <w:t>apprendre les cases vides avec un modèle (factorisation matricielle) : c'est l'approche « model-based » du cours, a priori hors du cadre user-based du TP</w:t>
       </w:r>
-      <w:r/>
     </w:p>
     <w:p>
       <w:pPr>
@@ -624,9 +626,10 @@
     </w:p>
     <w:p>
       <w:pPr>
-        <w:pStyle w:val="Heading2"/>
-      </w:pPr>
-      <w:r>
+        <w:pStyle w:val="Titre2"/>
+      </w:pPr>
+      <w:r>
+        <w:lastRenderedPageBreak/>
         <w:t>Le meilleur filtrage collaboratif</w:t>
       </w:r>
     </w:p>
@@ -640,13 +643,17 @@
     </w:p>
     <w:p>
       <w:r>
-        <w:t>Deux hyperparamètres. Le premier est k, le nombre de voisins qu'on moyenne. Le deuxième, min_voisins, on l'a ajouté nous-mêmes : c'est le nombre de voisins qui doivent avoir vu un film pour qu'on ait le droit de le recommander. Sans ce seuil, le top 10 était plein de films vus par un seul voisin qui avait mis 5, et un film noté 5 sur un seul avis passait devant Pulp Fiction à 4,6 sur 21 avis. On sait que ce seuil a un effet de bord : plus il est haut, plus il ne laisse passer que des films très vus, donc il renforce le biais de popularité dont parle le cours. Du coup on a suivi, pour chaque réglage, la popularité des films proposés et le nombre de films différents, en plus des métriques. Au départ on avait mis k = 30 et min_voisins = 3 un peu au doigt mouillé. Pour aller plus vite, on écrit un réglage (k, min_voisins).</w:t>
-      </w:r>
-    </w:p>
-    <w:p>
-      <w:r>
-        <w:t>Comment on a fait. Il ne faut pas choisir les réglages sur le test, sinon c'est une fuite. On a donc fait une validation croisée dans le train : on le découpe en 5 parts, chaque part sert une fois d'ensemble caché pendant que le modèle est entraîné sur les 4 autres, et on prend la moyenne des 5. Le critère principal est le NDCG@10, parce que c'est la liste montrée à l'utilisateur qui compte. On regarde aussi la RMSE, mais en contrôle. On a testé k dans {10, 20, 30, 50, 100} et min_voisins dans {3, 5, 10, 15}, plus 5 réglages qui prolongent la meilleure diagonale et 4 réglages à petit k pour voir où commence le plateau. Chaque réglage est mesuré 5 fois.</w:t>
-      </w:r>
+        <w:t>Deux hyperparamètres. Le premier est k, le nombre de voisins qu'on moyenne. Le deuxième, min_voisins, on l'a ajouté nous-mêmes : c'est le nombre de voisins qui doivent avoir vu un film pour qu'on ait le droit de le recommander. Sans ce seuil, le top 10 était plein de films vus par un seul voisin qui avait mis 5, et un film noté 5 sur un seul avis passait devant Pulp Fiction à 4,6 sur 21 avis. On sait que ce seuil a un effet de bord : plus il est haut, plus il ne laisse passer que des films très vus, donc il</w:t>
+      </w:r>
+      <w:r>
+        <w:t xml:space="preserve"> renforce le biais de popularité dont parle le cours. Du coup on a suivi, pour chaque réglage, la popularité des films proposés et le nombre de films différents, en plus des métriques. Au départ on avait mis k = 30 et min_voisins = 3 un peu au doigt mouillé. Pour aller plus vite, on écrit un réglage (k, min_voisins).</w:t>
+      </w:r>
+    </w:p>
+    <w:p>
+      <w:r>
+        <w:t>Comment on a fait. Il ne faut pas choisir les réglages sur le test, sinon c'est une fuite. On a donc fait une validation croisée dans le train : on le découpe en 5 parts, chaque part sert une fois d'ensemble caché pendant que le modèle est entraîné sur les 4 autres, et on prend la moyenne des 5. Le critère principal est le NDCG@10, parce que c'est la liste montrée à l'utilisateur qui compte. On regarde aussi la RMSE, mais en contrôle. On a d'abord testé k dans {10, 20, 30, 50, 100} et min_voisins dans {3, 5, 10, 15}, soit 20 réglages. Dans ce tableau, les meilleurs scores tombaient sur une diagonale : le seuil qui monte avec k. On a donc rajouté 5 réglages dans cette direction, (50, 20), (50, 25), (100, 20), (100, 25) et (100, 35). Et pour voir à partir de quel k le score arrête de progresser, on a aussi essayé 4 réglages entre k = 20 et k = 30 : (20, 7), (20, 8), (25, 8) et (25, 10). Chaque réglage passe par les 5 parts, son score est donc la moyenne de 5 mesures.</w:t>
+      </w:r>
+      <w:r/>
     </w:p>
     <w:p>
       <w:r>
@@ -655,37 +662,31 @@
     </w:p>
     <w:tbl>
       <w:tblPr>
-        <w:tblStyle w:val="TableGrid"/>
-        <w:tblW w:type="auto" w:w="0"/>
-        <w:tblLook w:firstColumn="1" w:firstRow="1" w:lastColumn="0" w:lastRow="0" w:noHBand="0" w:noVBand="1" w:val="04A0"/>
+        <w:tblStyle w:val="Grilledutableau"/>
+        <w:tblW w:w="0" w:type="auto"/>
+        <w:tblLook w:val="04A0" w:firstRow="1" w:lastRow="0" w:firstColumn="1" w:lastColumn="0" w:noHBand="0" w:noVBand="1"/>
       </w:tblPr>
       <w:tblGrid>
-        <w:gridCol w:w="1008"/>
-        <w:gridCol w:w="1008"/>
-        <w:gridCol w:w="1008"/>
-        <w:gridCol w:w="1008"/>
-        <w:gridCol w:w="1008"/>
-        <w:gridCol w:w="1008"/>
-        <w:gridCol w:w="1008"/>
-        <w:gridCol w:w="1008"/>
-        <w:gridCol w:w="1008"/>
+        <w:gridCol w:w="943"/>
+        <w:gridCol w:w="1388"/>
+        <w:gridCol w:w="968"/>
+        <w:gridCol w:w="968"/>
+        <w:gridCol w:w="968"/>
+        <w:gridCol w:w="968"/>
+        <w:gridCol w:w="968"/>
+        <w:gridCol w:w="968"/>
+        <w:gridCol w:w="923"/>
       </w:tblGrid>
       <w:tr>
         <w:tc>
           <w:tcPr>
-            <w:tcW w:type="dxa" w:w="1008"/>
-          </w:tcPr>
-          <w:p>
-            <w:r>
-              <w:rPr>
-                <w:b/>
-              </w:rPr>
-            </w:r>
-          </w:p>
-        </w:tc>
-        <w:tc>
-          <w:tcPr>
-            <w:tcW w:type="dxa" w:w="1008"/>
+            <w:tcW w:w="1008" w:type="dxa"/>
+          </w:tcPr>
+          <w:p/>
+        </w:tc>
+        <w:tc>
+          <w:tcPr>
+            <w:tcW w:w="1008" w:type="dxa"/>
           </w:tcPr>
           <w:p>
             <w:r>
@@ -698,7 +699,7 @@
         </w:tc>
         <w:tc>
           <w:tcPr>
-            <w:tcW w:type="dxa" w:w="1008"/>
+            <w:tcW w:w="1008" w:type="dxa"/>
           </w:tcPr>
           <w:p>
             <w:r>
@@ -711,7 +712,7 @@
         </w:tc>
         <w:tc>
           <w:tcPr>
-            <w:tcW w:type="dxa" w:w="1008"/>
+            <w:tcW w:w="1008" w:type="dxa"/>
           </w:tcPr>
           <w:p>
             <w:r>
@@ -724,7 +725,7 @@
         </w:tc>
         <w:tc>
           <w:tcPr>
-            <w:tcW w:type="dxa" w:w="1008"/>
+            <w:tcW w:w="1008" w:type="dxa"/>
           </w:tcPr>
           <w:p>
             <w:r>
@@ -737,7 +738,7 @@
         </w:tc>
         <w:tc>
           <w:tcPr>
-            <w:tcW w:type="dxa" w:w="1008"/>
+            <w:tcW w:w="1008" w:type="dxa"/>
           </w:tcPr>
           <w:p>
             <w:r>
@@ -750,7 +751,7 @@
         </w:tc>
         <w:tc>
           <w:tcPr>
-            <w:tcW w:type="dxa" w:w="1008"/>
+            <w:tcW w:w="1008" w:type="dxa"/>
           </w:tcPr>
           <w:p>
             <w:r>
@@ -763,7 +764,7 @@
         </w:tc>
         <w:tc>
           <w:tcPr>
-            <w:tcW w:type="dxa" w:w="1008"/>
+            <w:tcW w:w="1008" w:type="dxa"/>
           </w:tcPr>
           <w:p>
             <w:r>
@@ -776,7 +777,7 @@
         </w:tc>
         <w:tc>
           <w:tcPr>
-            <w:tcW w:type="dxa" w:w="1008"/>
+            <w:tcW w:w="1008" w:type="dxa"/>
           </w:tcPr>
           <w:p>
             <w:r>
@@ -791,7 +792,7 @@
       <w:tr>
         <w:tc>
           <w:tcPr>
-            <w:tcW w:type="dxa" w:w="1008"/>
+            <w:tcW w:w="1008" w:type="dxa"/>
           </w:tcPr>
           <w:p>
             <w:r>
@@ -804,7 +805,7 @@
         </w:tc>
         <w:tc>
           <w:tcPr>
-            <w:tcW w:type="dxa" w:w="1008"/>
+            <w:tcW w:w="1008" w:type="dxa"/>
           </w:tcPr>
           <w:p>
             <w:r>
@@ -814,7 +815,7 @@
         </w:tc>
         <w:tc>
           <w:tcPr>
-            <w:tcW w:type="dxa" w:w="1008"/>
+            <w:tcW w:w="1008" w:type="dxa"/>
           </w:tcPr>
           <w:p>
             <w:r>
@@ -824,7 +825,7 @@
         </w:tc>
         <w:tc>
           <w:tcPr>
-            <w:tcW w:type="dxa" w:w="1008"/>
+            <w:tcW w:w="1008" w:type="dxa"/>
           </w:tcPr>
           <w:p>
             <w:r>
@@ -834,7 +835,7 @@
         </w:tc>
         <w:tc>
           <w:tcPr>
-            <w:tcW w:type="dxa" w:w="1008"/>
+            <w:tcW w:w="1008" w:type="dxa"/>
           </w:tcPr>
           <w:p>
             <w:r>
@@ -844,41 +845,33 @@
         </w:tc>
         <w:tc>
           <w:tcPr>
-            <w:tcW w:type="dxa" w:w="1008"/>
-          </w:tcPr>
-          <w:p>
-            <w:r/>
-          </w:p>
-        </w:tc>
-        <w:tc>
-          <w:tcPr>
-            <w:tcW w:type="dxa" w:w="1008"/>
-          </w:tcPr>
-          <w:p>
-            <w:r/>
-          </w:p>
-        </w:tc>
-        <w:tc>
-          <w:tcPr>
-            <w:tcW w:type="dxa" w:w="1008"/>
-          </w:tcPr>
-          <w:p>
-            <w:r/>
-          </w:p>
-        </w:tc>
-        <w:tc>
-          <w:tcPr>
-            <w:tcW w:type="dxa" w:w="1008"/>
-          </w:tcPr>
-          <w:p>
-            <w:r/>
-          </w:p>
+            <w:tcW w:w="1008" w:type="dxa"/>
+          </w:tcPr>
+          <w:p/>
+        </w:tc>
+        <w:tc>
+          <w:tcPr>
+            <w:tcW w:w="1008" w:type="dxa"/>
+          </w:tcPr>
+          <w:p/>
+        </w:tc>
+        <w:tc>
+          <w:tcPr>
+            <w:tcW w:w="1008" w:type="dxa"/>
+          </w:tcPr>
+          <w:p/>
+        </w:tc>
+        <w:tc>
+          <w:tcPr>
+            <w:tcW w:w="1008" w:type="dxa"/>
+          </w:tcPr>
+          <w:p/>
         </w:tc>
       </w:tr>
       <w:tr>
         <w:tc>
           <w:tcPr>
-            <w:tcW w:type="dxa" w:w="1008"/>
+            <w:tcW w:w="1008" w:type="dxa"/>
           </w:tcPr>
           <w:p>
             <w:r>
@@ -891,7 +884,7 @@
         </w:tc>
         <w:tc>
           <w:tcPr>
-            <w:tcW w:type="dxa" w:w="1008"/>
+            <w:tcW w:w="1008" w:type="dxa"/>
           </w:tcPr>
           <w:p>
             <w:r>
@@ -901,7 +894,7 @@
         </w:tc>
         <w:tc>
           <w:tcPr>
-            <w:tcW w:type="dxa" w:w="1008"/>
+            <w:tcW w:w="1008" w:type="dxa"/>
           </w:tcPr>
           <w:p>
             <w:r>
@@ -911,7 +904,7 @@
         </w:tc>
         <w:tc>
           <w:tcPr>
-            <w:tcW w:type="dxa" w:w="1008"/>
+            <w:tcW w:w="1008" w:type="dxa"/>
           </w:tcPr>
           <w:p>
             <w:r>
@@ -921,7 +914,7 @@
         </w:tc>
         <w:tc>
           <w:tcPr>
-            <w:tcW w:type="dxa" w:w="1008"/>
+            <w:tcW w:w="1008" w:type="dxa"/>
           </w:tcPr>
           <w:p>
             <w:r>
@@ -931,41 +924,33 @@
         </w:tc>
         <w:tc>
           <w:tcPr>
-            <w:tcW w:type="dxa" w:w="1008"/>
-          </w:tcPr>
-          <w:p>
-            <w:r/>
-          </w:p>
-        </w:tc>
-        <w:tc>
-          <w:tcPr>
-            <w:tcW w:type="dxa" w:w="1008"/>
-          </w:tcPr>
-          <w:p>
-            <w:r/>
-          </w:p>
-        </w:tc>
-        <w:tc>
-          <w:tcPr>
-            <w:tcW w:type="dxa" w:w="1008"/>
-          </w:tcPr>
-          <w:p>
-            <w:r/>
-          </w:p>
-        </w:tc>
-        <w:tc>
-          <w:tcPr>
-            <w:tcW w:type="dxa" w:w="1008"/>
-          </w:tcPr>
-          <w:p>
-            <w:r/>
-          </w:p>
+            <w:tcW w:w="1008" w:type="dxa"/>
+          </w:tcPr>
+          <w:p/>
+        </w:tc>
+        <w:tc>
+          <w:tcPr>
+            <w:tcW w:w="1008" w:type="dxa"/>
+          </w:tcPr>
+          <w:p/>
+        </w:tc>
+        <w:tc>
+          <w:tcPr>
+            <w:tcW w:w="1008" w:type="dxa"/>
+          </w:tcPr>
+          <w:p/>
+        </w:tc>
+        <w:tc>
+          <w:tcPr>
+            <w:tcW w:w="1008" w:type="dxa"/>
+          </w:tcPr>
+          <w:p/>
         </w:tc>
       </w:tr>
       <w:tr>
         <w:tc>
           <w:tcPr>
-            <w:tcW w:type="dxa" w:w="1008"/>
+            <w:tcW w:w="1008" w:type="dxa"/>
           </w:tcPr>
           <w:p>
             <w:r>
@@ -978,7 +963,7 @@
         </w:tc>
         <w:tc>
           <w:tcPr>
-            <w:tcW w:type="dxa" w:w="1008"/>
+            <w:tcW w:w="1008" w:type="dxa"/>
           </w:tcPr>
           <w:p>
             <w:r>
@@ -988,7 +973,7 @@
         </w:tc>
         <w:tc>
           <w:tcPr>
-            <w:tcW w:type="dxa" w:w="1008"/>
+            <w:tcW w:w="1008" w:type="dxa"/>
           </w:tcPr>
           <w:p>
             <w:r>
@@ -998,7 +983,7 @@
         </w:tc>
         <w:tc>
           <w:tcPr>
-            <w:tcW w:type="dxa" w:w="1008"/>
+            <w:tcW w:w="1008" w:type="dxa"/>
           </w:tcPr>
           <w:p>
             <w:r>
@@ -1008,7 +993,7 @@
         </w:tc>
         <w:tc>
           <w:tcPr>
-            <w:tcW w:type="dxa" w:w="1008"/>
+            <w:tcW w:w="1008" w:type="dxa"/>
           </w:tcPr>
           <w:p>
             <w:r>
@@ -1018,41 +1003,33 @@
         </w:tc>
         <w:tc>
           <w:tcPr>
-            <w:tcW w:type="dxa" w:w="1008"/>
-          </w:tcPr>
-          <w:p>
-            <w:r/>
-          </w:p>
-        </w:tc>
-        <w:tc>
-          <w:tcPr>
-            <w:tcW w:type="dxa" w:w="1008"/>
-          </w:tcPr>
-          <w:p>
-            <w:r/>
-          </w:p>
-        </w:tc>
-        <w:tc>
-          <w:tcPr>
-            <w:tcW w:type="dxa" w:w="1008"/>
-          </w:tcPr>
-          <w:p>
-            <w:r/>
-          </w:p>
-        </w:tc>
-        <w:tc>
-          <w:tcPr>
-            <w:tcW w:type="dxa" w:w="1008"/>
-          </w:tcPr>
-          <w:p>
-            <w:r/>
-          </w:p>
+            <w:tcW w:w="1008" w:type="dxa"/>
+          </w:tcPr>
+          <w:p/>
+        </w:tc>
+        <w:tc>
+          <w:tcPr>
+            <w:tcW w:w="1008" w:type="dxa"/>
+          </w:tcPr>
+          <w:p/>
+        </w:tc>
+        <w:tc>
+          <w:tcPr>
+            <w:tcW w:w="1008" w:type="dxa"/>
+          </w:tcPr>
+          <w:p/>
+        </w:tc>
+        <w:tc>
+          <w:tcPr>
+            <w:tcW w:w="1008" w:type="dxa"/>
+          </w:tcPr>
+          <w:p/>
         </w:tc>
       </w:tr>
       <w:tr>
         <w:tc>
           <w:tcPr>
-            <w:tcW w:type="dxa" w:w="1008"/>
+            <w:tcW w:w="1008" w:type="dxa"/>
           </w:tcPr>
           <w:p>
             <w:r>
@@ -1065,7 +1042,7 @@
         </w:tc>
         <w:tc>
           <w:tcPr>
-            <w:tcW w:type="dxa" w:w="1008"/>
+            <w:tcW w:w="1008" w:type="dxa"/>
           </w:tcPr>
           <w:p>
             <w:r>
@@ -1075,7 +1052,7 @@
         </w:tc>
         <w:tc>
           <w:tcPr>
-            <w:tcW w:type="dxa" w:w="1008"/>
+            <w:tcW w:w="1008" w:type="dxa"/>
           </w:tcPr>
           <w:p>
             <w:r>
@@ -1085,7 +1062,7 @@
         </w:tc>
         <w:tc>
           <w:tcPr>
-            <w:tcW w:type="dxa" w:w="1008"/>
+            <w:tcW w:w="1008" w:type="dxa"/>
           </w:tcPr>
           <w:p>
             <w:r>
@@ -1095,7 +1072,7 @@
         </w:tc>
         <w:tc>
           <w:tcPr>
-            <w:tcW w:type="dxa" w:w="1008"/>
+            <w:tcW w:w="1008" w:type="dxa"/>
           </w:tcPr>
           <w:p>
             <w:r>
@@ -1105,7 +1082,7 @@
         </w:tc>
         <w:tc>
           <w:tcPr>
-            <w:tcW w:type="dxa" w:w="1008"/>
+            <w:tcW w:w="1008" w:type="dxa"/>
           </w:tcPr>
           <w:p>
             <w:r>
@@ -1115,7 +1092,7 @@
         </w:tc>
         <w:tc>
           <w:tcPr>
-            <w:tcW w:type="dxa" w:w="1008"/>
+            <w:tcW w:w="1008" w:type="dxa"/>
           </w:tcPr>
           <w:p>
             <w:r>
@@ -1125,25 +1102,21 @@
         </w:tc>
         <w:tc>
           <w:tcPr>
-            <w:tcW w:type="dxa" w:w="1008"/>
-          </w:tcPr>
-          <w:p>
-            <w:r/>
-          </w:p>
-        </w:tc>
-        <w:tc>
-          <w:tcPr>
-            <w:tcW w:type="dxa" w:w="1008"/>
-          </w:tcPr>
-          <w:p>
-            <w:r/>
-          </w:p>
+            <w:tcW w:w="1008" w:type="dxa"/>
+          </w:tcPr>
+          <w:p/>
+        </w:tc>
+        <w:tc>
+          <w:tcPr>
+            <w:tcW w:w="1008" w:type="dxa"/>
+          </w:tcPr>
+          <w:p/>
         </w:tc>
       </w:tr>
       <w:tr>
         <w:tc>
           <w:tcPr>
-            <w:tcW w:type="dxa" w:w="1008"/>
+            <w:tcW w:w="1008" w:type="dxa"/>
           </w:tcPr>
           <w:p>
             <w:r>
@@ -1156,7 +1129,7 @@
         </w:tc>
         <w:tc>
           <w:tcPr>
-            <w:tcW w:type="dxa" w:w="1008"/>
+            <w:tcW w:w="1008" w:type="dxa"/>
           </w:tcPr>
           <w:p>
             <w:r>
@@ -1166,7 +1139,7 @@
         </w:tc>
         <w:tc>
           <w:tcPr>
-            <w:tcW w:type="dxa" w:w="1008"/>
+            <w:tcW w:w="1008" w:type="dxa"/>
           </w:tcPr>
           <w:p>
             <w:r>
@@ -1176,7 +1149,7 @@
         </w:tc>
         <w:tc>
           <w:tcPr>
-            <w:tcW w:type="dxa" w:w="1008"/>
+            <w:tcW w:w="1008" w:type="dxa"/>
           </w:tcPr>
           <w:p>
             <w:r>
@@ -1186,7 +1159,7 @@
         </w:tc>
         <w:tc>
           <w:tcPr>
-            <w:tcW w:type="dxa" w:w="1008"/>
+            <w:tcW w:w="1008" w:type="dxa"/>
           </w:tcPr>
           <w:p>
             <w:r>
@@ -1196,7 +1169,7 @@
         </w:tc>
         <w:tc>
           <w:tcPr>
-            <w:tcW w:type="dxa" w:w="1008"/>
+            <w:tcW w:w="1008" w:type="dxa"/>
           </w:tcPr>
           <w:p>
             <w:r>
@@ -1206,7 +1179,7 @@
         </w:tc>
         <w:tc>
           <w:tcPr>
-            <w:tcW w:type="dxa" w:w="1008"/>
+            <w:tcW w:w="1008" w:type="dxa"/>
           </w:tcPr>
           <w:p>
             <w:r>
@@ -1216,7 +1189,7 @@
         </w:tc>
         <w:tc>
           <w:tcPr>
-            <w:tcW w:type="dxa" w:w="1008"/>
+            <w:tcW w:w="1008" w:type="dxa"/>
           </w:tcPr>
           <w:p>
             <w:r>
@@ -1226,18 +1199,16 @@
         </w:tc>
         <w:tc>
           <w:tcPr>
-            <w:tcW w:type="dxa" w:w="1008"/>
-          </w:tcPr>
-          <w:p>
-            <w:r/>
-          </w:p>
+            <w:tcW w:w="1008" w:type="dxa"/>
+          </w:tcPr>
+          <w:p/>
         </w:tc>
       </w:tr>
     </w:tbl>
     <w:p/>
     <w:p>
       <w:r>
-        <w:t>Les deux zéros à k = 10 ne sont pas un bug : un film ne peut pas avoir été vu par 10 ou 15 voisins quand on n'en a que 10, les listes sont vides. Les quatre réglages à petit k confirment la diagonale sans faire mieux : (20, 7) donne 0,143, (25, 8) et (25, 10) donnent 0,146.</w:t>
+        <w:t>Les deux zéros à k = 10 ne sont pas un bug : un film ne peut pas avoir été vu par 10 ou 15 voisins quand on n'en a que 10, les listes sont vides. Les quatre réglages ajoutés entre k = 20 et k = 30 restent dans la même logique sans faire mieux : (20, 7) donne 0,143, (25, 8) et (25, 10) donnent 0,146.</w:t>
       </w:r>
     </w:p>
     <w:p/>
@@ -1248,23 +1219,23 @@
     </w:p>
     <w:tbl>
       <w:tblPr>
-        <w:tblStyle w:val="TableGrid"/>
-        <w:tblW w:type="auto" w:w="0"/>
-        <w:tblLook w:firstColumn="1" w:firstRow="1" w:lastColumn="0" w:lastRow="0" w:noHBand="0" w:noVBand="1" w:val="04A0"/>
+        <w:tblStyle w:val="Grilledutableau"/>
+        <w:tblW w:w="0" w:type="auto"/>
+        <w:tblLook w:val="04A0" w:firstRow="1" w:lastRow="0" w:firstColumn="1" w:lastColumn="0" w:noHBand="0" w:noVBand="1"/>
       </w:tblPr>
       <w:tblGrid>
-        <w:gridCol w:w="1296"/>
-        <w:gridCol w:w="1296"/>
-        <w:gridCol w:w="1296"/>
-        <w:gridCol w:w="1296"/>
-        <w:gridCol w:w="1296"/>
-        <w:gridCol w:w="1296"/>
-        <w:gridCol w:w="1296"/>
+        <w:gridCol w:w="1294"/>
+        <w:gridCol w:w="1294"/>
+        <w:gridCol w:w="1294"/>
+        <w:gridCol w:w="1295"/>
+        <w:gridCol w:w="1295"/>
+        <w:gridCol w:w="1295"/>
+        <w:gridCol w:w="1295"/>
       </w:tblGrid>
       <w:tr>
         <w:tc>
           <w:tcPr>
-            <w:tcW w:type="dxa" w:w="1296"/>
+            <w:tcW w:w="1296" w:type="dxa"/>
           </w:tcPr>
           <w:p>
             <w:r>
@@ -1277,7 +1248,7 @@
         </w:tc>
         <w:tc>
           <w:tcPr>
-            <w:tcW w:type="dxa" w:w="1296"/>
+            <w:tcW w:w="1296" w:type="dxa"/>
           </w:tcPr>
           <w:p>
             <w:r>
@@ -1290,7 +1261,7 @@
         </w:tc>
         <w:tc>
           <w:tcPr>
-            <w:tcW w:type="dxa" w:w="1296"/>
+            <w:tcW w:w="1296" w:type="dxa"/>
           </w:tcPr>
           <w:p>
             <w:r>
@@ -1303,7 +1274,7 @@
         </w:tc>
         <w:tc>
           <w:tcPr>
-            <w:tcW w:type="dxa" w:w="1296"/>
+            <w:tcW w:w="1296" w:type="dxa"/>
           </w:tcPr>
           <w:p>
             <w:r>
@@ -1316,7 +1287,7 @@
         </w:tc>
         <w:tc>
           <w:tcPr>
-            <w:tcW w:type="dxa" w:w="1296"/>
+            <w:tcW w:w="1296" w:type="dxa"/>
           </w:tcPr>
           <w:p>
             <w:r>
@@ -1329,7 +1300,7 @@
         </w:tc>
         <w:tc>
           <w:tcPr>
-            <w:tcW w:type="dxa" w:w="1296"/>
+            <w:tcW w:w="1296" w:type="dxa"/>
           </w:tcPr>
           <w:p>
             <w:r>
@@ -1342,7 +1313,7 @@
         </w:tc>
         <w:tc>
           <w:tcPr>
-            <w:tcW w:type="dxa" w:w="1296"/>
+            <w:tcW w:w="1296" w:type="dxa"/>
           </w:tcPr>
           <w:p>
             <w:r>
@@ -1357,7 +1328,7 @@
       <w:tr>
         <w:tc>
           <w:tcPr>
-            <w:tcW w:type="dxa" w:w="1296"/>
+            <w:tcW w:w="1296" w:type="dxa"/>
           </w:tcPr>
           <w:p>
             <w:r>
@@ -1370,7 +1341,7 @@
         </w:tc>
         <w:tc>
           <w:tcPr>
-            <w:tcW w:type="dxa" w:w="1296"/>
+            <w:tcW w:w="1296" w:type="dxa"/>
           </w:tcPr>
           <w:p>
             <w:r>
@@ -1380,7 +1351,7 @@
         </w:tc>
         <w:tc>
           <w:tcPr>
-            <w:tcW w:type="dxa" w:w="1296"/>
+            <w:tcW w:w="1296" w:type="dxa"/>
           </w:tcPr>
           <w:p>
             <w:r>
@@ -1390,7 +1361,7 @@
         </w:tc>
         <w:tc>
           <w:tcPr>
-            <w:tcW w:type="dxa" w:w="1296"/>
+            <w:tcW w:w="1296" w:type="dxa"/>
           </w:tcPr>
           <w:p>
             <w:r>
@@ -1400,7 +1371,7 @@
         </w:tc>
         <w:tc>
           <w:tcPr>
-            <w:tcW w:type="dxa" w:w="1296"/>
+            <w:tcW w:w="1296" w:type="dxa"/>
           </w:tcPr>
           <w:p>
             <w:r>
@@ -1410,7 +1381,7 @@
         </w:tc>
         <w:tc>
           <w:tcPr>
-            <w:tcW w:type="dxa" w:w="1296"/>
+            <w:tcW w:w="1296" w:type="dxa"/>
           </w:tcPr>
           <w:p>
             <w:r>
@@ -1420,7 +1391,7 @@
         </w:tc>
         <w:tc>
           <w:tcPr>
-            <w:tcW w:type="dxa" w:w="1296"/>
+            <w:tcW w:w="1296" w:type="dxa"/>
           </w:tcPr>
           <w:p>
             <w:r>
@@ -1433,31 +1404,50 @@
     <w:p/>
     <w:p>
       <w:r>
-        <w:t>Stabilité. Entre les 5 parts, l'écart-type du NDCG est entre 0,002 et 0,008. Donc deux réglages à moins de 0,01 l'un de l'autre, on ne peut pas les départager. Ce qu'on voit dans le tableau, c'est que les deux réglages vont ensemble : ce qui compte, c'est le rapport entre le seuil et le nombre de voisins, à peu près un tiers. Sur cette diagonale, (30, 10), (50, 15) et (100, 35) donnent tous 0,15 et le plateau commence vers k = 25. Là c'est stable. Dès qu'on s'en écarte, ça décroche dans les deux sens : trop de seuil et les listes se vident (à k = 50, passer de 15 à 25 divise le NDCG par 1,6), pas assez de seuil et on retombe sur des films vus par un seul voisin ((100, 3) tombe à 0,008). Il faut donc régler les deux ensemble, pas l'un après l'autre.</w:t>
-      </w:r>
-    </w:p>
-    <w:p>
-      <w:r>
-        <w:t>Choix du système. Le meilleur NDCG moyen est (50, 15), à 0,151 avec un écart-type de 0,004. Mais quatre réglages sont à moins d'un écart-type de ce maximum, donc on ne peut pas les départager sur le critère principal : (30, 10), (50, 15), (50, 20) et (100, 35). Prendre juste le maximum, ce serait choisir sur du bruit. On a donc utilisé la règle « à un écart-type », qui est la règle habituelle pour choisir un modèle en validation croisée : parmi les réglages qu'on ne peut pas départager, on prend celui qui est le meilleur sur un second critère. Avec la RMSE comme second critère, ce serait (100, 35), mais il ne propose plus que 126 films différents. Avec la variété, c'est (30, 10) : 289 films différents contre 219 pour (50, 15), et les films les moins populaires des quatre (129 avis en médiane contre 134). On a pris la variété, parce que le biais de popularité est la faiblesse principale du filtrage collaboratif d'après le cours, et parce que la RMSE n'est chez nous qu'un contrôle : aucun réglage ne la fait passer sous la simple moyenne de l'utilisateur.</w:t>
+        <w:t>Stabilité</w:t>
+      </w:r>
+      <w:r>
+        <w:t> :</w:t>
+      </w:r>
+      <w:r>
+        <w:t xml:space="preserve"> Entre les 5 parts, l'écart-type du NDCG est entre 0,002 et 0,008. Donc deux réglages à moins de 0,01 l'un de l'autre, on ne peut pas les départager. Ce qu'on voit dans le tableau, </w:t>
+      </w:r>
+      <w:r>
+        <w:lastRenderedPageBreak/>
+        <w:t xml:space="preserve">c'est que les deux réglages vont ensemble : ce qui compte, c'est le rapport entre le seuil et le nombre de voisins, à peu près un tiers. Sur cette diagonale, (30, 10), (50, 15) et (100, 35) donnent tous 0,15 et le plateau commence vers k = 25. Là c'est stable. Dès qu'on s'en écarte, ça décroche dans les deux sens : trop de seuil </w:t>
+      </w:r>
+      <w:r>
+        <w:t>et les listes se vident (à k = 50, passer de 15 à 25 divise le NDCG par 1,6), pas assez de seuil et on retombe sur des films vus par un seul voisin ((100, 3) tombe à 0,008). Il faut donc régler les deux ensemble, pas l'un après l'autre.</w:t>
+      </w:r>
+    </w:p>
+    <w:p>
+      <w:r>
+        <w:t>Choix du système. Le meilleur NDCG moyen est (50, 15), à 0,151 avec un écart-type de 0,004. Mais quatre réglages sont à moins d'un écart-type de ce maximum, donc on ne peut pas les départager sur le critère principal : (30, 10), (50, 15), (50, 20) et (100, 35). Prendre juste le maximum, ce serait choisir sur du bruit. On a donc utilisé la règle « à un écart-type », qui est la règle habituelle pour choisir un modèle en validation croisée : parmi les réglages qu'on ne peut pas départager, on prend celui qui e</w:t>
+      </w:r>
+      <w:r>
+        <w:t>st le meilleur sur un second critère. Avec la RMSE comme second critère, ce serait (100, 35), mais il ne propose plus que 126 films différents. Avec la variété, c'est (30, 10) : 289 films différents contre 219 pour (50, 15), et les films les moins populaires des quatre (129 avis en médiane contre 134). On a pris la variété, parce que le biais de popularité est la faiblesse principale du filtrage collaboratif d'après le cours, et parce que la RMSE n'est chez nous qu'un contrôle : aucun réglage ne la fait pas</w:t>
+      </w:r>
+      <w:r>
+        <w:t>ser sous la simple moyenne de l'utilisateur.</w:t>
       </w:r>
     </w:p>
     <w:tbl>
       <w:tblPr>
-        <w:tblStyle w:val="TableGrid"/>
-        <w:tblW w:type="auto" w:w="0"/>
-        <w:tblLook w:firstColumn="1" w:firstRow="1" w:lastColumn="0" w:lastRow="0" w:noHBand="0" w:noVBand="1" w:val="04A0"/>
+        <w:tblStyle w:val="Grilledutableau"/>
+        <w:tblW w:w="0" w:type="auto"/>
+        <w:tblLook w:val="04A0" w:firstRow="1" w:lastRow="0" w:firstColumn="1" w:lastColumn="0" w:noHBand="0" w:noVBand="1"/>
       </w:tblPr>
       <w:tblGrid>
-        <w:gridCol w:w="1814"/>
-        <w:gridCol w:w="1814"/>
-        <w:gridCol w:w="1814"/>
-        <w:gridCol w:w="1814"/>
-        <w:gridCol w:w="1814"/>
+        <w:gridCol w:w="1937"/>
+        <w:gridCol w:w="1788"/>
+        <w:gridCol w:w="1766"/>
+        <w:gridCol w:w="1784"/>
+        <w:gridCol w:w="1787"/>
       </w:tblGrid>
       <w:tr>
         <w:tc>
           <w:tcPr>
-            <w:tcW w:type="dxa" w:w="1814"/>
+            <w:tcW w:w="1814" w:type="dxa"/>
           </w:tcPr>
           <w:p>
             <w:r>
@@ -1470,7 +1460,7 @@
         </w:tc>
         <w:tc>
           <w:tcPr>
-            <w:tcW w:type="dxa" w:w="1814"/>
+            <w:tcW w:w="1814" w:type="dxa"/>
           </w:tcPr>
           <w:p>
             <w:r>
@@ -1483,7 +1473,7 @@
         </w:tc>
         <w:tc>
           <w:tcPr>
-            <w:tcW w:type="dxa" w:w="1814"/>
+            <w:tcW w:w="1814" w:type="dxa"/>
           </w:tcPr>
           <w:p>
             <w:r>
@@ -1496,7 +1486,7 @@
         </w:tc>
         <w:tc>
           <w:tcPr>
-            <w:tcW w:type="dxa" w:w="1814"/>
+            <w:tcW w:w="1814" w:type="dxa"/>
           </w:tcPr>
           <w:p>
             <w:r>
@@ -1509,7 +1499,7 @@
         </w:tc>
         <w:tc>
           <w:tcPr>
-            <w:tcW w:type="dxa" w:w="1814"/>
+            <w:tcW w:w="1814" w:type="dxa"/>
           </w:tcPr>
           <w:p>
             <w:r>
@@ -1524,7 +1514,7 @@
       <w:tr>
         <w:tc>
           <w:tcPr>
-            <w:tcW w:type="dxa" w:w="1814"/>
+            <w:tcW w:w="1814" w:type="dxa"/>
           </w:tcPr>
           <w:p>
             <w:r>
@@ -1537,7 +1527,7 @@
         </w:tc>
         <w:tc>
           <w:tcPr>
-            <w:tcW w:type="dxa" w:w="1814"/>
+            <w:tcW w:w="1814" w:type="dxa"/>
           </w:tcPr>
           <w:p>
             <w:r>
@@ -1547,7 +1537,7 @@
         </w:tc>
         <w:tc>
           <w:tcPr>
-            <w:tcW w:type="dxa" w:w="1814"/>
+            <w:tcW w:w="1814" w:type="dxa"/>
           </w:tcPr>
           <w:p>
             <w:r>
@@ -1557,7 +1547,7 @@
         </w:tc>
         <w:tc>
           <w:tcPr>
-            <w:tcW w:type="dxa" w:w="1814"/>
+            <w:tcW w:w="1814" w:type="dxa"/>
           </w:tcPr>
           <w:p>
             <w:r>
@@ -1567,7 +1557,7 @@
         </w:tc>
         <w:tc>
           <w:tcPr>
-            <w:tcW w:type="dxa" w:w="1814"/>
+            <w:tcW w:w="1814" w:type="dxa"/>
           </w:tcPr>
           <w:p>
             <w:r>
@@ -1579,7 +1569,7 @@
       <w:tr>
         <w:tc>
           <w:tcPr>
-            <w:tcW w:type="dxa" w:w="1814"/>
+            <w:tcW w:w="1814" w:type="dxa"/>
           </w:tcPr>
           <w:p>
             <w:r>
@@ -1592,7 +1582,7 @@
         </w:tc>
         <w:tc>
           <w:tcPr>
-            <w:tcW w:type="dxa" w:w="1814"/>
+            <w:tcW w:w="1814" w:type="dxa"/>
           </w:tcPr>
           <w:p>
             <w:r>
@@ -1602,7 +1592,7 @@
         </w:tc>
         <w:tc>
           <w:tcPr>
-            <w:tcW w:type="dxa" w:w="1814"/>
+            <w:tcW w:w="1814" w:type="dxa"/>
           </w:tcPr>
           <w:p>
             <w:r>
@@ -1612,7 +1602,7 @@
         </w:tc>
         <w:tc>
           <w:tcPr>
-            <w:tcW w:type="dxa" w:w="1814"/>
+            <w:tcW w:w="1814" w:type="dxa"/>
           </w:tcPr>
           <w:p>
             <w:r>
@@ -1622,7 +1612,7 @@
         </w:tc>
         <w:tc>
           <w:tcPr>
-            <w:tcW w:type="dxa" w:w="1814"/>
+            <w:tcW w:w="1814" w:type="dxa"/>
           </w:tcPr>
           <w:p>
             <w:r>
@@ -1634,7 +1624,7 @@
       <w:tr>
         <w:tc>
           <w:tcPr>
-            <w:tcW w:type="dxa" w:w="1814"/>
+            <w:tcW w:w="1814" w:type="dxa"/>
           </w:tcPr>
           <w:p>
             <w:r>
@@ -1647,7 +1637,7 @@
         </w:tc>
         <w:tc>
           <w:tcPr>
-            <w:tcW w:type="dxa" w:w="1814"/>
+            <w:tcW w:w="1814" w:type="dxa"/>
           </w:tcPr>
           <w:p>
             <w:r>
@@ -1657,7 +1647,7 @@
         </w:tc>
         <w:tc>
           <w:tcPr>
-            <w:tcW w:type="dxa" w:w="1814"/>
+            <w:tcW w:w="1814" w:type="dxa"/>
           </w:tcPr>
           <w:p>
             <w:r>
@@ -1667,7 +1657,7 @@
         </w:tc>
         <w:tc>
           <w:tcPr>
-            <w:tcW w:type="dxa" w:w="1814"/>
+            <w:tcW w:w="1814" w:type="dxa"/>
           </w:tcPr>
           <w:p>
             <w:r>
@@ -1677,7 +1667,7 @@
         </w:tc>
         <w:tc>
           <w:tcPr>
-            <w:tcW w:type="dxa" w:w="1814"/>
+            <w:tcW w:w="1814" w:type="dxa"/>
           </w:tcPr>
           <w:p>
             <w:r>
@@ -1689,7 +1679,7 @@
       <w:tr>
         <w:tc>
           <w:tcPr>
-            <w:tcW w:type="dxa" w:w="1814"/>
+            <w:tcW w:w="1814" w:type="dxa"/>
           </w:tcPr>
           <w:p>
             <w:r>
@@ -1702,7 +1692,7 @@
         </w:tc>
         <w:tc>
           <w:tcPr>
-            <w:tcW w:type="dxa" w:w="1814"/>
+            <w:tcW w:w="1814" w:type="dxa"/>
           </w:tcPr>
           <w:p>
             <w:r>
@@ -1712,7 +1702,7 @@
         </w:tc>
         <w:tc>
           <w:tcPr>
-            <w:tcW w:type="dxa" w:w="1814"/>
+            <w:tcW w:w="1814" w:type="dxa"/>
           </w:tcPr>
           <w:p>
             <w:r>
@@ -1722,7 +1712,7 @@
         </w:tc>
         <w:tc>
           <w:tcPr>
-            <w:tcW w:type="dxa" w:w="1814"/>
+            <w:tcW w:w="1814" w:type="dxa"/>
           </w:tcPr>
           <w:p>
             <w:r>
@@ -1732,7 +1722,7 @@
         </w:tc>
         <w:tc>
           <w:tcPr>
-            <w:tcW w:type="dxa" w:w="1814"/>
+            <w:tcW w:w="1814" w:type="dxa"/>
           </w:tcPr>
           <w:p>
             <w:r>
@@ -1755,33 +1745,27 @@
     </w:p>
     <w:tbl>
       <w:tblPr>
-        <w:tblStyle w:val="TableGrid"/>
-        <w:tblW w:type="auto" w:w="0"/>
-        <w:tblLook w:firstColumn="1" w:firstRow="1" w:lastColumn="0" w:lastRow="0" w:noHBand="0" w:noVBand="1" w:val="04A0"/>
+        <w:tblStyle w:val="Grilledutableau"/>
+        <w:tblW w:w="0" w:type="auto"/>
+        <w:tblLook w:val="04A0" w:firstRow="1" w:lastRow="0" w:firstColumn="1" w:lastColumn="0" w:noHBand="0" w:noVBand="1"/>
       </w:tblPr>
       <w:tblGrid>
-        <w:gridCol w:w="1814"/>
-        <w:gridCol w:w="1814"/>
-        <w:gridCol w:w="1814"/>
-        <w:gridCol w:w="1814"/>
-        <w:gridCol w:w="1814"/>
+        <w:gridCol w:w="1813"/>
+        <w:gridCol w:w="1812"/>
+        <w:gridCol w:w="1812"/>
+        <w:gridCol w:w="1813"/>
+        <w:gridCol w:w="1812"/>
       </w:tblGrid>
       <w:tr>
         <w:tc>
           <w:tcPr>
-            <w:tcW w:type="dxa" w:w="1814"/>
-          </w:tcPr>
-          <w:p>
-            <w:r>
-              <w:rPr>
-                <w:b/>
-              </w:rPr>
-            </w:r>
-          </w:p>
-        </w:tc>
-        <w:tc>
-          <w:tcPr>
-            <w:tcW w:type="dxa" w:w="1814"/>
+            <w:tcW w:w="1814" w:type="dxa"/>
+          </w:tcPr>
+          <w:p/>
+        </w:tc>
+        <w:tc>
+          <w:tcPr>
+            <w:tcW w:w="1814" w:type="dxa"/>
           </w:tcPr>
           <w:p>
             <w:r>
@@ -1794,7 +1778,7 @@
         </w:tc>
         <w:tc>
           <w:tcPr>
-            <w:tcW w:type="dxa" w:w="1814"/>
+            <w:tcW w:w="1814" w:type="dxa"/>
           </w:tcPr>
           <w:p>
             <w:r>
@@ -1807,7 +1791,7 @@
         </w:tc>
         <w:tc>
           <w:tcPr>
-            <w:tcW w:type="dxa" w:w="1814"/>
+            <w:tcW w:w="1814" w:type="dxa"/>
           </w:tcPr>
           <w:p>
             <w:r>
@@ -1820,7 +1804,7 @@
         </w:tc>
         <w:tc>
           <w:tcPr>
-            <w:tcW w:type="dxa" w:w="1814"/>
+            <w:tcW w:w="1814" w:type="dxa"/>
           </w:tcPr>
           <w:p>
             <w:r>
@@ -1835,7 +1819,7 @@
       <w:tr>
         <w:tc>
           <w:tcPr>
-            <w:tcW w:type="dxa" w:w="1814"/>
+            <w:tcW w:w="1814" w:type="dxa"/>
           </w:tcPr>
           <w:p>
             <w:r>
@@ -1848,7 +1832,7 @@
         </w:tc>
         <w:tc>
           <w:tcPr>
-            <w:tcW w:type="dxa" w:w="1814"/>
+            <w:tcW w:w="1814" w:type="dxa"/>
           </w:tcPr>
           <w:p>
             <w:r>
@@ -1858,7 +1842,7 @@
         </w:tc>
         <w:tc>
           <w:tcPr>
-            <w:tcW w:type="dxa" w:w="1814"/>
+            <w:tcW w:w="1814" w:type="dxa"/>
           </w:tcPr>
           <w:p>
             <w:r>
@@ -1868,7 +1852,7 @@
         </w:tc>
         <w:tc>
           <w:tcPr>
-            <w:tcW w:type="dxa" w:w="1814"/>
+            <w:tcW w:w="1814" w:type="dxa"/>
           </w:tcPr>
           <w:p>
             <w:r>
@@ -1878,17 +1862,15 @@
         </w:tc>
         <w:tc>
           <w:tcPr>
-            <w:tcW w:type="dxa" w:w="1814"/>
-          </w:tcPr>
-          <w:p>
-            <w:r/>
-          </w:p>
+            <w:tcW w:w="1814" w:type="dxa"/>
+          </w:tcPr>
+          <w:p/>
         </w:tc>
       </w:tr>
       <w:tr>
         <w:tc>
           <w:tcPr>
-            <w:tcW w:type="dxa" w:w="1814"/>
+            <w:tcW w:w="1814" w:type="dxa"/>
           </w:tcPr>
           <w:p>
             <w:r>
@@ -1901,7 +1883,7 @@
         </w:tc>
         <w:tc>
           <w:tcPr>
-            <w:tcW w:type="dxa" w:w="1814"/>
+            <w:tcW w:w="1814" w:type="dxa"/>
           </w:tcPr>
           <w:p>
             <w:r>
@@ -1911,7 +1893,7 @@
         </w:tc>
         <w:tc>
           <w:tcPr>
-            <w:tcW w:type="dxa" w:w="1814"/>
+            <w:tcW w:w="1814" w:type="dxa"/>
           </w:tcPr>
           <w:p>
             <w:r>
@@ -1921,7 +1903,7 @@
         </w:tc>
         <w:tc>
           <w:tcPr>
-            <w:tcW w:type="dxa" w:w="1814"/>
+            <w:tcW w:w="1814" w:type="dxa"/>
           </w:tcPr>
           <w:p>
             <w:r>
@@ -1931,7 +1913,7 @@
         </w:tc>
         <w:tc>
           <w:tcPr>
-            <w:tcW w:type="dxa" w:w="1814"/>
+            <w:tcW w:w="1814" w:type="dxa"/>
           </w:tcPr>
           <w:p>
             <w:r>
@@ -1943,7 +1925,7 @@
       <w:tr>
         <w:tc>
           <w:tcPr>
-            <w:tcW w:type="dxa" w:w="1814"/>
+            <w:tcW w:w="1814" w:type="dxa"/>
           </w:tcPr>
           <w:p>
             <w:r>
@@ -1956,7 +1938,7 @@
         </w:tc>
         <w:tc>
           <w:tcPr>
-            <w:tcW w:type="dxa" w:w="1814"/>
+            <w:tcW w:w="1814" w:type="dxa"/>
           </w:tcPr>
           <w:p>
             <w:r>
@@ -1966,7 +1948,7 @@
         </w:tc>
         <w:tc>
           <w:tcPr>
-            <w:tcW w:type="dxa" w:w="1814"/>
+            <w:tcW w:w="1814" w:type="dxa"/>
           </w:tcPr>
           <w:p>
             <w:r>
@@ -1976,7 +1958,7 @@
         </w:tc>
         <w:tc>
           <w:tcPr>
-            <w:tcW w:type="dxa" w:w="1814"/>
+            <w:tcW w:w="1814" w:type="dxa"/>
           </w:tcPr>
           <w:p>
             <w:r>
@@ -1986,7 +1968,7 @@
         </w:tc>
         <w:tc>
           <w:tcPr>
-            <w:tcW w:type="dxa" w:w="1814"/>
+            <w:tcW w:w="1814" w:type="dxa"/>
           </w:tcPr>
           <w:p>
             <w:r>
@@ -1998,7 +1980,7 @@
       <w:tr>
         <w:tc>
           <w:tcPr>
-            <w:tcW w:type="dxa" w:w="1814"/>
+            <w:tcW w:w="1814" w:type="dxa"/>
           </w:tcPr>
           <w:p>
             <w:r>
@@ -2011,7 +1993,7 @@
         </w:tc>
         <w:tc>
           <w:tcPr>
-            <w:tcW w:type="dxa" w:w="1814"/>
+            <w:tcW w:w="1814" w:type="dxa"/>
           </w:tcPr>
           <w:p>
             <w:r>
@@ -2021,7 +2003,7 @@
         </w:tc>
         <w:tc>
           <w:tcPr>
-            <w:tcW w:type="dxa" w:w="1814"/>
+            <w:tcW w:w="1814" w:type="dxa"/>
           </w:tcPr>
           <w:p>
             <w:r>
@@ -2031,7 +2013,7 @@
         </w:tc>
         <w:tc>
           <w:tcPr>
-            <w:tcW w:type="dxa" w:w="1814"/>
+            <w:tcW w:w="1814" w:type="dxa"/>
           </w:tcPr>
           <w:p>
             <w:r>
@@ -2041,7 +2023,7 @@
         </w:tc>
         <w:tc>
           <w:tcPr>
-            <w:tcW w:type="dxa" w:w="1814"/>
+            <w:tcW w:w="1814" w:type="dxa"/>
           </w:tcPr>
           <w:p>
             <w:r>
@@ -2053,7 +2035,7 @@
       <w:tr>
         <w:tc>
           <w:tcPr>
-            <w:tcW w:type="dxa" w:w="1814"/>
+            <w:tcW w:w="1814" w:type="dxa"/>
           </w:tcPr>
           <w:p>
             <w:r>
@@ -2066,7 +2048,7 @@
         </w:tc>
         <w:tc>
           <w:tcPr>
-            <w:tcW w:type="dxa" w:w="1814"/>
+            <w:tcW w:w="1814" w:type="dxa"/>
           </w:tcPr>
           <w:p>
             <w:r>
@@ -2076,7 +2058,7 @@
         </w:tc>
         <w:tc>
           <w:tcPr>
-            <w:tcW w:type="dxa" w:w="1814"/>
+            <w:tcW w:w="1814" w:type="dxa"/>
           </w:tcPr>
           <w:p>
             <w:r>
@@ -2086,7 +2068,7 @@
         </w:tc>
         <w:tc>
           <w:tcPr>
-            <w:tcW w:type="dxa" w:w="1814"/>
+            <w:tcW w:w="1814" w:type="dxa"/>
           </w:tcPr>
           <w:p>
             <w:r>
@@ -2096,7 +2078,7 @@
         </w:tc>
         <w:tc>
           <w:tcPr>
-            <w:tcW w:type="dxa" w:w="1814"/>
+            <w:tcW w:w="1814" w:type="dxa"/>
           </w:tcPr>
           <w:p>
             <w:r>
@@ -2108,7 +2090,7 @@
       <w:tr>
         <w:tc>
           <w:tcPr>
-            <w:tcW w:type="dxa" w:w="1814"/>
+            <w:tcW w:w="1814" w:type="dxa"/>
           </w:tcPr>
           <w:p>
             <w:r>
@@ -2121,7 +2103,7 @@
         </w:tc>
         <w:tc>
           <w:tcPr>
-            <w:tcW w:type="dxa" w:w="1814"/>
+            <w:tcW w:w="1814" w:type="dxa"/>
           </w:tcPr>
           <w:p>
             <w:r>
@@ -2131,7 +2113,7 @@
         </w:tc>
         <w:tc>
           <w:tcPr>
-            <w:tcW w:type="dxa" w:w="1814"/>
+            <w:tcW w:w="1814" w:type="dxa"/>
           </w:tcPr>
           <w:p>
             <w:r>
@@ -2141,7 +2123,7 @@
         </w:tc>
         <w:tc>
           <w:tcPr>
-            <w:tcW w:type="dxa" w:w="1814"/>
+            <w:tcW w:w="1814" w:type="dxa"/>
           </w:tcPr>
           <w:p>
             <w:r>
@@ -2151,7 +2133,7 @@
         </w:tc>
         <w:tc>
           <w:tcPr>
-            <w:tcW w:type="dxa" w:w="1814"/>
+            <w:tcW w:w="1814" w:type="dxa"/>
           </w:tcPr>
           <w:p>
             <w:r>
@@ -2179,16 +2161,20 @@
     </w:p>
     <w:p>
       <w:r>
+        <w:rPr>
+          <w:noProof/>
+        </w:rPr>
         <w:drawing>
-          <wp:inline xmlns:a="http://schemas.openxmlformats.org/drawingml/2006/main" xmlns:pic="http://schemas.openxmlformats.org/drawingml/2006/picture">
+          <wp:inline distT="0" distB="0" distL="0" distR="0" wp14:anchorId="5290F89A" wp14:editId="1E9DFF0B">
             <wp:extent cx="5760000" cy="1972256"/>
+            <wp:effectExtent l="0" t="0" r="0" b="0"/>
             <wp:docPr id="1" name="Picture 1"/>
             <wp:cNvGraphicFramePr>
-              <a:graphicFrameLocks noChangeAspect="1"/>
+              <a:graphicFrameLocks xmlns:a="http://schemas.openxmlformats.org/drawingml/2006/main" noChangeAspect="1"/>
             </wp:cNvGraphicFramePr>
-            <a:graphic>
+            <a:graphic xmlns:a="http://schemas.openxmlformats.org/drawingml/2006/main">
               <a:graphicData uri="http://schemas.openxmlformats.org/drawingml/2006/picture">
-                <pic:pic>
+                <pic:pic xmlns:pic="http://schemas.openxmlformats.org/drawingml/2006/picture">
                   <pic:nvPicPr>
                     <pic:cNvPr id="0" name="image.png"/>
                     <pic:cNvPicPr/>
@@ -2204,7 +2190,9 @@
                       <a:off x="0" y="0"/>
                       <a:ext cx="5760000" cy="1972256"/>
                     </a:xfrm>
-                    <a:prstGeom prst="rect"/>
+                    <a:prstGeom prst="rect">
+                      <a:avLst/>
+                    </a:prstGeom>
                   </pic:spPr>
                 </pic:pic>
               </a:graphicData>
@@ -2215,27 +2203,35 @@
     </w:p>
     <w:p>
       <w:r>
-        <w:t>Figure 2 : le compromis entre qualité et variété, un point par réglage. En abscisse le nombre de films différents proposés sur les 671 listes de validation, en ordonnée le NDCG@10, et la couleur donne la popularité médiane des films proposés, du violet (films quasi inconnus) au jaune (que des classiques). Plus le seuil monte, plus on part vers la gauche et vers le jaune. L'étoile rouge est le (30, 10) retenu : sur le plateau, c'est le point le plus à droite. (50, 15) et (100, 35) sont à sa gauche, aussi bons mais moins variés. (25, 8) à sa droite est encore plus varié mais un peu moins bon.</w:t>
-      </w:r>
-    </w:p>
-    <w:p>
-      <w:r>
+        <w:t>Figure 2 : le compromis entre qualité et variété, un point par réglage. En abscisse le nombre de films différents proposés sur les 671 listes de validation, en ordonnée le NDCG@10, et la couleur donne la popularité médiane des films proposés, du violet (films quasi inconnus) au jaune (que des classiques). Plus le seuil monte, plus on part vers la gauche et vers le jaune. L'étoile rouge est le (30, 10) retenu : sur le plateau, c'est le point le plus à droite. (50, 15) et (100, 35) sont à sa gauche, aussi bon</w:t>
+      </w:r>
+      <w:r>
+        <w:t>s mais moins variés. (25, 8) à sa droite est encore plus varié mais un peu moins bon.</w:t>
+      </w:r>
+    </w:p>
+    <w:p>
+      <w:r>
+        <w:rPr>
+          <w:noProof/>
+        </w:rPr>
+        <w:lastRenderedPageBreak/>
         <w:drawing>
-          <wp:inline xmlns:a="http://schemas.openxmlformats.org/drawingml/2006/main" xmlns:pic="http://schemas.openxmlformats.org/drawingml/2006/picture">
+          <wp:inline distT="0" distB="0" distL="0" distR="0" wp14:anchorId="2E4E0D55" wp14:editId="03624289">
             <wp:extent cx="5760000" cy="3240000"/>
+            <wp:effectExtent l="0" t="0" r="0" b="0"/>
             <wp:docPr id="2" name="Picture 2"/>
             <wp:cNvGraphicFramePr>
-              <a:graphicFrameLocks noChangeAspect="1"/>
+              <a:graphicFrameLocks xmlns:a="http://schemas.openxmlformats.org/drawingml/2006/main" noChangeAspect="1"/>
             </wp:cNvGraphicFramePr>
-            <a:graphic>
+            <a:graphic xmlns:a="http://schemas.openxmlformats.org/drawingml/2006/main">
               <a:graphicData uri="http://schemas.openxmlformats.org/drawingml/2006/picture">
-                <pic:pic>
+                <pic:pic xmlns:pic="http://schemas.openxmlformats.org/drawingml/2006/picture">
                   <pic:nvPicPr>
                     <pic:cNvPr id="0" name="ex4_q6_fig2_ndcg_vs_variete.png"/>
                     <pic:cNvPicPr/>
                   </pic:nvPicPr>
                   <pic:blipFill>
-                    <a:blip r:embed="rId30"/>
+                    <a:blip r:embed="rId14"/>
                     <a:stretch>
                       <a:fillRect/>
                     </a:stretch>
@@ -2245,7 +2241,9 @@
                       <a:off x="0" y="0"/>
                       <a:ext cx="5760000" cy="3240000"/>
                     </a:xfrm>
-                    <a:prstGeom prst="rect"/>
+                    <a:prstGeom prst="rect">
+                      <a:avLst/>
+                    </a:prstGeom>
                   </pic:spPr>
                 </pic:pic>
               </a:graphicData>
@@ -2269,7 +2267,10 @@
     </w:p>
     <w:p>
       <w:r>
-        <w:t>Ce que fait le centrage. Avant de calculer les similarités, on retire à chaque utilisateur sa note moyenne. Un 4 chez quelqu'un qui met 4,5 partout devient -0,5, un 4 chez quelqu'un qui met 2,5 partout devient +1,5. Deux utilisateurs sont alors similaires s'ils aiment et détestent les mêmes films, pas s'ils notent au même niveau. Pour prédire, on moyenne ces écarts chez les voisins puis on rajoute la moyenne de l'utilisateur, qui retrouve son niveau. Avec des notes centrées, une similarité peut devenir négative (goûts opposés), et on la ramène à 0 pour ne pas prendre ces gens comme voisins : 54 % des paires d'utilisateurs gardent une similarité positive, contre 82 % sans centrage. Les voisins choisis ne sont donc plus les mêmes.</w:t>
+        <w:t>Ce que fait le centrage. Avant de calculer les similarités, on retire à chaque utilisateur sa note moyenne. Un 4 chez quelqu'un qui met 4,5 partout devient -0,5, un 4 chez quelqu'un qui met 2,5 partout devient +1,5. Deux utilisateurs sont alors similaires s'ils aiment et détestent les mêmes films, pas s'ils notent au même niveau. Pour prédire, on moyenne ces écarts chez les voisins puis on rajoute la moyenne de l'utilisateur, qui retrouve son niveau. Avec des notes centrées, une similarité peut devenir néga</w:t>
+      </w:r>
+      <w:r>
+        <w:t>tive (goûts opposés), et on la ramène à 0 pour ne pas prendre ces gens comme voisins : 54 % des paires d'utilisateurs gardent une similarité positive, contre 82 % sans centrage. Les voisins choisis ne sont donc plus les mêmes.</w:t>
       </w:r>
     </w:p>
     <w:p>
@@ -2279,35 +2280,29 @@
     </w:p>
     <w:tbl>
       <w:tblPr>
-        <w:tblStyle w:val="TableGrid"/>
-        <w:tblW w:type="auto" w:w="0"/>
-        <w:tblLook w:firstColumn="1" w:firstRow="1" w:lastColumn="0" w:lastRow="0" w:noHBand="0" w:noVBand="1" w:val="04A0"/>
+        <w:tblStyle w:val="Grilledutableau"/>
+        <w:tblW w:w="0" w:type="auto"/>
+        <w:tblLook w:val="04A0" w:firstRow="1" w:lastRow="0" w:firstColumn="1" w:lastColumn="0" w:noHBand="0" w:noVBand="1"/>
       </w:tblPr>
       <w:tblGrid>
-        <w:gridCol w:w="1296"/>
-        <w:gridCol w:w="1296"/>
-        <w:gridCol w:w="1296"/>
-        <w:gridCol w:w="1296"/>
-        <w:gridCol w:w="1296"/>
-        <w:gridCol w:w="1296"/>
-        <w:gridCol w:w="1296"/>
+        <w:gridCol w:w="1278"/>
+        <w:gridCol w:w="1283"/>
+        <w:gridCol w:w="1292"/>
+        <w:gridCol w:w="1338"/>
+        <w:gridCol w:w="1338"/>
+        <w:gridCol w:w="1241"/>
+        <w:gridCol w:w="1292"/>
       </w:tblGrid>
       <w:tr>
         <w:tc>
           <w:tcPr>
-            <w:tcW w:type="dxa" w:w="1296"/>
-          </w:tcPr>
-          <w:p>
-            <w:r>
-              <w:rPr>
-                <w:b/>
-              </w:rPr>
-            </w:r>
-          </w:p>
-        </w:tc>
-        <w:tc>
-          <w:tcPr>
-            <w:tcW w:type="dxa" w:w="1296"/>
+            <w:tcW w:w="1296" w:type="dxa"/>
+          </w:tcPr>
+          <w:p/>
+        </w:tc>
+        <w:tc>
+          <w:tcPr>
+            <w:tcW w:w="1296" w:type="dxa"/>
           </w:tcPr>
           <w:p>
             <w:r>
@@ -2320,7 +2315,7 @@
         </w:tc>
         <w:tc>
           <w:tcPr>
-            <w:tcW w:type="dxa" w:w="1296"/>
+            <w:tcW w:w="1296" w:type="dxa"/>
           </w:tcPr>
           <w:p>
             <w:r>
@@ -2333,7 +2328,7 @@
         </w:tc>
         <w:tc>
           <w:tcPr>
-            <w:tcW w:type="dxa" w:w="1296"/>
+            <w:tcW w:w="1296" w:type="dxa"/>
           </w:tcPr>
           <w:p>
             <w:r>
@@ -2346,7 +2341,7 @@
         </w:tc>
         <w:tc>
           <w:tcPr>
-            <w:tcW w:type="dxa" w:w="1296"/>
+            <w:tcW w:w="1296" w:type="dxa"/>
           </w:tcPr>
           <w:p>
             <w:r>
@@ -2359,7 +2354,7 @@
         </w:tc>
         <w:tc>
           <w:tcPr>
-            <w:tcW w:type="dxa" w:w="1296"/>
+            <w:tcW w:w="1296" w:type="dxa"/>
           </w:tcPr>
           <w:p>
             <w:r>
@@ -2372,7 +2367,7 @@
         </w:tc>
         <w:tc>
           <w:tcPr>
-            <w:tcW w:type="dxa" w:w="1296"/>
+            <w:tcW w:w="1296" w:type="dxa"/>
           </w:tcPr>
           <w:p>
             <w:r>
@@ -2387,28 +2382,33 @@
       <w:tr>
         <w:tc>
           <w:tcPr>
-            <w:tcW w:type="dxa" w:w="1296"/>
-          </w:tcPr>
-          <w:p>
-            <w:r>
-              <w:rPr>
-                <w:b/>
-              </w:rPr>
-              <w:t>Repère : les films les plus notés, pour tout le monde</w:t>
-            </w:r>
-          </w:p>
-        </w:tc>
-        <w:tc>
-          <w:tcPr>
-            <w:tcW w:type="dxa" w:w="1296"/>
-          </w:tcPr>
-          <w:p>
-            <w:r/>
-          </w:p>
-        </w:tc>
-        <w:tc>
-          <w:tcPr>
-            <w:tcW w:type="dxa" w:w="1296"/>
+            <w:tcW w:w="1296" w:type="dxa"/>
+          </w:tcPr>
+          <w:p>
+            <w:r>
+              <w:rPr>
+                <w:b/>
+              </w:rPr>
+              <w:t xml:space="preserve">Repère : les films les plus notés, </w:t>
+            </w:r>
+            <w:r>
+              <w:rPr>
+                <w:b/>
+              </w:rPr>
+              <w:lastRenderedPageBreak/>
+              <w:t>pour tout le monde</w:t>
+            </w:r>
+          </w:p>
+        </w:tc>
+        <w:tc>
+          <w:tcPr>
+            <w:tcW w:w="1296" w:type="dxa"/>
+          </w:tcPr>
+          <w:p/>
+        </w:tc>
+        <w:tc>
+          <w:tcPr>
+            <w:tcW w:w="1296" w:type="dxa"/>
           </w:tcPr>
           <w:p>
             <w:r>
@@ -2418,7 +2418,7 @@
         </w:tc>
         <w:tc>
           <w:tcPr>
-            <w:tcW w:type="dxa" w:w="1296"/>
+            <w:tcW w:w="1296" w:type="dxa"/>
           </w:tcPr>
           <w:p>
             <w:r>
@@ -2428,7 +2428,7 @@
         </w:tc>
         <w:tc>
           <w:tcPr>
-            <w:tcW w:type="dxa" w:w="1296"/>
+            <w:tcW w:w="1296" w:type="dxa"/>
           </w:tcPr>
           <w:p>
             <w:r>
@@ -2438,15 +2438,13 @@
         </w:tc>
         <w:tc>
           <w:tcPr>
-            <w:tcW w:type="dxa" w:w="1296"/>
-          </w:tcPr>
-          <w:p>
-            <w:r/>
-          </w:p>
-        </w:tc>
-        <w:tc>
-          <w:tcPr>
-            <w:tcW w:type="dxa" w:w="1296"/>
+            <w:tcW w:w="1296" w:type="dxa"/>
+          </w:tcPr>
+          <w:p/>
+        </w:tc>
+        <w:tc>
+          <w:tcPr>
+            <w:tcW w:w="1296" w:type="dxa"/>
           </w:tcPr>
           <w:p>
             <w:r>
@@ -2458,7 +2456,7 @@
       <w:tr>
         <w:tc>
           <w:tcPr>
-            <w:tcW w:type="dxa" w:w="1296"/>
+            <w:tcW w:w="1296" w:type="dxa"/>
           </w:tcPr>
           <w:p>
             <w:r>
@@ -2471,7 +2469,7 @@
         </w:tc>
         <w:tc>
           <w:tcPr>
-            <w:tcW w:type="dxa" w:w="1296"/>
+            <w:tcW w:w="1296" w:type="dxa"/>
           </w:tcPr>
           <w:p>
             <w:r>
@@ -2481,7 +2479,7 @@
         </w:tc>
         <w:tc>
           <w:tcPr>
-            <w:tcW w:type="dxa" w:w="1296"/>
+            <w:tcW w:w="1296" w:type="dxa"/>
           </w:tcPr>
           <w:p>
             <w:r>
@@ -2491,7 +2489,7 @@
         </w:tc>
         <w:tc>
           <w:tcPr>
-            <w:tcW w:type="dxa" w:w="1296"/>
+            <w:tcW w:w="1296" w:type="dxa"/>
           </w:tcPr>
           <w:p>
             <w:r>
@@ -2501,7 +2499,7 @@
         </w:tc>
         <w:tc>
           <w:tcPr>
-            <w:tcW w:type="dxa" w:w="1296"/>
+            <w:tcW w:w="1296" w:type="dxa"/>
           </w:tcPr>
           <w:p>
             <w:r>
@@ -2511,7 +2509,7 @@
         </w:tc>
         <w:tc>
           <w:tcPr>
-            <w:tcW w:type="dxa" w:w="1296"/>
+            <w:tcW w:w="1296" w:type="dxa"/>
           </w:tcPr>
           <w:p>
             <w:r>
@@ -2521,7 +2519,7 @@
         </w:tc>
         <w:tc>
           <w:tcPr>
-            <w:tcW w:type="dxa" w:w="1296"/>
+            <w:tcW w:w="1296" w:type="dxa"/>
           </w:tcPr>
           <w:p>
             <w:r>
@@ -2533,7 +2531,7 @@
       <w:tr>
         <w:tc>
           <w:tcPr>
-            <w:tcW w:type="dxa" w:w="1296"/>
+            <w:tcW w:w="1296" w:type="dxa"/>
           </w:tcPr>
           <w:p>
             <w:r>
@@ -2546,7 +2544,7 @@
         </w:tc>
         <w:tc>
           <w:tcPr>
-            <w:tcW w:type="dxa" w:w="1296"/>
+            <w:tcW w:w="1296" w:type="dxa"/>
           </w:tcPr>
           <w:p>
             <w:r>
@@ -2556,7 +2554,7 @@
         </w:tc>
         <w:tc>
           <w:tcPr>
-            <w:tcW w:type="dxa" w:w="1296"/>
+            <w:tcW w:w="1296" w:type="dxa"/>
           </w:tcPr>
           <w:p>
             <w:r>
@@ -2566,7 +2564,7 @@
         </w:tc>
         <w:tc>
           <w:tcPr>
-            <w:tcW w:type="dxa" w:w="1296"/>
+            <w:tcW w:w="1296" w:type="dxa"/>
           </w:tcPr>
           <w:p>
             <w:r>
@@ -2576,7 +2574,7 @@
         </w:tc>
         <w:tc>
           <w:tcPr>
-            <w:tcW w:type="dxa" w:w="1296"/>
+            <w:tcW w:w="1296" w:type="dxa"/>
           </w:tcPr>
           <w:p>
             <w:r>
@@ -2586,7 +2584,7 @@
         </w:tc>
         <w:tc>
           <w:tcPr>
-            <w:tcW w:type="dxa" w:w="1296"/>
+            <w:tcW w:w="1296" w:type="dxa"/>
           </w:tcPr>
           <w:p>
             <w:r>
@@ -2596,7 +2594,7 @@
         </w:tc>
         <w:tc>
           <w:tcPr>
-            <w:tcW w:type="dxa" w:w="1296"/>
+            <w:tcW w:w="1296" w:type="dxa"/>
           </w:tcPr>
           <w:p>
             <w:r>
@@ -2608,7 +2606,7 @@
       <w:tr>
         <w:tc>
           <w:tcPr>
-            <w:tcW w:type="dxa" w:w="1296"/>
+            <w:tcW w:w="1296" w:type="dxa"/>
           </w:tcPr>
           <w:p>
             <w:r>
@@ -2621,7 +2619,7 @@
         </w:tc>
         <w:tc>
           <w:tcPr>
-            <w:tcW w:type="dxa" w:w="1296"/>
+            <w:tcW w:w="1296" w:type="dxa"/>
           </w:tcPr>
           <w:p>
             <w:r>
@@ -2631,7 +2629,7 @@
         </w:tc>
         <w:tc>
           <w:tcPr>
-            <w:tcW w:type="dxa" w:w="1296"/>
+            <w:tcW w:w="1296" w:type="dxa"/>
           </w:tcPr>
           <w:p>
             <w:r>
@@ -2641,7 +2639,7 @@
         </w:tc>
         <w:tc>
           <w:tcPr>
-            <w:tcW w:type="dxa" w:w="1296"/>
+            <w:tcW w:w="1296" w:type="dxa"/>
           </w:tcPr>
           <w:p>
             <w:r>
@@ -2651,7 +2649,7 @@
         </w:tc>
         <w:tc>
           <w:tcPr>
-            <w:tcW w:type="dxa" w:w="1296"/>
+            <w:tcW w:w="1296" w:type="dxa"/>
           </w:tcPr>
           <w:p>
             <w:r>
@@ -2661,25 +2659,21 @@
         </w:tc>
         <w:tc>
           <w:tcPr>
-            <w:tcW w:type="dxa" w:w="1296"/>
-          </w:tcPr>
-          <w:p>
-            <w:r/>
-          </w:p>
-        </w:tc>
-        <w:tc>
-          <w:tcPr>
-            <w:tcW w:type="dxa" w:w="1296"/>
-          </w:tcPr>
-          <w:p>
-            <w:r/>
-          </w:p>
+            <w:tcW w:w="1296" w:type="dxa"/>
+          </w:tcPr>
+          <w:p/>
+        </w:tc>
+        <w:tc>
+          <w:tcPr>
+            <w:tcW w:w="1296" w:type="dxa"/>
+          </w:tcPr>
+          <w:p/>
         </w:tc>
       </w:tr>
       <w:tr>
         <w:tc>
           <w:tcPr>
-            <w:tcW w:type="dxa" w:w="1296"/>
+            <w:tcW w:w="1296" w:type="dxa"/>
           </w:tcPr>
           <w:p>
             <w:r>
@@ -2692,7 +2686,7 @@
         </w:tc>
         <w:tc>
           <w:tcPr>
-            <w:tcW w:type="dxa" w:w="1296"/>
+            <w:tcW w:w="1296" w:type="dxa"/>
           </w:tcPr>
           <w:p>
             <w:r>
@@ -2702,7 +2696,7 @@
         </w:tc>
         <w:tc>
           <w:tcPr>
-            <w:tcW w:type="dxa" w:w="1296"/>
+            <w:tcW w:w="1296" w:type="dxa"/>
           </w:tcPr>
           <w:p>
             <w:r>
@@ -2712,7 +2706,7 @@
         </w:tc>
         <w:tc>
           <w:tcPr>
-            <w:tcW w:type="dxa" w:w="1296"/>
+            <w:tcW w:w="1296" w:type="dxa"/>
           </w:tcPr>
           <w:p>
             <w:r>
@@ -2722,7 +2716,7 @@
         </w:tc>
         <w:tc>
           <w:tcPr>
-            <w:tcW w:type="dxa" w:w="1296"/>
+            <w:tcW w:w="1296" w:type="dxa"/>
           </w:tcPr>
           <w:p>
             <w:r>
@@ -2732,26 +2726,25 @@
         </w:tc>
         <w:tc>
           <w:tcPr>
-            <w:tcW w:type="dxa" w:w="1296"/>
-          </w:tcPr>
-          <w:p>
-            <w:r/>
-          </w:p>
-        </w:tc>
-        <w:tc>
-          <w:tcPr>
-            <w:tcW w:type="dxa" w:w="1296"/>
-          </w:tcPr>
-          <w:p>
-            <w:r/>
-          </w:p>
+            <w:tcW w:w="1296" w:type="dxa"/>
+          </w:tcPr>
+          <w:p/>
+        </w:tc>
+        <w:tc>
+          <w:tcPr>
+            <w:tcW w:w="1296" w:type="dxa"/>
+          </w:tcPr>
+          <w:p/>
         </w:tc>
       </w:tr>
     </w:tbl>
     <w:p/>
     <w:p>
       <w:r>
-        <w:t>Ce que ça donne. Le centrage améliore nettement la prédiction des notes : la RMSE passe de 1,031 à 0,971 en validation et de 1,011 à 0,947 sur le test, la MAE de 0,778 à 0,721. Le système bat enfin la moyenne de l'utilisateur. C'est bien le gain attendu, le défaut de l'exercice 2 est corrigé. Par contre il ne fait pas de meilleures listes : en validation le NDCG baisse de 0,150 à 0,120, un écart bien supérieur au bruit entre parts (0,002 à 0,008), et changer le seuil ne le rattrape pas (0,126 avec 7, 0,070 avec 13). Sur le test, une seule mesure, le centré est aussi derrière : 0,191 contre 0,201 (précision 0,144 contre 0,152, rappel 0,144 contre 0,167). Sur le biais de popularité, le centrage n'aide pas non plus : les films proposés sont plus populaires (166 avis en médiane contre 151 sur le test) et moins variés (269 films différents contre 337). Pour comparer, le film médian du catalogue a 3 avis : les deux systèmes en sont loin, le seuil de voisins les y pousse.</w:t>
+        <w:t xml:space="preserve">Ce que ça donne. Le centrage améliore nettement la prédiction des notes : la RMSE passe de 1,031 à 0,971 en validation et de 1,011 à 0,947 sur le test, la MAE de 0,778 à 0,721. Le système bat enfin la moyenne de l'utilisateur. C'est bien le gain attendu, le défaut de l'exercice 2 est corrigé. Par contre il ne fait pas de meilleures listes : en validation le NDCG baisse de 0,150 à 0,120, un écart bien supérieur au bruit entre parts (0,002 à 0,008), et changer le seuil ne le rattrape pas (0,126 avec 7, 0,070 </w:t>
+      </w:r>
+      <w:r>
+        <w:t>avec 13). Sur le test, une seule mesure, le centré est aussi derrière : 0,191 contre 0,201 (précision 0,144 contre 0,152, rappel 0,144 contre 0,167). Sur le biais de popularité, le centrage n'aide pas non plus : les films proposés sont plus populaires (166 avis en médiane contre 151 sur le test) et moins variés (269 films différents contre 337). Pour comparer, le film médian du catalogue a 3 avis : les deux systèmes en sont loin, le seuil de voisins les y pousse.</w:t>
       </w:r>
     </w:p>
     <w:p>
@@ -2761,7 +2754,10 @@
     </w:p>
     <w:p>
       <w:r>
-        <w:t>En bonus, la troisième option : un système item-based. L'idée : « tu as aimé Le Parrain, et les gens qui ont aimé Le Parrain ont aussi aimé Les Affranchis ». On ne compare plus les utilisateurs entre eux mais les films : deux films sont similaires si les mêmes personnes les ont notés de la même façon (cosinus entre les colonnes de la matrice, avec le même 0 dans les cases vides). Pour recommander, on suit l'algorithme du cours : on prend les n films préférés de l'utilisateur, pour chacun ses k films les plus proches qu'il n'a pas vus, et chaque candidat reçoit la moyenne des notes de l'utilisateur sur ses favoris, pondérée par la similarité. On ne garde que les films ayant au moins min_avis avis, sinon leur similarité repose sur une poignée de personnes.</w:t>
+        <w:t>En bonus, la troisième option : un système item-based. L'idée : « tu as aimé Le Parrain, et les gens qui ont aimé Le Parrain ont aussi aimé Les Affranchis ». On ne compare plus les utilisateurs entre eux mais les films : deux films sont similaires si les mêmes personnes les ont notés de la même façon (cosinus entre les colonnes de la matrice, avec le même 0 dans les cases vides). Pour recommander, on suit l'algorithme du cours : on prend les n films préférés de l'utilisateur, pour chacun ses k films les plu</w:t>
+      </w:r>
+      <w:r>
+        <w:t>s proches qu'il n'a pas vus, et chaque candidat reçoit la moyenne des notes de l'utilisateur sur ses favoris, pondérée par la similarité. On ne garde que les films ayant au moins min_avis avis, sinon leur similarité repose sur une poignée de personnes.</w:t>
       </w:r>
     </w:p>
     <w:p>
@@ -2776,6 +2772,7 @@
     </w:p>
     <w:p>
       <w:r>
+        <w:lastRenderedPageBreak/>
         <w:t>Classement par somme, sans diviser : A obtient 4,7 et B obtient 0,5. Être relié à plusieurs favoris compte. Le NDCG monte à 0,153, au niveau du user-based, sans seuil de voisins. Le score sert seulement à ordonner, la note affichée reste la moyenne pondérée.</w:t>
       </w:r>
     </w:p>
@@ -2786,35 +2783,29 @@
     </w:p>
     <w:tbl>
       <w:tblPr>
-        <w:tblStyle w:val="TableGrid"/>
-        <w:tblW w:type="auto" w:w="0"/>
-        <w:tblLook w:firstColumn="1" w:firstRow="1" w:lastColumn="0" w:lastRow="0" w:noHBand="0" w:noVBand="1" w:val="04A0"/>
+        <w:tblStyle w:val="Grilledutableau"/>
+        <w:tblW w:w="0" w:type="auto"/>
+        <w:tblLook w:val="04A0" w:firstRow="1" w:lastRow="0" w:firstColumn="1" w:lastColumn="0" w:noHBand="0" w:noVBand="1"/>
       </w:tblPr>
       <w:tblGrid>
-        <w:gridCol w:w="1296"/>
-        <w:gridCol w:w="1296"/>
-        <w:gridCol w:w="1296"/>
-        <w:gridCol w:w="1296"/>
-        <w:gridCol w:w="1296"/>
-        <w:gridCol w:w="1296"/>
-        <w:gridCol w:w="1296"/>
+        <w:gridCol w:w="1359"/>
+        <w:gridCol w:w="1270"/>
+        <w:gridCol w:w="1287"/>
+        <w:gridCol w:w="1338"/>
+        <w:gridCol w:w="1338"/>
+        <w:gridCol w:w="1183"/>
+        <w:gridCol w:w="1287"/>
       </w:tblGrid>
       <w:tr>
         <w:tc>
           <w:tcPr>
-            <w:tcW w:type="dxa" w:w="1296"/>
-          </w:tcPr>
-          <w:p>
-            <w:r>
-              <w:rPr>
-                <w:b/>
-              </w:rPr>
-            </w:r>
-          </w:p>
-        </w:tc>
-        <w:tc>
-          <w:tcPr>
-            <w:tcW w:type="dxa" w:w="1296"/>
+            <w:tcW w:w="1296" w:type="dxa"/>
+          </w:tcPr>
+          <w:p/>
+        </w:tc>
+        <w:tc>
+          <w:tcPr>
+            <w:tcW w:w="1296" w:type="dxa"/>
           </w:tcPr>
           <w:p>
             <w:r>
@@ -2827,7 +2818,7 @@
         </w:tc>
         <w:tc>
           <w:tcPr>
-            <w:tcW w:type="dxa" w:w="1296"/>
+            <w:tcW w:w="1296" w:type="dxa"/>
           </w:tcPr>
           <w:p>
             <w:r>
@@ -2840,7 +2831,7 @@
         </w:tc>
         <w:tc>
           <w:tcPr>
-            <w:tcW w:type="dxa" w:w="1296"/>
+            <w:tcW w:w="1296" w:type="dxa"/>
           </w:tcPr>
           <w:p>
             <w:r>
@@ -2853,7 +2844,7 @@
         </w:tc>
         <w:tc>
           <w:tcPr>
-            <w:tcW w:type="dxa" w:w="1296"/>
+            <w:tcW w:w="1296" w:type="dxa"/>
           </w:tcPr>
           <w:p>
             <w:r>
@@ -2866,7 +2857,7 @@
         </w:tc>
         <w:tc>
           <w:tcPr>
-            <w:tcW w:type="dxa" w:w="1296"/>
+            <w:tcW w:w="1296" w:type="dxa"/>
           </w:tcPr>
           <w:p>
             <w:r>
@@ -2879,7 +2870,7 @@
         </w:tc>
         <w:tc>
           <w:tcPr>
-            <w:tcW w:type="dxa" w:w="1296"/>
+            <w:tcW w:w="1296" w:type="dxa"/>
           </w:tcPr>
           <w:p>
             <w:r>
@@ -2894,7 +2885,7 @@
       <w:tr>
         <w:tc>
           <w:tcPr>
-            <w:tcW w:type="dxa" w:w="1296"/>
+            <w:tcW w:w="1296" w:type="dxa"/>
           </w:tcPr>
           <w:p>
             <w:r>
@@ -2907,15 +2898,13 @@
         </w:tc>
         <w:tc>
           <w:tcPr>
-            <w:tcW w:type="dxa" w:w="1296"/>
-          </w:tcPr>
-          <w:p>
-            <w:r/>
-          </w:p>
-        </w:tc>
-        <w:tc>
-          <w:tcPr>
-            <w:tcW w:type="dxa" w:w="1296"/>
+            <w:tcW w:w="1296" w:type="dxa"/>
+          </w:tcPr>
+          <w:p/>
+        </w:tc>
+        <w:tc>
+          <w:tcPr>
+            <w:tcW w:w="1296" w:type="dxa"/>
           </w:tcPr>
           <w:p>
             <w:r>
@@ -2925,7 +2914,7 @@
         </w:tc>
         <w:tc>
           <w:tcPr>
-            <w:tcW w:type="dxa" w:w="1296"/>
+            <w:tcW w:w="1296" w:type="dxa"/>
           </w:tcPr>
           <w:p>
             <w:r>
@@ -2935,7 +2924,7 @@
         </w:tc>
         <w:tc>
           <w:tcPr>
-            <w:tcW w:type="dxa" w:w="1296"/>
+            <w:tcW w:w="1296" w:type="dxa"/>
           </w:tcPr>
           <w:p>
             <w:r>
@@ -2945,15 +2934,13 @@
         </w:tc>
         <w:tc>
           <w:tcPr>
-            <w:tcW w:type="dxa" w:w="1296"/>
-          </w:tcPr>
-          <w:p>
-            <w:r/>
-          </w:p>
-        </w:tc>
-        <w:tc>
-          <w:tcPr>
-            <w:tcW w:type="dxa" w:w="1296"/>
+            <w:tcW w:w="1296" w:type="dxa"/>
+          </w:tcPr>
+          <w:p/>
+        </w:tc>
+        <w:tc>
+          <w:tcPr>
+            <w:tcW w:w="1296" w:type="dxa"/>
           </w:tcPr>
           <w:p>
             <w:r>
@@ -2965,7 +2952,7 @@
       <w:tr>
         <w:tc>
           <w:tcPr>
-            <w:tcW w:type="dxa" w:w="1296"/>
+            <w:tcW w:w="1296" w:type="dxa"/>
           </w:tcPr>
           <w:p>
             <w:r>
@@ -2978,7 +2965,7 @@
         </w:tc>
         <w:tc>
           <w:tcPr>
-            <w:tcW w:type="dxa" w:w="1296"/>
+            <w:tcW w:w="1296" w:type="dxa"/>
           </w:tcPr>
           <w:p>
             <w:r>
@@ -2988,7 +2975,7 @@
         </w:tc>
         <w:tc>
           <w:tcPr>
-            <w:tcW w:type="dxa" w:w="1296"/>
+            <w:tcW w:w="1296" w:type="dxa"/>
           </w:tcPr>
           <w:p>
             <w:r>
@@ -2998,7 +2985,7 @@
         </w:tc>
         <w:tc>
           <w:tcPr>
-            <w:tcW w:type="dxa" w:w="1296"/>
+            <w:tcW w:w="1296" w:type="dxa"/>
           </w:tcPr>
           <w:p>
             <w:r>
@@ -3008,7 +2995,7 @@
         </w:tc>
         <w:tc>
           <w:tcPr>
-            <w:tcW w:type="dxa" w:w="1296"/>
+            <w:tcW w:w="1296" w:type="dxa"/>
           </w:tcPr>
           <w:p>
             <w:r>
@@ -3018,7 +3005,7 @@
         </w:tc>
         <w:tc>
           <w:tcPr>
-            <w:tcW w:type="dxa" w:w="1296"/>
+            <w:tcW w:w="1296" w:type="dxa"/>
           </w:tcPr>
           <w:p>
             <w:r>
@@ -3028,7 +3015,7 @@
         </w:tc>
         <w:tc>
           <w:tcPr>
-            <w:tcW w:type="dxa" w:w="1296"/>
+            <w:tcW w:w="1296" w:type="dxa"/>
           </w:tcPr>
           <w:p>
             <w:r>
@@ -3040,7 +3027,7 @@
       <w:tr>
         <w:tc>
           <w:tcPr>
-            <w:tcW w:type="dxa" w:w="1296"/>
+            <w:tcW w:w="1296" w:type="dxa"/>
           </w:tcPr>
           <w:p>
             <w:r>
@@ -3053,7 +3040,7 @@
         </w:tc>
         <w:tc>
           <w:tcPr>
-            <w:tcW w:type="dxa" w:w="1296"/>
+            <w:tcW w:w="1296" w:type="dxa"/>
           </w:tcPr>
           <w:p>
             <w:r>
@@ -3063,7 +3050,7 @@
         </w:tc>
         <w:tc>
           <w:tcPr>
-            <w:tcW w:type="dxa" w:w="1296"/>
+            <w:tcW w:w="1296" w:type="dxa"/>
           </w:tcPr>
           <w:p>
             <w:r>
@@ -3073,7 +3060,7 @@
         </w:tc>
         <w:tc>
           <w:tcPr>
-            <w:tcW w:type="dxa" w:w="1296"/>
+            <w:tcW w:w="1296" w:type="dxa"/>
           </w:tcPr>
           <w:p>
             <w:r>
@@ -3083,7 +3070,7 @@
         </w:tc>
         <w:tc>
           <w:tcPr>
-            <w:tcW w:type="dxa" w:w="1296"/>
+            <w:tcW w:w="1296" w:type="dxa"/>
           </w:tcPr>
           <w:p>
             <w:r>
@@ -3093,25 +3080,21 @@
         </w:tc>
         <w:tc>
           <w:tcPr>
-            <w:tcW w:type="dxa" w:w="1296"/>
-          </w:tcPr>
-          <w:p>
-            <w:r/>
-          </w:p>
-        </w:tc>
-        <w:tc>
-          <w:tcPr>
-            <w:tcW w:type="dxa" w:w="1296"/>
-          </w:tcPr>
-          <w:p>
-            <w:r/>
-          </w:p>
+            <w:tcW w:w="1296" w:type="dxa"/>
+          </w:tcPr>
+          <w:p/>
+        </w:tc>
+        <w:tc>
+          <w:tcPr>
+            <w:tcW w:w="1296" w:type="dxa"/>
+          </w:tcPr>
+          <w:p/>
         </w:tc>
       </w:tr>
       <w:tr>
         <w:tc>
           <w:tcPr>
-            <w:tcW w:type="dxa" w:w="1296"/>
+            <w:tcW w:w="1296" w:type="dxa"/>
           </w:tcPr>
           <w:p>
             <w:r>
@@ -3124,7 +3107,7 @@
         </w:tc>
         <w:tc>
           <w:tcPr>
-            <w:tcW w:type="dxa" w:w="1296"/>
+            <w:tcW w:w="1296" w:type="dxa"/>
           </w:tcPr>
           <w:p>
             <w:r>
@@ -3134,7 +3117,7 @@
         </w:tc>
         <w:tc>
           <w:tcPr>
-            <w:tcW w:type="dxa" w:w="1296"/>
+            <w:tcW w:w="1296" w:type="dxa"/>
           </w:tcPr>
           <w:p>
             <w:r>
@@ -3144,7 +3127,7 @@
         </w:tc>
         <w:tc>
           <w:tcPr>
-            <w:tcW w:type="dxa" w:w="1296"/>
+            <w:tcW w:w="1296" w:type="dxa"/>
           </w:tcPr>
           <w:p>
             <w:r>
@@ -3154,7 +3137,7 @@
         </w:tc>
         <w:tc>
           <w:tcPr>
-            <w:tcW w:type="dxa" w:w="1296"/>
+            <w:tcW w:w="1296" w:type="dxa"/>
           </w:tcPr>
           <w:p>
             <w:r>
@@ -3164,7 +3147,7 @@
         </w:tc>
         <w:tc>
           <w:tcPr>
-            <w:tcW w:type="dxa" w:w="1296"/>
+            <w:tcW w:w="1296" w:type="dxa"/>
           </w:tcPr>
           <w:p>
             <w:r>
@@ -3174,7 +3157,7 @@
         </w:tc>
         <w:tc>
           <w:tcPr>
-            <w:tcW w:type="dxa" w:w="1296"/>
+            <w:tcW w:w="1296" w:type="dxa"/>
           </w:tcPr>
           <w:p>
             <w:r>
@@ -3187,32 +3170,43 @@
     <w:p/>
     <w:p>
       <w:r>
-        <w:t>L'item-based prédit mieux les notes parce qu'il part des notes de l'utilisateur lui-même (son niveau est conservé sans centrage) et que les similarités entre films sont plus fiables : un film populaire est noté par des centaines de personnes, deux utilisateurs n'ont que quelques dizaines de films en commun. Avec le classement par somme, il fait aussi bien que le user-based en validation et mieux sur le test (0,249 contre 0,201), avec des films moins populaires (128 avis en médiane contre 151) et plus de films différents (410 contre 337). Le user-based reste le système du TP, construit et réglé dans les exercices précédents, et l'item-based est notre première piste d'amélioration.</w:t>
-      </w:r>
-    </w:p>
-    <w:p>
-      <w:r>
-        <w:t>Les deux figures déposées. La première montre ce que le centrage change dans les similarités entre utilisateurs (les 224 785 paires du train). Sans centrage, toutes les similarités sont positives et tassées entre 0 et 0,2 (médiane 0,06), avec 17 % de paires exactement à 0 qui n'ont aucun film en commun. Avec centrage, la répartition se recentre sur 0 et 29 % des paires passent en négatif : ce sont les utilisateurs aux goûts opposés, qu'on ramène à 0 et qui ne peuvent plus être voisins. C'est pour ça que les voisins changent, et donc les listes.</w:t>
-      </w:r>
-    </w:p>
-    <w:p>
-      <w:r>
+        <w:t>L'item-based prédit mieux les notes parce qu'il part des notes de l'utilisateur lui-même (son niveau est conservé sans centrage) et que les similarités entre films sont plus fiables : un film populaire est noté par des centaines de personnes, deux utilisateurs n'ont que quelques dizaines de films en commun. Avec le classement par somme, il fait aussi bien que le user-based en validation et mieux sur le test (0,249 contre 0,201), avec des films moins populaires (128 avis en médiane contre 151) et plus de fil</w:t>
+      </w:r>
+      <w:r>
+        <w:t>ms différents (410 contre 337). Le user-based reste le système du TP, construit et réglé dans les exercices précédents, et l'item-based est notre première piste d'amélioration.</w:t>
+      </w:r>
+    </w:p>
+    <w:p>
+      <w:r>
+        <w:t>Les deux figures déposées. La première montre ce que le centrage change dans les similarités entre utilisateurs (les 224 785 paires du train). Sans centrage, toutes les similarités sont positives et tassées entre 0 et 0,2 (médiane 0,06), avec 17 % de paires exactement à 0 qui n'ont aucun film en commun. Avec centrage, la répartition se recentre sur 0 et 29 % des paires passent en négatif : ce sont les utilisateurs aux goûts opposés, qu'on ramène à 0 et qui ne peuvent plus être voisins. C'est pour ça que les</w:t>
+      </w:r>
+      <w:r>
+        <w:t xml:space="preserve"> voisins changent, et donc les listes.</w:t>
+      </w:r>
+    </w:p>
+    <w:p>
+      <w:r>
+        <w:rPr>
+          <w:noProof/>
+        </w:rPr>
+        <w:lastRenderedPageBreak/>
         <w:drawing>
-          <wp:inline xmlns:a="http://schemas.openxmlformats.org/drawingml/2006/main" xmlns:pic="http://schemas.openxmlformats.org/drawingml/2006/picture">
+          <wp:inline distT="0" distB="0" distL="0" distR="0" wp14:anchorId="6B9F2E46" wp14:editId="54BF2F96">
             <wp:extent cx="5760000" cy="1955229"/>
+            <wp:effectExtent l="0" t="0" r="0" b="0"/>
             <wp:docPr id="3" name="Picture 3"/>
             <wp:cNvGraphicFramePr>
-              <a:graphicFrameLocks noChangeAspect="1"/>
+              <a:graphicFrameLocks xmlns:a="http://schemas.openxmlformats.org/drawingml/2006/main" noChangeAspect="1"/>
             </wp:cNvGraphicFramePr>
-            <a:graphic>
+            <a:graphic xmlns:a="http://schemas.openxmlformats.org/drawingml/2006/main">
               <a:graphicData uri="http://schemas.openxmlformats.org/drawingml/2006/picture">
-                <pic:pic>
+                <pic:pic xmlns:pic="http://schemas.openxmlformats.org/drawingml/2006/picture">
                   <pic:nvPicPr>
                     <pic:cNvPr id="0" name="ex4_q7_fig1_centrage_similarites.png"/>
                     <pic:cNvPicPr/>
                   </pic:nvPicPr>
                   <pic:blipFill>
-                    <a:blip r:embed="rId31"/>
+                    <a:blip r:embed="rId15"/>
                     <a:stretch>
                       <a:fillRect/>
                     </a:stretch>
@@ -3222,7 +3216,9 @@
                       <a:off x="0" y="0"/>
                       <a:ext cx="5760000" cy="1955229"/>
                     </a:xfrm>
-                    <a:prstGeom prst="rect"/>
+                    <a:prstGeom prst="rect">
+                      <a:avLst/>
+                    </a:prstGeom>
                   </pic:spPr>
                 </pic:pic>
               </a:graphicData>
@@ -3233,27 +3229,34 @@
     </w:p>
     <w:p>
       <w:r>
-        <w:t>La seconde compare le repère « films les plus notés » et les quatre systèmes, mesurés de la même façon en validation croisée : à gauche le NDCG@10 (plus haut = mieux), au milieu la RMSE (plus bas = mieux), à droite la popularité médiane des films proposés, notre mesure du biais de popularité (plus bas = moins de biais, la ligne pointillée est le film médian du catalogue, 3 avis). On y voit les constats en un coup d'œil : le user-based brut et l'item-based par somme dépassent le repère sur le top 10, le centré est juste au-dessus, le centrage et l'item-based améliorent la RMSE, et l'item-based par somme est celui qui propose les films les moins populaires parmi les systèmes qui font de bonnes listes. Le repère, lui, propose les films les plus populaires de tous (160 avis en médiane) et seulement 38 films différents pour 671 utilisateurs.</w:t>
-      </w:r>
-    </w:p>
-    <w:p>
-      <w:r>
+        <w:t>La seconde compare le repère « films les plus notés » et les quatre systèmes, mesurés de la même façon en validation croisée : à gauche le NDCG@10 (plus haut = mieux), au milieu la RMSE (plus bas = mieux), à droite la popularité médiane des films proposés, notre mesure du biais de popularité (plus bas = moins de biais, la ligne pointillée est le film médian du catalogue, 3 avis). On y voit les constats en un coup d'œil : le user-based brut et l'item-based par somme dépassent le repère sur le top 10, le cent</w:t>
+      </w:r>
+      <w:r>
+        <w:t>ré est juste au-dessus, le centrage et l'item-based améliorent la RMSE, et l'item-based par somme est celui qui propose les films les moins populaires parmi les systèmes qui font de bonnes listes. Le repère, lui, propose les films les plus populaires de tous (160 avis en médiane) et seulement 38 films différents pour 671 utilisateurs.</w:t>
+      </w:r>
+    </w:p>
+    <w:p>
+      <w:r>
+        <w:rPr>
+          <w:noProof/>
+        </w:rPr>
         <w:drawing>
-          <wp:inline xmlns:a="http://schemas.openxmlformats.org/drawingml/2006/main" xmlns:pic="http://schemas.openxmlformats.org/drawingml/2006/picture">
+          <wp:inline distT="0" distB="0" distL="0" distR="0" wp14:anchorId="45916695" wp14:editId="76193AD7">
             <wp:extent cx="5760000" cy="1604347"/>
+            <wp:effectExtent l="0" t="0" r="0" b="0"/>
             <wp:docPr id="4" name="Picture 4"/>
             <wp:cNvGraphicFramePr>
-              <a:graphicFrameLocks noChangeAspect="1"/>
+              <a:graphicFrameLocks xmlns:a="http://schemas.openxmlformats.org/drawingml/2006/main" noChangeAspect="1"/>
             </wp:cNvGraphicFramePr>
-            <a:graphic>
+            <a:graphic xmlns:a="http://schemas.openxmlformats.org/drawingml/2006/main">
               <a:graphicData uri="http://schemas.openxmlformats.org/drawingml/2006/picture">
-                <pic:pic>
+                <pic:pic xmlns:pic="http://schemas.openxmlformats.org/drawingml/2006/picture">
                   <pic:nvPicPr>
                     <pic:cNvPr id="0" name="ex4_q7_fig2_variantes_validation.png"/>
                     <pic:cNvPicPr/>
                   </pic:nvPicPr>
                   <pic:blipFill>
-                    <a:blip r:embed="rId32"/>
+                    <a:blip r:embed="rId16"/>
                     <a:stretch>
                       <a:fillRect/>
                     </a:stretch>
@@ -3263,7 +3266,9 @@
                       <a:off x="0" y="0"/>
                       <a:ext cx="5760000" cy="1604347"/>
                     </a:xfrm>
-                    <a:prstGeom prst="rect"/>
+                    <a:prstGeom prst="rect">
+                      <a:avLst/>
+                    </a:prstGeom>
                   </pic:spPr>
                 </pic:pic>
               </a:graphicData>
@@ -3274,7 +3279,7 @@
     </w:p>
     <w:p>
       <w:pPr>
-        <w:pStyle w:val="Heading2"/>
+        <w:pStyle w:val="Titre2"/>
       </w:pPr>
       <w:r>
         <w:t>Analyses ultérieures</w:t>
@@ -3300,33 +3305,27 @@
     </w:p>
     <w:tbl>
       <w:tblPr>
-        <w:tblStyle w:val="TableGrid"/>
-        <w:tblW w:type="auto" w:w="0"/>
-        <w:tblLook w:firstColumn="1" w:firstRow="1" w:lastColumn="0" w:lastRow="0" w:noHBand="0" w:noVBand="1" w:val="04A0"/>
+        <w:tblStyle w:val="Grilledutableau"/>
+        <w:tblW w:w="0" w:type="auto"/>
+        <w:tblLook w:val="04A0" w:firstRow="1" w:lastRow="0" w:firstColumn="1" w:lastColumn="0" w:noHBand="0" w:noVBand="1"/>
       </w:tblPr>
       <w:tblGrid>
-        <w:gridCol w:w="1814"/>
-        <w:gridCol w:w="1814"/>
-        <w:gridCol w:w="1814"/>
-        <w:gridCol w:w="1814"/>
-        <w:gridCol w:w="1814"/>
+        <w:gridCol w:w="2012"/>
+        <w:gridCol w:w="1776"/>
+        <w:gridCol w:w="1767"/>
+        <w:gridCol w:w="1760"/>
+        <w:gridCol w:w="1747"/>
       </w:tblGrid>
       <w:tr>
         <w:tc>
           <w:tcPr>
-            <w:tcW w:type="dxa" w:w="1814"/>
-          </w:tcPr>
-          <w:p>
-            <w:r>
-              <w:rPr>
-                <w:b/>
-              </w:rPr>
-            </w:r>
-          </w:p>
-        </w:tc>
-        <w:tc>
-          <w:tcPr>
-            <w:tcW w:type="dxa" w:w="1814"/>
+            <w:tcW w:w="1814" w:type="dxa"/>
+          </w:tcPr>
+          <w:p/>
+        </w:tc>
+        <w:tc>
+          <w:tcPr>
+            <w:tcW w:w="1814" w:type="dxa"/>
           </w:tcPr>
           <w:p>
             <w:r>
@@ -3339,7 +3338,7 @@
         </w:tc>
         <w:tc>
           <w:tcPr>
-            <w:tcW w:type="dxa" w:w="1814"/>
+            <w:tcW w:w="1814" w:type="dxa"/>
           </w:tcPr>
           <w:p>
             <w:r>
@@ -3352,7 +3351,7 @@
         </w:tc>
         <w:tc>
           <w:tcPr>
-            <w:tcW w:type="dxa" w:w="1814"/>
+            <w:tcW w:w="1814" w:type="dxa"/>
           </w:tcPr>
           <w:p>
             <w:r>
@@ -3365,7 +3364,7 @@
         </w:tc>
         <w:tc>
           <w:tcPr>
-            <w:tcW w:type="dxa" w:w="1814"/>
+            <w:tcW w:w="1814" w:type="dxa"/>
           </w:tcPr>
           <w:p>
             <w:r>
@@ -3380,20 +3379,21 @@
       <w:tr>
         <w:tc>
           <w:tcPr>
-            <w:tcW w:type="dxa" w:w="1814"/>
-          </w:tcPr>
-          <w:p>
-            <w:r>
-              <w:rPr>
-                <w:b/>
-              </w:rPr>
+            <w:tcW w:w="1814" w:type="dxa"/>
+          </w:tcPr>
+          <w:p>
+            <w:r>
+              <w:rPr>
+                <w:b/>
+              </w:rPr>
+              <w:lastRenderedPageBreak/>
               <w:t>Popularité médiane (nombre d'avis)</w:t>
             </w:r>
           </w:p>
         </w:tc>
         <w:tc>
           <w:tcPr>
-            <w:tcW w:type="dxa" w:w="1814"/>
+            <w:tcW w:w="1814" w:type="dxa"/>
           </w:tcPr>
           <w:p>
             <w:r>
@@ -3403,7 +3403,7 @@
         </w:tc>
         <w:tc>
           <w:tcPr>
-            <w:tcW w:type="dxa" w:w="1814"/>
+            <w:tcW w:w="1814" w:type="dxa"/>
           </w:tcPr>
           <w:p>
             <w:r>
@@ -3413,7 +3413,7 @@
         </w:tc>
         <w:tc>
           <w:tcPr>
-            <w:tcW w:type="dxa" w:w="1814"/>
+            <w:tcW w:w="1814" w:type="dxa"/>
           </w:tcPr>
           <w:p>
             <w:r>
@@ -3423,7 +3423,7 @@
         </w:tc>
         <w:tc>
           <w:tcPr>
-            <w:tcW w:type="dxa" w:w="1814"/>
+            <w:tcW w:w="1814" w:type="dxa"/>
           </w:tcPr>
           <w:p>
             <w:r>
@@ -3435,7 +3435,7 @@
       <w:tr>
         <w:tc>
           <w:tcPr>
-            <w:tcW w:type="dxa" w:w="1814"/>
+            <w:tcW w:w="1814" w:type="dxa"/>
           </w:tcPr>
           <w:p>
             <w:r>
@@ -3448,15 +3448,13 @@
         </w:tc>
         <w:tc>
           <w:tcPr>
-            <w:tcW w:type="dxa" w:w="1814"/>
-          </w:tcPr>
-          <w:p>
-            <w:r/>
-          </w:p>
-        </w:tc>
-        <w:tc>
-          <w:tcPr>
-            <w:tcW w:type="dxa" w:w="1814"/>
+            <w:tcW w:w="1814" w:type="dxa"/>
+          </w:tcPr>
+          <w:p/>
+        </w:tc>
+        <w:tc>
+          <w:tcPr>
+            <w:tcW w:w="1814" w:type="dxa"/>
           </w:tcPr>
           <w:p>
             <w:r>
@@ -3466,7 +3464,7 @@
         </w:tc>
         <w:tc>
           <w:tcPr>
-            <w:tcW w:type="dxa" w:w="1814"/>
+            <w:tcW w:w="1814" w:type="dxa"/>
           </w:tcPr>
           <w:p>
             <w:r>
@@ -3476,7 +3474,7 @@
         </w:tc>
         <w:tc>
           <w:tcPr>
-            <w:tcW w:type="dxa" w:w="1814"/>
+            <w:tcW w:w="1814" w:type="dxa"/>
           </w:tcPr>
           <w:p>
             <w:r>
@@ -3488,7 +3486,7 @@
       <w:tr>
         <w:tc>
           <w:tcPr>
-            <w:tcW w:type="dxa" w:w="1814"/>
+            <w:tcW w:w="1814" w:type="dxa"/>
           </w:tcPr>
           <w:p>
             <w:r>
@@ -3501,7 +3499,7 @@
         </w:tc>
         <w:tc>
           <w:tcPr>
-            <w:tcW w:type="dxa" w:w="1814"/>
+            <w:tcW w:w="1814" w:type="dxa"/>
           </w:tcPr>
           <w:p>
             <w:r>
@@ -3511,7 +3509,7 @@
         </w:tc>
         <w:tc>
           <w:tcPr>
-            <w:tcW w:type="dxa" w:w="1814"/>
+            <w:tcW w:w="1814" w:type="dxa"/>
           </w:tcPr>
           <w:p>
             <w:r>
@@ -3521,7 +3519,7 @@
         </w:tc>
         <w:tc>
           <w:tcPr>
-            <w:tcW w:type="dxa" w:w="1814"/>
+            <w:tcW w:w="1814" w:type="dxa"/>
           </w:tcPr>
           <w:p>
             <w:r>
@@ -3531,7 +3529,7 @@
         </w:tc>
         <w:tc>
           <w:tcPr>
-            <w:tcW w:type="dxa" w:w="1814"/>
+            <w:tcW w:w="1814" w:type="dxa"/>
           </w:tcPr>
           <w:p>
             <w:r>
@@ -3584,32 +3582,46 @@
     </w:p>
     <w:p>
       <w:r>
-        <w:t>Ce qu'on a fait, et ce qu'on ferait. On a déjà tenu compte de ce biais au moment de choisir le réglage : à qualité égale, on a pris le plus varié, (30, 10) plutôt que (50, 15), et sur le test ça donne 337 films différents au lieu de 249 et une popularité médiane de 151 au lieu de 159. Ça ne suffit pas : le biais reste massif, parce que le seuil de voisins, quel qu'il soit, filtre par la popularité. Aller plus loin sur le seuil coûte de la qualité : (25, 8) propose 397 films différents et (20, 7) 427, avec des films moins populaires (138 et 133 avis en médiane), pour un NDCG un peu plus bas en validation (0,146 et 0,143 contre 0,150). Pour aller plus loin sans casser la qualité, deux pistes mesurées ou simples : l'item-based du bonus, qui fait mieux en NDCG avec des films moins populaires (128 avis en médiane, 410 films différents), et réserver une place ou deux de la liste à une suggestion plus inattendue, parmi les films moins vus que les voisins ont aimés, pour jouer sur la sérendipité dont parle le cours. Le biais de popularité n'est donc pas une fatalité du système, c'est un réglage qu'on assume pour ce TP et qu'on corrigerait en production.</w:t>
-      </w:r>
-    </w:p>
-    <w:p>
-      <w:r>
-        <w:t>La figure déposée compare, par tranche de popularité, la répartition des films du catalogue (gris) et celle des films proposés par le système retenu (bleu), l'item-based (orange) et le repère des films les plus notés (noir), sur le test. En abscisse, le nombre d'avis du film en train, par tranche. En ordonnée, la part en pourcentage. Le catalogue est presque entièrement à gauche, les recommandations presque entièrement à droite. On voit aussi que l'item-based propose un peu plus de films à 10-49 avis (9 % contre 6 %) et moins de films à 200 avis et plus (14 % contre 21 %) : il est moins biaisé, sans rejoindre le catalogue.</w:t>
-      </w:r>
-    </w:p>
-    <w:p>
-      <w:r>
+        <w:t>Ce qu'on a fait, et ce qu'on ferait. On a déjà tenu compte de ce biais au moment de choisir le réglage : à qualité égale, on a pris le plus varié, (30, 10) plutôt que (50, 15), et sur le test ça donne 337 films différents au lieu de 249 et une popularité médiane de 151 au lieu de 159. Ça ne suffit pas : le biais reste massif, parce que le seuil de voisins, quel qu'il soit, filtre par la popularité. Aller plus loin sur le seuil coûte de la qualité : (25, 8) propose 397 films différents et (20, 7) 427, avec d</w:t>
+      </w:r>
+      <w:r>
+        <w:t xml:space="preserve">es films moins populaires (138 et 133 avis en médiane), pour un NDCG un peu plus bas en validation (0,146 et 0,143 contre 0,150). Pour aller plus loin sans casser la qualité, deux pistes mesurées ou simples : l'item-based du bonus, qui fait mieux en NDCG avec des films moins populaires (128 avis en médiane, 410 films différents), et réserver une place ou deux de la liste à une suggestion plus inattendue, parmi les films moins vus que les voisins ont aimés, pour jouer sur la sérendipité dont parle le cours. </w:t>
+      </w:r>
+      <w:r>
+        <w:t>Le biais de popularité n'est donc pas une fatalité du système, c'est un réglage qu'on assume pour ce TP et qu'on corrigerait en production.</w:t>
+      </w:r>
+    </w:p>
+    <w:p>
+      <w:r>
+        <w:t xml:space="preserve">La figure déposée compare, par tranche de popularité, la répartition des films du catalogue (gris) et celle des films proposés par le système retenu (bleu), l'item-based (orange) et le repère des films les plus notés (noir), sur le test. En abscisse, le nombre d'avis du film en train, par tranche. En ordonnée, la part en pourcentage. Le catalogue est presque entièrement à gauche, les recommandations presque entièrement à droite. On voit aussi que l'item-based </w:t>
+      </w:r>
+      <w:r>
+        <w:lastRenderedPageBreak/>
+        <w:t>propose un peu plus de films à 10-49 avis (9 % contre 6 %) et moins de films à 200 avis et plus (14 % contre 21 %) : il est moins biaisé, sans rejoindre le catalogue.</w:t>
+      </w:r>
+    </w:p>
+    <w:p>
+      <w:r>
+        <w:rPr>
+          <w:noProof/>
+        </w:rPr>
         <w:drawing>
-          <wp:inline xmlns:a="http://schemas.openxmlformats.org/drawingml/2006/main" xmlns:pic="http://schemas.openxmlformats.org/drawingml/2006/picture">
+          <wp:inline distT="0" distB="0" distL="0" distR="0" wp14:anchorId="40F34CB5" wp14:editId="50D2864F">
             <wp:extent cx="5760000" cy="2524045"/>
+            <wp:effectExtent l="0" t="0" r="0" b="0"/>
             <wp:docPr id="5" name="Picture 5"/>
             <wp:cNvGraphicFramePr>
-              <a:graphicFrameLocks noChangeAspect="1"/>
+              <a:graphicFrameLocks xmlns:a="http://schemas.openxmlformats.org/drawingml/2006/main" noChangeAspect="1"/>
             </wp:cNvGraphicFramePr>
-            <a:graphic>
+            <a:graphic xmlns:a="http://schemas.openxmlformats.org/drawingml/2006/main">
               <a:graphicData uri="http://schemas.openxmlformats.org/drawingml/2006/picture">
-                <pic:pic>
+                <pic:pic xmlns:pic="http://schemas.openxmlformats.org/drawingml/2006/picture">
                   <pic:nvPicPr>
                     <pic:cNvPr id="0" name="ex5_q8_popularite.png"/>
                     <pic:cNvPicPr/>
                   </pic:nvPicPr>
                   <pic:blipFill>
-                    <a:blip r:embed="rId33"/>
+                    <a:blip r:embed="rId17"/>
                     <a:stretch>
                       <a:fillRect/>
                     </a:stretch>
@@ -3619,7 +3631,9 @@
                       <a:off x="0" y="0"/>
                       <a:ext cx="5760000" cy="2524045"/>
                     </a:xfrm>
-                    <a:prstGeom prst="rect"/>
+                    <a:prstGeom prst="rect">
+                      <a:avLst/>
+                    </a:prstGeom>
                   </pic:spPr>
                 </pic:pic>
               </a:graphicData>
@@ -3638,38 +3652,35 @@
     </w:p>
     <w:p>
       <w:r>
-        <w:t>Comment on mesure. La diversité d'une liste, c'est : est-ce que les dix films proposés se ressemblent tous, ou couvrent des choses différentes ? On l'a mesurée avec les genres du catalogue (chaque film a une liste de genres, comme Crime, Drama, Thriller). Deux mesures par liste : le nombre de genres différents couverts par les 10 films, et la part des 45 paires de films de la liste qui n'ont aucun genre en commun (0 = tous les films se ressemblent, 1 = ils sont tous différents). Pour savoir si un chiffre est bon, on mesure la même chose sur les dix films préférés de chaque utilisateur : ça donne la variété de ses propres goûts.</w:t>
+        <w:t>Comment on mesure. La diversité d'une liste, c'est : est-ce que les dix films proposés se ressemblent tous, ou couvrent des choses différentes ? On l'a mesurée avec les genres du catalogue (chaque film a une liste de genres, comme Crime, Drama, Thriller). Deux mesures par liste : le nombre de genres différents couverts par les 10 films, et la part des 45 paires de films de la liste qui n'ont aucun genre en commun (0 = tous les films se ressemblent, 1 = ils sont tous différents). Pour savoir si un chiffre es</w:t>
+      </w:r>
+      <w:r>
+        <w:t>t bon, on mesure la même chose sur les dix films préférés de chaque utilisateur : ça donne la variété de ses propres goûts.</w:t>
       </w:r>
     </w:p>
     <w:tbl>
       <w:tblPr>
-        <w:tblStyle w:val="TableGrid"/>
-        <w:tblW w:type="auto" w:w="0"/>
-        <w:tblLook w:firstColumn="1" w:firstRow="1" w:lastColumn="0" w:lastRow="0" w:noHBand="0" w:noVBand="1" w:val="04A0"/>
+        <w:tblStyle w:val="Grilledutableau"/>
+        <w:tblW w:w="0" w:type="auto"/>
+        <w:tblLook w:val="04A0" w:firstRow="1" w:lastRow="0" w:firstColumn="1" w:lastColumn="0" w:noHBand="0" w:noVBand="1"/>
       </w:tblPr>
       <w:tblGrid>
-        <w:gridCol w:w="1814"/>
-        <w:gridCol w:w="1814"/>
-        <w:gridCol w:w="1814"/>
-        <w:gridCol w:w="1814"/>
-        <w:gridCol w:w="1814"/>
+        <w:gridCol w:w="1813"/>
+        <w:gridCol w:w="1813"/>
+        <w:gridCol w:w="1812"/>
+        <w:gridCol w:w="1812"/>
+        <w:gridCol w:w="1812"/>
       </w:tblGrid>
       <w:tr>
         <w:tc>
           <w:tcPr>
-            <w:tcW w:type="dxa" w:w="1814"/>
-          </w:tcPr>
-          <w:p>
-            <w:r>
-              <w:rPr>
-                <w:b/>
-              </w:rPr>
-            </w:r>
-          </w:p>
-        </w:tc>
-        <w:tc>
-          <w:tcPr>
-            <w:tcW w:type="dxa" w:w="1814"/>
+            <w:tcW w:w="1814" w:type="dxa"/>
+          </w:tcPr>
+          <w:p/>
+        </w:tc>
+        <w:tc>
+          <w:tcPr>
+            <w:tcW w:w="1814" w:type="dxa"/>
           </w:tcPr>
           <w:p>
             <w:r>
@@ -3682,7 +3693,7 @@
         </w:tc>
         <w:tc>
           <w:tcPr>
-            <w:tcW w:type="dxa" w:w="1814"/>
+            <w:tcW w:w="1814" w:type="dxa"/>
           </w:tcPr>
           <w:p>
             <w:r>
@@ -3695,7 +3706,7 @@
         </w:tc>
         <w:tc>
           <w:tcPr>
-            <w:tcW w:type="dxa" w:w="1814"/>
+            <w:tcW w:w="1814" w:type="dxa"/>
           </w:tcPr>
           <w:p>
             <w:r>
@@ -3708,7 +3719,7 @@
         </w:tc>
         <w:tc>
           <w:tcPr>
-            <w:tcW w:type="dxa" w:w="1814"/>
+            <w:tcW w:w="1814" w:type="dxa"/>
           </w:tcPr>
           <w:p>
             <w:r>
@@ -3723,7 +3734,7 @@
       <w:tr>
         <w:tc>
           <w:tcPr>
-            <w:tcW w:type="dxa" w:w="1814"/>
+            <w:tcW w:w="1814" w:type="dxa"/>
           </w:tcPr>
           <w:p>
             <w:r>
@@ -3736,7 +3747,7 @@
         </w:tc>
         <w:tc>
           <w:tcPr>
-            <w:tcW w:type="dxa" w:w="1814"/>
+            <w:tcW w:w="1814" w:type="dxa"/>
           </w:tcPr>
           <w:p>
             <w:r>
@@ -3746,7 +3757,7 @@
         </w:tc>
         <w:tc>
           <w:tcPr>
-            <w:tcW w:type="dxa" w:w="1814"/>
+            <w:tcW w:w="1814" w:type="dxa"/>
           </w:tcPr>
           <w:p>
             <w:r>
@@ -3756,7 +3767,7 @@
         </w:tc>
         <w:tc>
           <w:tcPr>
-            <w:tcW w:type="dxa" w:w="1814"/>
+            <w:tcW w:w="1814" w:type="dxa"/>
           </w:tcPr>
           <w:p>
             <w:r>
@@ -3766,7 +3777,7 @@
         </w:tc>
         <w:tc>
           <w:tcPr>
-            <w:tcW w:type="dxa" w:w="1814"/>
+            <w:tcW w:w="1814" w:type="dxa"/>
           </w:tcPr>
           <w:p>
             <w:r>
@@ -3778,7 +3789,7 @@
       <w:tr>
         <w:tc>
           <w:tcPr>
-            <w:tcW w:type="dxa" w:w="1814"/>
+            <w:tcW w:w="1814" w:type="dxa"/>
           </w:tcPr>
           <w:p>
             <w:r>
@@ -3791,7 +3802,7 @@
         </w:tc>
         <w:tc>
           <w:tcPr>
-            <w:tcW w:type="dxa" w:w="1814"/>
+            <w:tcW w:w="1814" w:type="dxa"/>
           </w:tcPr>
           <w:p>
             <w:r>
@@ -3801,7 +3812,7 @@
         </w:tc>
         <w:tc>
           <w:tcPr>
-            <w:tcW w:type="dxa" w:w="1814"/>
+            <w:tcW w:w="1814" w:type="dxa"/>
           </w:tcPr>
           <w:p>
             <w:r>
@@ -3811,7 +3822,7 @@
         </w:tc>
         <w:tc>
           <w:tcPr>
-            <w:tcW w:type="dxa" w:w="1814"/>
+            <w:tcW w:w="1814" w:type="dxa"/>
           </w:tcPr>
           <w:p>
             <w:r>
@@ -3821,7 +3832,7 @@
         </w:tc>
         <w:tc>
           <w:tcPr>
-            <w:tcW w:type="dxa" w:w="1814"/>
+            <w:tcW w:w="1814" w:type="dxa"/>
           </w:tcPr>
           <w:p>
             <w:r>
@@ -3839,23 +3850,27 @@
     </w:p>
     <w:p>
       <w:r>
-        <w:t>Mais à l'échelle des thèmes, c'est plus concentré. L'exemple de l'utilisateur 60 le montre. Ses préférés vont du Parrain à Castle in the Sky en passant par Gattaca et La vie est belle. Son top 10 est cohérent avec ce profil, mais sept films sur dix sont des polars (Crime ou Thriller) et huit sur dix des drames : Pulp Fiction, The Usual Suspects, The Dark Knight, The Big Lebowski, Les Évadés, GoodFellas, City of God. Les genres sont variés sur le papier, le ton l'est moins. C'est la conséquence du seuil de voisins : il ne laisse passer que les classiques que beaucoup de voisins ont vus, et les classiques aimés par les amateurs de cinéma d'auteur sont souvent des polars.</w:t>
+        <w:t xml:space="preserve">Mais à l'échelle des thèmes, c'est plus concentré. L'exemple de l'utilisateur 60 le montre. Ses préférés vont du Parrain à Castle in the Sky en passant par Gattaca et La vie est belle. Son top 10 est cohérent avec ce profil, mais sept films sur dix sont des polars (Crime ou Thriller) et </w:t>
+      </w:r>
+      <w:r>
+        <w:lastRenderedPageBreak/>
+        <w:t>huit sur dix des drames : Pulp Fiction, The Usual Suspects, The Dark Knight, The Big Lebowski, Les Évadés, GoodFellas, City of God. Les genres sont variés sur le papier, le ton l'est moins. C'est la conséquence du seuil de voisins : il ne laisse passer que les classiques que beaucoup de voisins ont vus, et les classiques aimés par les amateurs de cinéma d'auteur sont souvent des polars.</w:t>
       </w:r>
     </w:p>
     <w:tbl>
       <w:tblPr>
-        <w:tblStyle w:val="TableGrid"/>
-        <w:tblW w:type="auto" w:w="0"/>
-        <w:tblLook w:firstColumn="1" w:firstRow="1" w:lastColumn="0" w:lastRow="0" w:noHBand="0" w:noVBand="1" w:val="04A0"/>
+        <w:tblStyle w:val="Grilledutableau"/>
+        <w:tblW w:w="0" w:type="auto"/>
+        <w:tblLook w:val="04A0" w:firstRow="1" w:lastRow="0" w:firstColumn="1" w:lastColumn="0" w:noHBand="0" w:noVBand="1"/>
       </w:tblPr>
       <w:tblGrid>
-        <w:gridCol w:w="4536"/>
-        <w:gridCol w:w="4536"/>
+        <w:gridCol w:w="4531"/>
+        <w:gridCol w:w="4531"/>
       </w:tblGrid>
       <w:tr>
         <w:tc>
           <w:tcPr>
-            <w:tcW w:type="dxa" w:w="4536"/>
+            <w:tcW w:w="4536" w:type="dxa"/>
           </w:tcPr>
           <w:p>
             <w:r>
@@ -3868,7 +3883,7 @@
         </w:tc>
         <w:tc>
           <w:tcPr>
-            <w:tcW w:type="dxa" w:w="4536"/>
+            <w:tcW w:w="4536" w:type="dxa"/>
           </w:tcPr>
           <w:p>
             <w:r>
@@ -3883,12 +3898,18 @@
       <w:tr>
         <w:tc>
           <w:tcPr>
-            <w:tcW w:type="dxa" w:w="4536"/>
-          </w:tcPr>
-          <w:p>
-            <w:r>
-              <w:rPr>
-                <w:b/>
+            <w:tcW w:w="4536" w:type="dxa"/>
+          </w:tcPr>
+          <w:p>
+            <w:pPr>
+              <w:rPr>
+                <w:lang w:val="en-US"/>
+              </w:rPr>
+            </w:pPr>
+            <w:r>
+              <w:rPr>
+                <w:b/>
+                <w:lang w:val="en-US"/>
               </w:rPr>
               <w:t>Ed Wood, Blade Runner, The Godfather I et II, Gattaca, Life Is Beautiful, M*A*S*H, The Pianist, Castle in the Sky, Eternal Sunshine of the Spotless Mind</w:t>
             </w:r>
@@ -3896,40 +3917,61 @@
         </w:tc>
         <w:tc>
           <w:tcPr>
-            <w:tcW w:type="dxa" w:w="4536"/>
-          </w:tcPr>
-          <w:p>
-            <w:r>
+            <w:tcW w:w="4536" w:type="dxa"/>
+          </w:tcPr>
+          <w:p>
+            <w:pPr>
+              <w:rPr>
+                <w:lang w:val="en-US"/>
+              </w:rPr>
+            </w:pPr>
+            <w:r>
+              <w:rPr>
+                <w:lang w:val="en-US"/>
+              </w:rPr>
               <w:t>Pulp Fiction, The Usual Suspects, The Dark Knight, High Fidelity, The Big Lebowski, The Shawshank Redemption, GoodFellas, American Beauty, One Flew Over the Cuckoo's Nest, City of God</w:t>
             </w:r>
           </w:p>
         </w:tc>
       </w:tr>
     </w:tbl>
-    <w:p/>
-    <w:p>
-      <w:r>
-        <w:t>La figure déposée montre la répartition des deux mesures sur les 671 utilisateurs, une boîte par type de liste (la boîte est la moitié centrale des utilisateurs, le trait est la médiane, les moustaches vont jusqu'aux valeurs extrêmes). À gauche, le nombre de genres couverts, à droite la part de paires sans genre commun. Les boîtes du système retenu et des films préférés se superposent presque : le système est aussi varié que l'utilisateur lui-même, pour la grande majorité des utilisateurs. L'item-based est un peu au-dessus, le repère nettement au-dessus et plus resserré, puisqu'il donne presque la même liste à tout le monde.</w:t>
-      </w:r>
-    </w:p>
-    <w:p>
-      <w:r>
+    <w:p>
+      <w:pPr>
+        <w:rPr>
+          <w:lang w:val="en-US"/>
+        </w:rPr>
+      </w:pPr>
+    </w:p>
+    <w:p>
+      <w:r>
+        <w:t xml:space="preserve">La figure déposée montre la répartition des deux mesures sur les 671 utilisateurs, une boîte par type de liste (la boîte est la moitié centrale des utilisateurs, le trait est la médiane, les moustaches vont jusqu'aux valeurs extrêmes). À gauche, le nombre de genres couverts, à droite la part de paires sans genre commun. Les boîtes du système retenu et des films préférés se superposent presque : le système est aussi varié que l'utilisateur lui-même, pour la grande majorité des utilisateurs. L'item-based est </w:t>
+      </w:r>
+      <w:r>
+        <w:t>un peu au-dessus, le repère nettement au-dessus et plus resserré, puisqu'il donne presque la même liste à tout le monde.</w:t>
+      </w:r>
+    </w:p>
+    <w:p>
+      <w:r>
+        <w:rPr>
+          <w:noProof/>
+        </w:rPr>
         <w:drawing>
-          <wp:inline xmlns:a="http://schemas.openxmlformats.org/drawingml/2006/main" xmlns:pic="http://schemas.openxmlformats.org/drawingml/2006/picture">
+          <wp:inline distT="0" distB="0" distL="0" distR="0" wp14:anchorId="37775446" wp14:editId="77E8D785">
             <wp:extent cx="5760000" cy="2066605"/>
+            <wp:effectExtent l="0" t="0" r="0" b="0"/>
             <wp:docPr id="6" name="Picture 6"/>
             <wp:cNvGraphicFramePr>
-              <a:graphicFrameLocks noChangeAspect="1"/>
+              <a:graphicFrameLocks xmlns:a="http://schemas.openxmlformats.org/drawingml/2006/main" noChangeAspect="1"/>
             </wp:cNvGraphicFramePr>
-            <a:graphic>
+            <a:graphic xmlns:a="http://schemas.openxmlformats.org/drawingml/2006/main">
               <a:graphicData uri="http://schemas.openxmlformats.org/drawingml/2006/picture">
-                <pic:pic>
+                <pic:pic xmlns:pic="http://schemas.openxmlformats.org/drawingml/2006/picture">
                   <pic:nvPicPr>
                     <pic:cNvPr id="0" name="ex5_q9_diversite_liste.png"/>
                     <pic:cNvPicPr/>
                   </pic:nvPicPr>
                   <pic:blipFill>
-                    <a:blip r:embed="rId34"/>
+                    <a:blip r:embed="rId18"/>
                     <a:stretch>
                       <a:fillRect/>
                     </a:stretch>
@@ -3939,7 +3981,9 @@
                       <a:off x="0" y="0"/>
                       <a:ext cx="5760000" cy="2066605"/>
                     </a:xfrm>
-                    <a:prstGeom prst="rect"/>
+                    <a:prstGeom prst="rect">
+                      <a:avLst/>
+                    </a:prstGeom>
                   </pic:spPr>
                 </pic:pic>
               </a:graphicData>
@@ -3963,32 +4007,26 @@
     </w:p>
     <w:tbl>
       <w:tblPr>
-        <w:tblStyle w:val="TableGrid"/>
-        <w:tblW w:type="auto" w:w="0"/>
-        <w:tblLook w:firstColumn="1" w:firstRow="1" w:lastColumn="0" w:lastRow="0" w:noHBand="0" w:noVBand="1" w:val="04A0"/>
+        <w:tblStyle w:val="Grilledutableau"/>
+        <w:tblW w:w="0" w:type="auto"/>
+        <w:tblLook w:val="04A0" w:firstRow="1" w:lastRow="0" w:firstColumn="1" w:lastColumn="0" w:noHBand="0" w:noVBand="1"/>
       </w:tblPr>
       <w:tblGrid>
         <w:gridCol w:w="2268"/>
-        <w:gridCol w:w="2268"/>
-        <w:gridCol w:w="2268"/>
-        <w:gridCol w:w="2268"/>
+        <w:gridCol w:w="2265"/>
+        <w:gridCol w:w="2265"/>
+        <w:gridCol w:w="2264"/>
       </w:tblGrid>
       <w:tr>
         <w:tc>
           <w:tcPr>
-            <w:tcW w:type="dxa" w:w="2268"/>
-          </w:tcPr>
-          <w:p>
-            <w:r>
-              <w:rPr>
-                <w:b/>
-              </w:rPr>
-            </w:r>
-          </w:p>
-        </w:tc>
-        <w:tc>
-          <w:tcPr>
-            <w:tcW w:type="dxa" w:w="2268"/>
+            <w:tcW w:w="2268" w:type="dxa"/>
+          </w:tcPr>
+          <w:p/>
+        </w:tc>
+        <w:tc>
+          <w:tcPr>
+            <w:tcW w:w="2268" w:type="dxa"/>
           </w:tcPr>
           <w:p>
             <w:r>
@@ -4001,7 +4039,7 @@
         </w:tc>
         <w:tc>
           <w:tcPr>
-            <w:tcW w:type="dxa" w:w="2268"/>
+            <w:tcW w:w="2268" w:type="dxa"/>
           </w:tcPr>
           <w:p>
             <w:r>
@@ -4014,7 +4052,7 @@
         </w:tc>
         <w:tc>
           <w:tcPr>
-            <w:tcW w:type="dxa" w:w="2268"/>
+            <w:tcW w:w="2268" w:type="dxa"/>
           </w:tcPr>
           <w:p>
             <w:r>
@@ -4029,7 +4067,7 @@
       <w:tr>
         <w:tc>
           <w:tcPr>
-            <w:tcW w:type="dxa" w:w="2268"/>
+            <w:tcW w:w="2268" w:type="dxa"/>
           </w:tcPr>
           <w:p>
             <w:r>
@@ -4042,7 +4080,7 @@
         </w:tc>
         <w:tc>
           <w:tcPr>
-            <w:tcW w:type="dxa" w:w="2268"/>
+            <w:tcW w:w="2268" w:type="dxa"/>
           </w:tcPr>
           <w:p>
             <w:r>
@@ -4052,7 +4090,7 @@
         </w:tc>
         <w:tc>
           <w:tcPr>
-            <w:tcW w:type="dxa" w:w="2268"/>
+            <w:tcW w:w="2268" w:type="dxa"/>
           </w:tcPr>
           <w:p>
             <w:r>
@@ -4062,7 +4100,7 @@
         </w:tc>
         <w:tc>
           <w:tcPr>
-            <w:tcW w:type="dxa" w:w="2268"/>
+            <w:tcW w:w="2268" w:type="dxa"/>
           </w:tcPr>
           <w:p>
             <w:r>
@@ -4074,7 +4112,7 @@
       <w:tr>
         <w:tc>
           <w:tcPr>
-            <w:tcW w:type="dxa" w:w="2268"/>
+            <w:tcW w:w="2268" w:type="dxa"/>
           </w:tcPr>
           <w:p>
             <w:r>
@@ -4087,7 +4125,7 @@
         </w:tc>
         <w:tc>
           <w:tcPr>
-            <w:tcW w:type="dxa" w:w="2268"/>
+            <w:tcW w:w="2268" w:type="dxa"/>
           </w:tcPr>
           <w:p>
             <w:r>
@@ -4097,7 +4135,7 @@
         </w:tc>
         <w:tc>
           <w:tcPr>
-            <w:tcW w:type="dxa" w:w="2268"/>
+            <w:tcW w:w="2268" w:type="dxa"/>
           </w:tcPr>
           <w:p>
             <w:r>
@@ -4107,7 +4145,7 @@
         </w:tc>
         <w:tc>
           <w:tcPr>
-            <w:tcW w:type="dxa" w:w="2268"/>
+            <w:tcW w:w="2268" w:type="dxa"/>
           </w:tcPr>
           <w:p>
             <w:r>
@@ -4119,20 +4157,21 @@
       <w:tr>
         <w:tc>
           <w:tcPr>
-            <w:tcW w:type="dxa" w:w="2268"/>
-          </w:tcPr>
-          <w:p>
-            <w:r>
-              <w:rPr>
-                <w:b/>
-              </w:rPr>
+            <w:tcW w:w="2268" w:type="dxa"/>
+          </w:tcPr>
+          <w:p>
+            <w:r>
+              <w:rPr>
+                <w:b/>
+              </w:rPr>
+              <w:lastRenderedPageBreak/>
               <w:t>Films qui font la moitié des recommandations</w:t>
             </w:r>
           </w:p>
         </w:tc>
         <w:tc>
           <w:tcPr>
-            <w:tcW w:type="dxa" w:w="2268"/>
+            <w:tcW w:w="2268" w:type="dxa"/>
           </w:tcPr>
           <w:p>
             <w:r>
@@ -4142,7 +4181,7 @@
         </w:tc>
         <w:tc>
           <w:tcPr>
-            <w:tcW w:type="dxa" w:w="2268"/>
+            <w:tcW w:w="2268" w:type="dxa"/>
           </w:tcPr>
           <w:p>
             <w:r>
@@ -4152,7 +4191,7 @@
         </w:tc>
         <w:tc>
           <w:tcPr>
-            <w:tcW w:type="dxa" w:w="2268"/>
+            <w:tcW w:w="2268" w:type="dxa"/>
           </w:tcPr>
           <w:p>
             <w:r>
@@ -4164,7 +4203,7 @@
       <w:tr>
         <w:tc>
           <w:tcPr>
-            <w:tcW w:type="dxa" w:w="2268"/>
+            <w:tcW w:w="2268" w:type="dxa"/>
           </w:tcPr>
           <w:p>
             <w:r>
@@ -4177,7 +4216,7 @@
         </w:tc>
         <w:tc>
           <w:tcPr>
-            <w:tcW w:type="dxa" w:w="2268"/>
+            <w:tcW w:w="2268" w:type="dxa"/>
           </w:tcPr>
           <w:p>
             <w:r>
@@ -4187,7 +4226,7 @@
         </w:tc>
         <w:tc>
           <w:tcPr>
-            <w:tcW w:type="dxa" w:w="2268"/>
+            <w:tcW w:w="2268" w:type="dxa"/>
           </w:tcPr>
           <w:p>
             <w:r>
@@ -4197,7 +4236,7 @@
         </w:tc>
         <w:tc>
           <w:tcPr>
-            <w:tcW w:type="dxa" w:w="2268"/>
+            <w:tcW w:w="2268" w:type="dxa"/>
           </w:tcPr>
           <w:p>
             <w:r>
@@ -4215,19 +4254,19 @@
     </w:p>
     <w:tbl>
       <w:tblPr>
-        <w:tblStyle w:val="TableGrid"/>
-        <w:tblW w:type="auto" w:w="0"/>
-        <w:tblLook w:firstColumn="1" w:firstRow="1" w:lastColumn="0" w:lastRow="0" w:noHBand="0" w:noVBand="1" w:val="04A0"/>
+        <w:tblStyle w:val="Grilledutableau"/>
+        <w:tblW w:w="0" w:type="auto"/>
+        <w:tblLook w:val="04A0" w:firstRow="1" w:lastRow="0" w:firstColumn="1" w:lastColumn="0" w:noHBand="0" w:noVBand="1"/>
       </w:tblPr>
       <w:tblGrid>
-        <w:gridCol w:w="3024"/>
-        <w:gridCol w:w="3024"/>
-        <w:gridCol w:w="3024"/>
+        <w:gridCol w:w="3021"/>
+        <w:gridCol w:w="3021"/>
+        <w:gridCol w:w="3020"/>
       </w:tblGrid>
       <w:tr>
         <w:tc>
           <w:tcPr>
-            <w:tcW w:type="dxa" w:w="3024"/>
+            <w:tcW w:w="3024" w:type="dxa"/>
           </w:tcPr>
           <w:p>
             <w:r>
@@ -4240,7 +4279,7 @@
         </w:tc>
         <w:tc>
           <w:tcPr>
-            <w:tcW w:type="dxa" w:w="3024"/>
+            <w:tcW w:w="3024" w:type="dxa"/>
           </w:tcPr>
           <w:p>
             <w:r>
@@ -4253,7 +4292,7 @@
         </w:tc>
         <w:tc>
           <w:tcPr>
-            <w:tcW w:type="dxa" w:w="3024"/>
+            <w:tcW w:w="3024" w:type="dxa"/>
           </w:tcPr>
           <w:p>
             <w:r>
@@ -4268,7 +4307,7 @@
       <w:tr>
         <w:tc>
           <w:tcPr>
-            <w:tcW w:type="dxa" w:w="3024"/>
+            <w:tcW w:w="3024" w:type="dxa"/>
           </w:tcPr>
           <w:p>
             <w:r>
@@ -4281,7 +4320,7 @@
         </w:tc>
         <w:tc>
           <w:tcPr>
-            <w:tcW w:type="dxa" w:w="3024"/>
+            <w:tcW w:w="3024" w:type="dxa"/>
           </w:tcPr>
           <w:p>
             <w:r>
@@ -4291,7 +4330,7 @@
         </w:tc>
         <w:tc>
           <w:tcPr>
-            <w:tcW w:type="dxa" w:w="3024"/>
+            <w:tcW w:w="3024" w:type="dxa"/>
           </w:tcPr>
           <w:p>
             <w:r>
@@ -4303,7 +4342,7 @@
       <w:tr>
         <w:tc>
           <w:tcPr>
-            <w:tcW w:type="dxa" w:w="3024"/>
+            <w:tcW w:w="3024" w:type="dxa"/>
           </w:tcPr>
           <w:p>
             <w:r>
@@ -4316,7 +4355,7 @@
         </w:tc>
         <w:tc>
           <w:tcPr>
-            <w:tcW w:type="dxa" w:w="3024"/>
+            <w:tcW w:w="3024" w:type="dxa"/>
           </w:tcPr>
           <w:p>
             <w:r>
@@ -4326,7 +4365,7 @@
         </w:tc>
         <w:tc>
           <w:tcPr>
-            <w:tcW w:type="dxa" w:w="3024"/>
+            <w:tcW w:w="3024" w:type="dxa"/>
           </w:tcPr>
           <w:p>
             <w:r>
@@ -4338,7 +4377,7 @@
       <w:tr>
         <w:tc>
           <w:tcPr>
-            <w:tcW w:type="dxa" w:w="3024"/>
+            <w:tcW w:w="3024" w:type="dxa"/>
           </w:tcPr>
           <w:p>
             <w:r>
@@ -4351,7 +4390,7 @@
         </w:tc>
         <w:tc>
           <w:tcPr>
-            <w:tcW w:type="dxa" w:w="3024"/>
+            <w:tcW w:w="3024" w:type="dxa"/>
           </w:tcPr>
           <w:p>
             <w:r>
@@ -4361,7 +4400,7 @@
         </w:tc>
         <w:tc>
           <w:tcPr>
-            <w:tcW w:type="dxa" w:w="3024"/>
+            <w:tcW w:w="3024" w:type="dxa"/>
           </w:tcPr>
           <w:p>
             <w:r>
@@ -4373,7 +4412,7 @@
       <w:tr>
         <w:tc>
           <w:tcPr>
-            <w:tcW w:type="dxa" w:w="3024"/>
+            <w:tcW w:w="3024" w:type="dxa"/>
           </w:tcPr>
           <w:p>
             <w:r>
@@ -4386,7 +4425,7 @@
         </w:tc>
         <w:tc>
           <w:tcPr>
-            <w:tcW w:type="dxa" w:w="3024"/>
+            <w:tcW w:w="3024" w:type="dxa"/>
           </w:tcPr>
           <w:p>
             <w:r>
@@ -4396,7 +4435,7 @@
         </w:tc>
         <w:tc>
           <w:tcPr>
-            <w:tcW w:type="dxa" w:w="3024"/>
+            <w:tcW w:w="3024" w:type="dxa"/>
           </w:tcPr>
           <w:p>
             <w:r>
@@ -4408,7 +4447,7 @@
       <w:tr>
         <w:tc>
           <w:tcPr>
-            <w:tcW w:type="dxa" w:w="3024"/>
+            <w:tcW w:w="3024" w:type="dxa"/>
           </w:tcPr>
           <w:p>
             <w:r>
@@ -4421,7 +4460,7 @@
         </w:tc>
         <w:tc>
           <w:tcPr>
-            <w:tcW w:type="dxa" w:w="3024"/>
+            <w:tcW w:w="3024" w:type="dxa"/>
           </w:tcPr>
           <w:p>
             <w:r>
@@ -4431,7 +4470,7 @@
         </w:tc>
         <w:tc>
           <w:tcPr>
-            <w:tcW w:type="dxa" w:w="3024"/>
+            <w:tcW w:w="3024" w:type="dxa"/>
           </w:tcPr>
           <w:p>
             <w:r>
@@ -4449,17 +4488,27 @@
     </w:p>
     <w:p>
       <w:r>
-        <w:t>Par genres, le même déséquilibre. On a regardé quelle part des films proposés porte chaque genre, comparée au catalogue. Le système sur-représente le polar et le drame : Crime passe de 14 % des films du catalogue à 34 % des films proposés, Thriller de 23 % à 33 %, Drama de 51 % à 56 %, War de 3 % à 8 %, History de 4 % à 8 %. À l'inverse, la comédie tombe de 37 % à 14 %, la romance de 20 % à 9 %, l'horreur de 10 % à 1,5 %, l'animation de 5 % à 2,6 %, le documentaire de 5 % à 0,1 %, et deux genres ne sont jamais proposés (Foreign, TV Movie). L'item-based est plus proche du catalogue sur la comédie (29 %) et l'animation (7 %), mais il sur-représente l'action et l'aventure. Ce n'est pas seulement que le système propose peu de films : il propose surtout un certain type de films, les classiques du polar et du drame que beaucoup de gens ont vus et bien notés.</w:t>
-      </w:r>
-    </w:p>
-    <w:p>
-      <w:r>
-        <w:t>Le lien avec le cours. Le cours donne au filtrage collaboratif un avantage, la sérendipité naturelle, des recommandations auxquelles on ne s'attend pas, et un inconvénient, le biais de popularité. Notre seuil de voisins fait pencher la balance du mauvais côté : en ne gardant que les films vus par 10 voisins sur 30, il amplifie le biais de popularité et il fait perdre la sérendipité, puisqu'un film inattendu est presque toujours un film peu vu. Au global, le système se comporte plus comme un top des ventes personnalisé que comme un système de découverte.</w:t>
-      </w:r>
-    </w:p>
-    <w:p>
-      <w:r>
-        <w:t>Les figures déposées. La première image a deux panneaux. Le panneau de gauche montre les 15 films les plus proposés par le système, avec la part des 671 utilisateurs qui les reçoivent dans leur top 10 : The Shawshank Redemption est proposé à 44 % des utilisateurs, et les cinq premiers films à plus d'un tiers des utilisateurs chacun. En orange, la part pour les mêmes films avec l'item-based : presque toujours bien plus basse, sauf pour deux ou trois films. Il répartit mieux ses recommandations.</w:t>
+        <w:t>Par genres, le même déséquilibre. On a regardé quelle part des films proposés porte chaque genre, comparée au catalogue. Le système sur-représente le polar et le drame : Crime passe de 14 % des films du catalogue à 34 % des films proposés, Thriller de 23 % à 33 %, Drama de 51 % à 56 %, War de 3 % à 8 %, History de 4 % à 8 %. À l'inverse, la comédie tombe de 37 % à 14 %, la romance de 20 % à 9 %, l'horreur de 10 % à 1,5 %, l'animation de 5 % à 2,6 %, le documentaire de 5 % à 0,1 %, et deux genres ne sont jam</w:t>
+      </w:r>
+      <w:r>
+        <w:t>ais proposés (Foreign, TV Movie). L'item-based est plus proche du catalogue sur la comédie (29 %) et l'animation (7 %), mais il sur-représente l'action et l'aventure. Ce n'est pas seulement que le système propose peu de films : il propose surtout un certain type de films, les classiques du polar et du drame que beaucoup de gens ont vus et bien notés.</w:t>
+      </w:r>
+    </w:p>
+    <w:p>
+      <w:r>
+        <w:t>Le lien avec le cours. Le cours donne au filtrage collaboratif un avantage, la sérendipité naturelle, des recommandations auxquelles on ne s'attend pas, et un inconvénient, le biais de popularité. Notre seuil de voisins fait pencher la balance du mauvais côté : en ne gardant que les films vus par 10 voisins sur 30, il amplifie le biais de popularité et il fait perdre la sérendipité, puisqu'un film inattendu est presque toujours un film peu vu. Au global, le système se comporte plus comme un top des ventes p</w:t>
+      </w:r>
+      <w:r>
+        <w:t>ersonnalisé que comme un système de découverte.</w:t>
+      </w:r>
+    </w:p>
+    <w:p>
+      <w:r>
+        <w:t xml:space="preserve">Les figures déposées. La première image a deux panneaux. Le panneau de gauche montre les 15 films les plus proposés par le système, avec la part des 671 utilisateurs qui les reçoivent dans leur top 10 : The Shawshank Redemption est proposé à 44 % des utilisateurs, et les cinq premiers films à plus d'un tiers des utilisateurs chacun. En orange, la part pour les mêmes </w:t>
+      </w:r>
+      <w:r>
+        <w:lastRenderedPageBreak/>
+        <w:t>films avec l'item-based : presque toujours bien plus basse, sauf pour deux ou trois films. Il répartit mieux ses recommandations.</w:t>
       </w:r>
     </w:p>
     <w:p>
@@ -4469,22 +4518,26 @@
     </w:p>
     <w:p>
       <w:r>
+        <w:rPr>
+          <w:noProof/>
+        </w:rPr>
         <w:drawing>
-          <wp:inline xmlns:a="http://schemas.openxmlformats.org/drawingml/2006/main" xmlns:pic="http://schemas.openxmlformats.org/drawingml/2006/picture">
+          <wp:inline distT="0" distB="0" distL="0" distR="0" wp14:anchorId="3AA0FE35" wp14:editId="4D44F884">
             <wp:extent cx="5760000" cy="2030504"/>
+            <wp:effectExtent l="0" t="0" r="0" b="0"/>
             <wp:docPr id="7" name="Picture 7"/>
             <wp:cNvGraphicFramePr>
-              <a:graphicFrameLocks noChangeAspect="1"/>
+              <a:graphicFrameLocks xmlns:a="http://schemas.openxmlformats.org/drawingml/2006/main" noChangeAspect="1"/>
             </wp:cNvGraphicFramePr>
-            <a:graphic>
+            <a:graphic xmlns:a="http://schemas.openxmlformats.org/drawingml/2006/main">
               <a:graphicData uri="http://schemas.openxmlformats.org/drawingml/2006/picture">
-                <pic:pic>
+                <pic:pic xmlns:pic="http://schemas.openxmlformats.org/drawingml/2006/picture">
                   <pic:nvPicPr>
                     <pic:cNvPr id="0" name="ex5_q10_fig1et2_plus_proposes_concentration.png"/>
                     <pic:cNvPicPr/>
                   </pic:nvPicPr>
                   <pic:blipFill>
-                    <a:blip r:embed="rId35"/>
+                    <a:blip r:embed="rId19"/>
                     <a:stretch>
                       <a:fillRect/>
                     </a:stretch>
@@ -4494,7 +4547,9 @@
                       <a:off x="0" y="0"/>
                       <a:ext cx="5760000" cy="2030504"/>
                     </a:xfrm>
-                    <a:prstGeom prst="rect"/>
+                    <a:prstGeom prst="rect">
+                      <a:avLst/>
+                    </a:prstGeom>
                   </pic:spPr>
                 </pic:pic>
               </a:graphicData>
@@ -4510,22 +4565,26 @@
     </w:p>
     <w:p>
       <w:r>
+        <w:rPr>
+          <w:noProof/>
+        </w:rPr>
         <w:drawing>
-          <wp:inline xmlns:a="http://schemas.openxmlformats.org/drawingml/2006/main" xmlns:pic="http://schemas.openxmlformats.org/drawingml/2006/picture">
+          <wp:inline distT="0" distB="0" distL="0" distR="0" wp14:anchorId="69FEC1CF" wp14:editId="6D5E0494">
             <wp:extent cx="5760000" cy="3494831"/>
+            <wp:effectExtent l="0" t="0" r="0" b="0"/>
             <wp:docPr id="8" name="Picture 8"/>
             <wp:cNvGraphicFramePr>
-              <a:graphicFrameLocks noChangeAspect="1"/>
+              <a:graphicFrameLocks xmlns:a="http://schemas.openxmlformats.org/drawingml/2006/main" noChangeAspect="1"/>
             </wp:cNvGraphicFramePr>
-            <a:graphic>
+            <a:graphic xmlns:a="http://schemas.openxmlformats.org/drawingml/2006/main">
               <a:graphicData uri="http://schemas.openxmlformats.org/drawingml/2006/picture">
-                <pic:pic>
+                <pic:pic xmlns:pic="http://schemas.openxmlformats.org/drawingml/2006/picture">
                   <pic:nvPicPr>
                     <pic:cNvPr id="0" name="ex5_q10_fig3_genres_global.png"/>
                     <pic:cNvPicPr/>
                   </pic:nvPicPr>
                   <pic:blipFill>
-                    <a:blip r:embed="rId36"/>
+                    <a:blip r:embed="rId20"/>
                     <a:stretch>
                       <a:fillRect/>
                     </a:stretch>
@@ -4535,7 +4594,9 @@
                       <a:off x="0" y="0"/>
                       <a:ext cx="5760000" cy="3494831"/>
                     </a:xfrm>
-                    <a:prstGeom prst="rect"/>
+                    <a:prstGeom prst="rect">
+                      <a:avLst/>
+                    </a:prstGeom>
                   </pic:spPr>
                 </pic:pic>
               </a:graphicData>
@@ -4549,6 +4610,7 @@
         <w:pStyle w:val="Niveau3"/>
       </w:pPr>
       <w:r>
+        <w:lastRenderedPageBreak/>
         <w:t>Les recommandations sont-elles réellement personnalisées ?</w:t>
       </w:r>
     </w:p>
@@ -4559,32 +4621,26 @@
     </w:p>
     <w:tbl>
       <w:tblPr>
-        <w:tblStyle w:val="TableGrid"/>
-        <w:tblW w:type="auto" w:w="0"/>
-        <w:tblLook w:firstColumn="1" w:firstRow="1" w:lastColumn="0" w:lastRow="0" w:noHBand="0" w:noVBand="1" w:val="04A0"/>
+        <w:tblStyle w:val="Grilledutableau"/>
+        <w:tblW w:w="0" w:type="auto"/>
+        <w:tblLook w:val="04A0" w:firstRow="1" w:lastRow="0" w:firstColumn="1" w:lastColumn="0" w:noHBand="0" w:noVBand="1"/>
       </w:tblPr>
       <w:tblGrid>
-        <w:gridCol w:w="2268"/>
-        <w:gridCol w:w="2268"/>
-        <w:gridCol w:w="2268"/>
-        <w:gridCol w:w="2268"/>
+        <w:gridCol w:w="2267"/>
+        <w:gridCol w:w="2265"/>
+        <w:gridCol w:w="2265"/>
+        <w:gridCol w:w="2265"/>
       </w:tblGrid>
       <w:tr>
         <w:tc>
           <w:tcPr>
-            <w:tcW w:type="dxa" w:w="2268"/>
-          </w:tcPr>
-          <w:p>
-            <w:r>
-              <w:rPr>
-                <w:b/>
-              </w:rPr>
-            </w:r>
-          </w:p>
-        </w:tc>
-        <w:tc>
-          <w:tcPr>
-            <w:tcW w:type="dxa" w:w="2268"/>
+            <w:tcW w:w="2268" w:type="dxa"/>
+          </w:tcPr>
+          <w:p/>
+        </w:tc>
+        <w:tc>
+          <w:tcPr>
+            <w:tcW w:w="2268" w:type="dxa"/>
           </w:tcPr>
           <w:p>
             <w:r>
@@ -4597,7 +4653,7 @@
         </w:tc>
         <w:tc>
           <w:tcPr>
-            <w:tcW w:type="dxa" w:w="2268"/>
+            <w:tcW w:w="2268" w:type="dxa"/>
           </w:tcPr>
           <w:p>
             <w:r>
@@ -4610,7 +4666,7 @@
         </w:tc>
         <w:tc>
           <w:tcPr>
-            <w:tcW w:type="dxa" w:w="2268"/>
+            <w:tcW w:w="2268" w:type="dxa"/>
           </w:tcPr>
           <w:p>
             <w:r>
@@ -4625,7 +4681,7 @@
       <w:tr>
         <w:tc>
           <w:tcPr>
-            <w:tcW w:type="dxa" w:w="2268"/>
+            <w:tcW w:w="2268" w:type="dxa"/>
           </w:tcPr>
           <w:p>
             <w:r>
@@ -4638,7 +4694,7 @@
         </w:tc>
         <w:tc>
           <w:tcPr>
-            <w:tcW w:type="dxa" w:w="2268"/>
+            <w:tcW w:w="2268" w:type="dxa"/>
           </w:tcPr>
           <w:p>
             <w:r>
@@ -4648,7 +4704,7 @@
         </w:tc>
         <w:tc>
           <w:tcPr>
-            <w:tcW w:type="dxa" w:w="2268"/>
+            <w:tcW w:w="2268" w:type="dxa"/>
           </w:tcPr>
           <w:p>
             <w:r>
@@ -4658,7 +4714,7 @@
         </w:tc>
         <w:tc>
           <w:tcPr>
-            <w:tcW w:type="dxa" w:w="2268"/>
+            <w:tcW w:w="2268" w:type="dxa"/>
           </w:tcPr>
           <w:p>
             <w:r>
@@ -4670,7 +4726,7 @@
       <w:tr>
         <w:tc>
           <w:tcPr>
-            <w:tcW w:type="dxa" w:w="2268"/>
+            <w:tcW w:w="2268" w:type="dxa"/>
           </w:tcPr>
           <w:p>
             <w:r>
@@ -4683,7 +4739,7 @@
         </w:tc>
         <w:tc>
           <w:tcPr>
-            <w:tcW w:type="dxa" w:w="2268"/>
+            <w:tcW w:w="2268" w:type="dxa"/>
           </w:tcPr>
           <w:p>
             <w:r>
@@ -4693,7 +4749,7 @@
         </w:tc>
         <w:tc>
           <w:tcPr>
-            <w:tcW w:type="dxa" w:w="2268"/>
+            <w:tcW w:w="2268" w:type="dxa"/>
           </w:tcPr>
           <w:p>
             <w:r>
@@ -4703,7 +4759,7 @@
         </w:tc>
         <w:tc>
           <w:tcPr>
-            <w:tcW w:type="dxa" w:w="2268"/>
+            <w:tcW w:w="2268" w:type="dxa"/>
           </w:tcPr>
           <w:p>
             <w:r>
@@ -4715,7 +4771,7 @@
       <w:tr>
         <w:tc>
           <w:tcPr>
-            <w:tcW w:type="dxa" w:w="2268"/>
+            <w:tcW w:w="2268" w:type="dxa"/>
           </w:tcPr>
           <w:p>
             <w:r>
@@ -4728,7 +4784,7 @@
         </w:tc>
         <w:tc>
           <w:tcPr>
-            <w:tcW w:type="dxa" w:w="2268"/>
+            <w:tcW w:w="2268" w:type="dxa"/>
           </w:tcPr>
           <w:p>
             <w:r>
@@ -4738,7 +4794,7 @@
         </w:tc>
         <w:tc>
           <w:tcPr>
-            <w:tcW w:type="dxa" w:w="2268"/>
+            <w:tcW w:w="2268" w:type="dxa"/>
           </w:tcPr>
           <w:p>
             <w:r>
@@ -4748,7 +4804,7 @@
         </w:tc>
         <w:tc>
           <w:tcPr>
-            <w:tcW w:type="dxa" w:w="2268"/>
+            <w:tcW w:w="2268" w:type="dxa"/>
           </w:tcPr>
           <w:p>
             <w:r>
@@ -4761,7 +4817,10 @@
     <w:p/>
     <w:p>
       <w:r>
-        <w:t>Réponse : oui, mais moins qu'on ne le croirait. Deux utilisateurs pris au hasard ont en moyenne 1,5 film en commun sur 10, et plus d'une paire sur quatre n'en a aucun. Le repère des films les plus notés, lui, donne presque la même liste à tout le monde : 5,4 films en commun (ce n'est pas 10 parce que chacun a déjà vu certains de ces films, qu'on ne lui propose pas). Donc les listes suivent bien les goûts. Mais 3,0 des 10 films d'une liste viennent du top des ventes : en gros, trois dixièmes de chaque liste sont communs à tout le monde et sept dixièmes sont propres à l'utilisateur. L'item-based est plus personnalisé (1,1 film en commun, 43 % des paires sans aucun).</w:t>
+        <w:t xml:space="preserve">Réponse : oui, mais moins qu'on ne le croirait. Deux utilisateurs pris au hasard ont en moyenne 1,5 film en commun sur 10, et plus d'une paire sur quatre n'en a aucun. Le repère des films les plus notés, lui, donne presque la même liste à tout le monde : 5,4 films en commun (ce n'est pas 10 parce que chacun a déjà vu certains de ces films, qu'on ne lui propose pas). Donc les listes suivent bien les goûts. Mais 3,0 des 10 films d'une liste viennent du top des ventes : en gros, trois dixièmes de chaque liste </w:t>
+      </w:r>
+      <w:r>
+        <w:t>sont communs à tout le monde et sept dixièmes sont propres à l'utilisateur. L'item-based est plus personnalisé (1,1 film en commun, 43 % des paires sans aucun).</w:t>
       </w:r>
     </w:p>
     <w:p>
@@ -4771,18 +4830,18 @@
     </w:p>
     <w:tbl>
       <w:tblPr>
-        <w:tblStyle w:val="TableGrid"/>
-        <w:tblW w:type="auto" w:w="0"/>
-        <w:tblLook w:firstColumn="1" w:firstRow="1" w:lastColumn="0" w:lastRow="0" w:noHBand="0" w:noVBand="1" w:val="04A0"/>
+        <w:tblStyle w:val="Grilledutableau"/>
+        <w:tblW w:w="0" w:type="auto"/>
+        <w:tblLook w:val="04A0" w:firstRow="1" w:lastRow="0" w:firstColumn="1" w:lastColumn="0" w:noHBand="0" w:noVBand="1"/>
       </w:tblPr>
       <w:tblGrid>
-        <w:gridCol w:w="4536"/>
-        <w:gridCol w:w="4536"/>
+        <w:gridCol w:w="4531"/>
+        <w:gridCol w:w="4531"/>
       </w:tblGrid>
       <w:tr>
         <w:tc>
           <w:tcPr>
-            <w:tcW w:type="dxa" w:w="4536"/>
+            <w:tcW w:w="4536" w:type="dxa"/>
           </w:tcPr>
           <w:p>
             <w:r>
@@ -4795,7 +4854,7 @@
         </w:tc>
         <w:tc>
           <w:tcPr>
-            <w:tcW w:type="dxa" w:w="4536"/>
+            <w:tcW w:w="4536" w:type="dxa"/>
           </w:tcPr>
           <w:p>
             <w:r>
@@ -4810,7 +4869,7 @@
       <w:tr>
         <w:tc>
           <w:tcPr>
-            <w:tcW w:type="dxa" w:w="4536"/>
+            <w:tcW w:w="4536" w:type="dxa"/>
           </w:tcPr>
           <w:p>
             <w:r>
@@ -4823,7 +4882,7 @@
         </w:tc>
         <w:tc>
           <w:tcPr>
-            <w:tcW w:type="dxa" w:w="4536"/>
+            <w:tcW w:w="4536" w:type="dxa"/>
           </w:tcPr>
           <w:p>
             <w:r>
@@ -4841,27 +4900,35 @@
     </w:p>
     <w:p>
       <w:r>
-        <w:t>La figure déposée montre, pour chaque nombre possible de films en commun entre deux utilisateurs (de 0 à 10), la part des paires d'utilisateurs concernées. En noir, le repère des films les plus notés : la masse est entre 4 et 8 films en commun, tout le monde reçoit à peu près la même chose. En bleu, notre système : la masse est entre 0 et 3, la plupart des paires partagent au plus deux films. En orange, l'item-based, encore plus à gauche : presque une paire sur deux ne partage rien. Plus la répartition est à gauche, plus le système est personnalisé.</w:t>
-      </w:r>
-    </w:p>
-    <w:p>
-      <w:r>
+        <w:t xml:space="preserve">La figure déposée montre, pour chaque nombre possible de films en commun entre deux utilisateurs (de 0 à 10), la part des paires d'utilisateurs concernées. En noir, le repère des films les plus notés : la masse est entre 4 et 8 films en commun, tout le monde reçoit à peu près la </w:t>
+      </w:r>
+      <w:r>
+        <w:lastRenderedPageBreak/>
+        <w:t>même chose. En bleu, notre système : la masse est entre 0 et 3, la plupart des paires partagent au plus deux films. En orange, l'item-based, encore plus à gauche : presque une paire sur deux ne partage rien. Plus la répartition est à gauche, plus le système est personnalisé.</w:t>
+      </w:r>
+    </w:p>
+    <w:p>
+      <w:r>
+        <w:rPr>
+          <w:noProof/>
+        </w:rPr>
         <w:drawing>
-          <wp:inline xmlns:a="http://schemas.openxmlformats.org/drawingml/2006/main" xmlns:pic="http://schemas.openxmlformats.org/drawingml/2006/picture">
+          <wp:inline distT="0" distB="0" distL="0" distR="0" wp14:anchorId="4AE28E90" wp14:editId="7083FA42">
             <wp:extent cx="5760000" cy="2524045"/>
+            <wp:effectExtent l="0" t="0" r="0" b="0"/>
             <wp:docPr id="9" name="Picture 9"/>
             <wp:cNvGraphicFramePr>
-              <a:graphicFrameLocks noChangeAspect="1"/>
+              <a:graphicFrameLocks xmlns:a="http://schemas.openxmlformats.org/drawingml/2006/main" noChangeAspect="1"/>
             </wp:cNvGraphicFramePr>
-            <a:graphic>
+            <a:graphic xmlns:a="http://schemas.openxmlformats.org/drawingml/2006/main">
               <a:graphicData uri="http://schemas.openxmlformats.org/drawingml/2006/picture">
-                <pic:pic>
+                <pic:pic xmlns:pic="http://schemas.openxmlformats.org/drawingml/2006/picture">
                   <pic:nvPicPr>
                     <pic:cNvPr id="0" name="ex5_q11_personnalisation.png"/>
                     <pic:cNvPicPr/>
                   </pic:nvPicPr>
                   <pic:blipFill>
-                    <a:blip r:embed="rId37"/>
+                    <a:blip r:embed="rId21"/>
                     <a:stretch>
                       <a:fillRect/>
                     </a:stretch>
@@ -4871,7 +4938,9 @@
                       <a:off x="0" y="0"/>
                       <a:ext cx="5760000" cy="2524045"/>
                     </a:xfrm>
-                    <a:prstGeom prst="rect"/>
+                    <a:prstGeom prst="rect">
+                      <a:avLst/>
+                    </a:prstGeom>
                   </pic:spPr>
                 </pic:pic>
               </a:graphicData>
@@ -4895,27 +4964,40 @@
     </w:p>
     <w:p>
       <w:r>
-        <w:t>1. Changer de base, ou combiner : l'item-based. C'est l'amélioration déjà mesurée. Avec le classement par somme, il fait mieux sur tout : NDCG 0,249 contre 0,201, RMSE 0,915 contre 1,011, 410 films différents contre 337, films moins populaires. Il est aussi plus facile à expliquer à l'utilisateur, « parce que vous avez aimé Le Parrain ». Les deux systèmes ne proposent pas les mêmes films, donc la première chose à tester est un hybride qui mélange les deux listes ou pondère leurs scores, comme le cours le décrit.</w:t>
-      </w:r>
-    </w:p>
-    <w:p>
-      <w:r>
-        <w:t>2. Une part de découverte. Le biais de popularité est la faiblesse principale, et on a vu qu'on ne le corrige pas par le seul choix du réglage : prendre le plus varié des réglages équivalents ne fait passer la couverture que de 3 % à 4 % du catalogue. Deux leviers simples : pénaliser le score des films très vus, et réserver une ou deux places du top 10 à une suggestion moins attendue, tirée au hasard parmi les films moins vus que les voisins ont aimés. Un peu d'aléatoire contrôlé, pas n'importe quel film : ça donne une chance aux 96 % du catalogue jamais proposés, ça joue sur la sérendipité dont parle le cours, et ça permet de mesurer ensuite si ces suggestions plaisent. À suivre avec la couverture et la personnalisation à côté du NDCG, comme on l'a fait ici.</w:t>
-      </w:r>
-    </w:p>
-    <w:p>
-      <w:r>
-        <w:t>3. Un filtre par contenu. Le collaboratif ne peut rien pour un nouvel utilisateur sans avis ni pour un nouveau film sans note. Le catalogue a des genres, des résumés, des acteurs : un filtrage par contenu recommande des films qui ressemblent à ceux qu'on a aimés, sans avoir besoin des autres utilisateurs. En production on le combinerait en commutation : contenu pour les nouveaux, collaboratif pour les utilisateurs connus. Il servirait aussi à diversifier une liste, par exemple en évitant sept polars sur dix pour l'utilisateur 60.</w:t>
-      </w:r>
-    </w:p>
-    <w:p>
-      <w:r>
+        <w:t>1. Changer de base, ou combiner : l'item-based. C'est l'amélioration déjà mesurée. Avec le classement par somme, il fait mieux sur tout : NDCG 0,249 contre 0,201, RMSE 0,915 contre 1,011, 410 films différents contre 337, films moins populaires. Il est aussi plus facile à expliquer à l'utilisateur, « parce que vous avez aimé Le Parrain ». Les deux systèmes ne proposent pas les mêmes films, donc la première chose à tester est un hybride qui mélange les deux listes ou pondère leurs scores, comme le cours le dé</w:t>
+      </w:r>
+      <w:r>
+        <w:t>crit.</w:t>
+      </w:r>
+    </w:p>
+    <w:p>
+      <w:r>
+        <w:t xml:space="preserve">2. Une part de découverte. Le biais de popularité est la faiblesse principale, et on a vu qu'on ne le corrige pas par le seul choix du réglage : prendre le plus varié des réglages équivalents ne fait passer la couverture que de 3 % à 4 % du catalogue. Deux leviers simples : pénaliser le score des films très vus, et réserver une ou deux places du top 10 à une suggestion moins attendue, tirée au hasard parmi les films moins vus que les voisins ont aimés. Un peu d'aléatoire contrôlé, pas n'importe quel film : </w:t>
+      </w:r>
+      <w:r>
+        <w:t>ça donne une chance aux 96 % du catalogue jamais proposés, ça joue sur la sérendipité dont parle le cours, et ça permet de mesurer ensuite si ces suggestions plaisent. À suivre avec la couverture et la personnalisation à côté du NDCG, comme on l'a fait ici.</w:t>
+      </w:r>
+    </w:p>
+    <w:p>
+      <w:r>
+        <w:t>3. Un filtre par contenu. Le collaboratif ne peut rien pour un nouvel utilisateur sans avis ni pour un nouveau film sans note. Le catalogue a des genres, des résumés, des acteurs : un filtrage par contenu recommande des films qui ressemblent à ceux qu'on a aimés, sans avoir besoin des autres utilisateurs. En production on le combinerait en commutation : contenu pour les nouveaux, collaboratif pour les utilisateurs connus. Il servirait aussi à diversifier une liste, par exemple en évitant sept polars sur dix</w:t>
+      </w:r>
+      <w:r>
+        <w:t xml:space="preserve"> pour l'utilisateur 60.</w:t>
+      </w:r>
+    </w:p>
+    <w:p>
+      <w:r>
+        <w:lastRenderedPageBreak/>
         <w:t>4. Passer à une approche par modèle, comme le cours le propose pour le problème de la prédiction. Nos systèmes à base de voisins ne font que compter et moyenner, rien n'est appris. Le cours présente la suite logique : concevoir un modèle qui apprend sur les notes connues pour prédire toutes les cases de la matrice. Deux formes.</w:t>
       </w:r>
     </w:p>
     <w:p>
       <w:r>
-        <w:t>La factorisation matricielle : on suppose que les goûts tiennent en quelques dimensions cachées (par exemple « histoire » contre « romance » dans l'exemple du cours), chaque utilisateur et chaque film deviennent un petit vecteur de coordonnées sur ces dimensions, et la note prédite est le produit des deux. Les vecteurs sont appris pour coller aux notes connues. Le niveau de chaque utilisateur et de chaque film est appris avec, il n'y a plus d'imputation ni de similarité à calculer, et ça s'entraîne sur des millions d'avis.</w:t>
+        <w:t xml:space="preserve">La factorisation matricielle : on suppose que les goûts tiennent en quelques dimensions cachées (par exemple « histoire » contre « romance » dans l'exemple du cours), chaque utilisateur et chaque film deviennent un petit vecteur de coordonnées sur ces dimensions, et la note prédite est le produit des deux. Les vecteurs sont appris pour coller aux notes connues. Le niveau de chaque utilisateur et de chaque film est appris avec, il n'y a plus d'imputation ni de similarité à calculer, et ça s'entraîne sur des </w:t>
+      </w:r>
+      <w:r>
+        <w:t>millions d'avis.</w:t>
       </w:r>
     </w:p>
     <w:p>
@@ -4945,22 +5027,27 @@
     </w:p>
     <w:p>
       <w:r>
+        <w:rPr>
+          <w:noProof/>
+        </w:rPr>
+        <w:lastRenderedPageBreak/>
         <w:drawing>
-          <wp:inline xmlns:a="http://schemas.openxmlformats.org/drawingml/2006/main" xmlns:pic="http://schemas.openxmlformats.org/drawingml/2006/picture">
+          <wp:inline distT="0" distB="0" distL="0" distR="0" wp14:anchorId="1224AEEA" wp14:editId="24570114">
             <wp:extent cx="5760000" cy="2936778"/>
+            <wp:effectExtent l="0" t="0" r="0" b="0"/>
             <wp:docPr id="10" name="Picture 10"/>
             <wp:cNvGraphicFramePr>
-              <a:graphicFrameLocks noChangeAspect="1"/>
+              <a:graphicFrameLocks xmlns:a="http://schemas.openxmlformats.org/drawingml/2006/main" noChangeAspect="1"/>
             </wp:cNvGraphicFramePr>
-            <a:graphic>
+            <a:graphic xmlns:a="http://schemas.openxmlformats.org/drawingml/2006/main">
               <a:graphicData uri="http://schemas.openxmlformats.org/drawingml/2006/picture">
-                <pic:pic>
+                <pic:pic xmlns:pic="http://schemas.openxmlformats.org/drawingml/2006/picture">
                   <pic:nvPicPr>
                     <pic:cNvPr id="0" name="ex5_q12_schema_production.png"/>
                     <pic:cNvPicPr/>
                   </pic:nvPicPr>
                   <pic:blipFill>
-                    <a:blip r:embed="rId38"/>
+                    <a:blip r:embed="rId22"/>
                     <a:stretch>
                       <a:fillRect/>
                     </a:stretch>
@@ -4970,7 +5057,9 @@
                       <a:off x="0" y="0"/>
                       <a:ext cx="5760000" cy="2936778"/>
                     </a:xfrm>
-                    <a:prstGeom prst="rect"/>
+                    <a:prstGeom prst="rect">
+                      <a:avLst/>
+                    </a:prstGeom>
                   </pic:spPr>
                 </pic:pic>
               </a:graphicData>
@@ -5017,7 +5106,7 @@
 <w:ftr xmlns:wpc="http://schemas.microsoft.com/office/word/2010/wordprocessingCanvas" xmlns:cx="http://schemas.microsoft.com/office/drawing/2014/chartex" xmlns:cx1="http://schemas.microsoft.com/office/drawing/2015/9/8/chartex" xmlns:cx2="http://schemas.microsoft.com/office/drawing/2015/10/21/chartex" xmlns:cx3="http://schemas.microsoft.com/office/drawing/2016/5/9/chartex" xmlns:cx4="http://schemas.microsoft.com/office/drawing/2016/5/10/chartex" xmlns:cx5="http://schemas.microsoft.com/office/drawing/2016/5/11/chartex" xmlns:cx6="http://schemas.microsoft.com/office/drawing/2016/5/12/chartex" xmlns:cx7="http://schemas.microsoft.com/office/drawing/2016/5/13/chartex" xmlns:cx8="http://schemas.microsoft.com/office/drawing/2016/5/14/chartex" xmlns:mc="http://schemas.openxmlformats.org/markup-compatibility/2006" xmlns:aink="http://schemas.microsoft.com/office/drawing/2016/ink" xmlns:am3d="http://schemas.microsoft.com/office/drawing/2017/model3d" xmlns:o="urn:schemas-microsoft-com:office:office" xmlns:oel="http://schemas.microsoft.com/office/2019/extlst" xmlns:r="http://schemas.openxmlformats.org/officeDocument/2006/relationships" xmlns:m="http://schemas.openxmlformats.org/officeDocument/2006/math" xmlns:v="urn:schemas-microsoft-com:vml" xmlns:wp14="http://schemas.microsoft.com/office/word/2010/wordprocessingDrawing" xmlns:wp="http://schemas.openxmlformats.org/drawingml/2006/wordprocessingDrawing" xmlns:w10="urn:schemas-microsoft-com:office:word" xmlns:w="http://schemas.openxmlformats.org/wordprocessingml/2006/main" xmlns:w14="http://schemas.microsoft.com/office/word/2010/wordml" xmlns:w15="http://schemas.microsoft.com/office/word/2012/wordml" xmlns:w16cex="http://schemas.microsoft.com/office/word/2018/wordml/cex" xmlns:w16cid="http://schemas.microsoft.com/office/word/2016/wordml/cid" xmlns:w16="http://schemas.microsoft.com/office/word/2018/wordml" xmlns:w16du="http://schemas.microsoft.com/office/word/2023/wordml/word16du" xmlns:w16sdtdh="http://schemas.microsoft.com/office/word/2020/wordml/sdtdatahash" xmlns:w16sdtfl="http://schemas.microsoft.com/office/word/2024/wordml/sdtformatlock" xmlns:w16se="http://schemas.microsoft.com/office/word/2015/wordml/symex" xmlns:wpg="http://schemas.microsoft.com/office/word/2010/wordprocessingGroup" xmlns:wpi="http://schemas.microsoft.com/office/word/2010/wordprocessingInk" xmlns:wne="http://schemas.microsoft.com/office/word/2006/wordml" xmlns:wps="http://schemas.microsoft.com/office/word/2010/wordprocessingShape" mc:Ignorable="w14 w15 w16se w16cid w16 w16cex w16sdtdh w16sdtfl w16du wp14">
   <w:p>
     <w:pPr>
-      <w:pStyle w:val="Footer"/>
+      <w:pStyle w:val="Pieddepage"/>
       <w:rPr>
         <w:caps/>
         <w:color w:val="5B9BD5" w:themeColor="accent1"/>
@@ -5026,7 +5115,7 @@
   </w:p>
   <w:p>
     <w:pPr>
-      <w:pStyle w:val="Footer"/>
+      <w:pStyle w:val="Pieddepage"/>
       <w:jc w:val="center"/>
     </w:pPr>
     <w:r>
@@ -5102,7 +5191,7 @@
               <wp:extent cx="6248400" cy="0"/>
               <wp:effectExtent l="0" t="0" r="0" b="0"/>
               <wp:wrapNone/>
-              <wp:docPr id="9" name="Connecteur droit 9"/>
+              <wp:docPr id="1341829416" name="Connecteur droit 1341829416"/>
               <wp:cNvGraphicFramePr/>
               <a:graphic xmlns:a="http://schemas.openxmlformats.org/drawingml/2006/main">
                 <a:graphicData uri="http://schemas.microsoft.com/office/word/2010/wordprocessingShape">
@@ -5146,7 +5235,7 @@
             </wp:anchor>
           </w:drawing>
         </mc:Choice>
-        <mc:Fallback xmlns:arto="http://schemas.microsoft.com/office/word/2006/arto" xmlns:a="http://schemas.openxmlformats.org/drawingml/2006/main">
+        <mc:Fallback xmlns:a="http://schemas.openxmlformats.org/drawingml/2006/main" xmlns:arto="http://schemas.microsoft.com/office/word/2006/arto">
           <w:pict w14:anchorId="61886F37">
             <v:line id="Connecteur droit 9" style="position:absolute;z-index:251658240;visibility:visible;mso-wrap-style:square;mso-width-percent:0;mso-wrap-distance-left:9pt;mso-wrap-distance-top:0;mso-wrap-distance-right:9pt;mso-wrap-distance-bottom:0;mso-position-horizontal:center;mso-position-horizontal-relative:margin;mso-position-vertical:absolute;mso-position-vertical-relative:text;mso-width-percent:0;mso-width-relative:margin" o:spid="_x0000_s1026" strokecolor="#28aae1" strokeweight=".5pt" from="0,3.95pt" to="492pt,3.95pt" w14:anchorId="7DE0AFC9" o:gfxdata="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">
               <v:stroke joinstyle="miter"/>
@@ -5260,7 +5349,7 @@
         </w:tcPr>
         <w:p>
           <w:pPr>
-            <w:pStyle w:val="Header"/>
+            <w:pStyle w:val="En-tte"/>
           </w:pPr>
           <w:r>
             <w:t>TP1</w:t>
@@ -5273,7 +5362,7 @@
         </w:tcPr>
         <w:p>
           <w:pPr>
-            <w:pStyle w:val="Header"/>
+            <w:pStyle w:val="En-tte"/>
           </w:pPr>
         </w:p>
       </w:tc>
@@ -5283,7 +5372,7 @@
         </w:tcPr>
         <w:p>
           <w:pPr>
-            <w:pStyle w:val="Header"/>
+            <w:pStyle w:val="En-tte"/>
           </w:pPr>
         </w:p>
       </w:tc>
@@ -5291,7 +5380,7 @@
   </w:tbl>
   <w:p>
     <w:pPr>
-      <w:pStyle w:val="Header"/>
+      <w:pStyle w:val="En-tte"/>
     </w:pPr>
     <w:r>
       <w:rPr>
@@ -5362,7 +5451,7 @@
 <w:hdr xmlns:wpc="http://schemas.microsoft.com/office/word/2010/wordprocessingCanvas" xmlns:cx="http://schemas.microsoft.com/office/drawing/2014/chartex" xmlns:cx1="http://schemas.microsoft.com/office/drawing/2015/9/8/chartex" xmlns:cx2="http://schemas.microsoft.com/office/drawing/2015/10/21/chartex" xmlns:cx3="http://schemas.microsoft.com/office/drawing/2016/5/9/chartex" xmlns:cx4="http://schemas.microsoft.com/office/drawing/2016/5/10/chartex" xmlns:cx5="http://schemas.microsoft.com/office/drawing/2016/5/11/chartex" xmlns:cx6="http://schemas.microsoft.com/office/drawing/2016/5/12/chartex" xmlns:cx7="http://schemas.microsoft.com/office/drawing/2016/5/13/chartex" xmlns:cx8="http://schemas.microsoft.com/office/drawing/2016/5/14/chartex" xmlns:mc="http://schemas.openxmlformats.org/markup-compatibility/2006" xmlns:aink="http://schemas.microsoft.com/office/drawing/2016/ink" xmlns:am3d="http://schemas.microsoft.com/office/drawing/2017/model3d" xmlns:o="urn:schemas-microsoft-com:office:office" xmlns:oel="http://schemas.microsoft.com/office/2019/extlst" xmlns:r="http://schemas.openxmlformats.org/officeDocument/2006/relationships" xmlns:m="http://schemas.openxmlformats.org/officeDocument/2006/math" xmlns:v="urn:schemas-microsoft-com:vml" xmlns:wp14="http://schemas.microsoft.com/office/word/2010/wordprocessingDrawing" xmlns:wp="http://schemas.openxmlformats.org/drawingml/2006/wordprocessingDrawing" xmlns:w10="urn:schemas-microsoft-com:office:word" xmlns:w="http://schemas.openxmlformats.org/wordprocessingml/2006/main" xmlns:w14="http://schemas.microsoft.com/office/word/2010/wordml" xmlns:w15="http://schemas.microsoft.com/office/word/2012/wordml" xmlns:w16cex="http://schemas.microsoft.com/office/word/2018/wordml/cex" xmlns:w16cid="http://schemas.microsoft.com/office/word/2016/wordml/cid" xmlns:w16="http://schemas.microsoft.com/office/word/2018/wordml" xmlns:w16du="http://schemas.microsoft.com/office/word/2023/wordml/word16du" xmlns:w16sdtdh="http://schemas.microsoft.com/office/word/2020/wordml/sdtdatahash" xmlns:w16sdtfl="http://schemas.microsoft.com/office/word/2024/wordml/sdtformatlock" xmlns:w16se="http://schemas.microsoft.com/office/word/2015/wordml/symex" xmlns:wpg="http://schemas.microsoft.com/office/word/2010/wordprocessingGroup" xmlns:wpi="http://schemas.microsoft.com/office/word/2010/wordprocessingInk" xmlns:wne="http://schemas.microsoft.com/office/word/2006/wordml" xmlns:wps="http://schemas.microsoft.com/office/word/2010/wordprocessingShape" mc:Ignorable="w14 w15 w16se w16cid w16 w16cex w16sdtdh w16sdtfl w16du wp14">
   <w:p>
     <w:pPr>
-      <w:pStyle w:val="Header"/>
+      <w:pStyle w:val="En-tte"/>
     </w:pPr>
     <w:r>
       <w:rPr>
@@ -5453,7 +5542,7 @@
   </w:p>
   <w:p>
     <w:pPr>
-      <w:pStyle w:val="Header"/>
+      <w:pStyle w:val="En-tte"/>
     </w:pPr>
   </w:p>
 </w:hdr>
@@ -5486,7 +5575,7 @@
     <w:lvl w:ilvl="0">
       <w:start w:val="1"/>
       <w:numFmt w:val="decimal"/>
-      <w:pStyle w:val="Heading1"/>
+      <w:pStyle w:val="Titre1"/>
       <w:lvlText w:val="%1."/>
       <w:lvlJc w:val="left"/>
       <w:pPr>
@@ -6118,7 +6207,7 @@
     <w:lvl w:ilvl="0" w:tplc="4BD8FA76">
       <w:start w:val="1"/>
       <w:numFmt w:val="bullet"/>
-      <w:pStyle w:val="ListParagraph"/>
+      <w:pStyle w:val="Paragraphedeliste"/>
       <w:lvlText w:val="-"/>
       <w:lvlJc w:val="left"/>
       <w:pPr>
@@ -6663,12 +6752,12 @@
       <w:color w:val="4A4A49"/>
     </w:rPr>
   </w:style>
-  <w:style w:type="paragraph" w:styleId="Heading1">
+  <w:style w:type="paragraph" w:styleId="Titre1">
     <w:name w:val="heading 1"/>
     <w:aliases w:val="Niveau 1"/>
-    <w:basedOn w:val="ListNumber"/>
+    <w:basedOn w:val="Listenumros"/>
     <w:next w:val="Normal"/>
-    <w:link w:val="Heading1Char"/>
+    <w:link w:val="Titre1Car"/>
     <w:autoRedefine/>
     <w:uiPriority w:val="9"/>
     <w:qFormat/>
@@ -6687,12 +6776,12 @@
       <w:u w:color="36A9E1"/>
     </w:rPr>
   </w:style>
-  <w:style w:type="paragraph" w:styleId="Heading2">
+  <w:style w:type="paragraph" w:styleId="Titre2">
     <w:name w:val="heading 2"/>
     <w:aliases w:val="Niveau 2"/>
     <w:basedOn w:val="Normal"/>
     <w:next w:val="Normal"/>
-    <w:link w:val="Heading2Char"/>
+    <w:link w:val="Titre2Car"/>
     <w:uiPriority w:val="9"/>
     <w:unhideWhenUsed/>
     <w:qFormat/>
@@ -6712,11 +6801,11 @@
       <w:szCs w:val="26"/>
     </w:rPr>
   </w:style>
-  <w:style w:type="paragraph" w:styleId="Heading3">
+  <w:style w:type="paragraph" w:styleId="Titre3">
     <w:name w:val="heading 3"/>
     <w:basedOn w:val="Normal"/>
     <w:next w:val="Normal"/>
-    <w:link w:val="Heading3Char"/>
+    <w:link w:val="Titre3Car"/>
     <w:uiPriority w:val="9"/>
     <w:unhideWhenUsed/>
     <w:rsid w:val="00EA759C"/>
@@ -6732,11 +6821,11 @@
       <w:szCs w:val="24"/>
     </w:rPr>
   </w:style>
-  <w:style w:type="paragraph" w:styleId="Heading4">
+  <w:style w:type="paragraph" w:styleId="Titre4">
     <w:name w:val="heading 4"/>
     <w:basedOn w:val="Normal"/>
     <w:next w:val="Normal"/>
-    <w:link w:val="Heading4Char"/>
+    <w:link w:val="Titre4Car"/>
     <w:uiPriority w:val="9"/>
     <w:semiHidden/>
     <w:unhideWhenUsed/>
@@ -6754,12 +6843,13 @@
       <w:color w:val="2E74B5" w:themeColor="accent1" w:themeShade="BF"/>
     </w:rPr>
   </w:style>
-  <w:style w:type="character" w:default="1" w:styleId="DefaultParagraphFont">
+  <w:style w:type="character" w:default="1" w:styleId="Policepardfaut">
     <w:name w:val="Default Paragraph Font"/>
     <w:uiPriority w:val="1"/>
+    <w:semiHidden/>
     <w:unhideWhenUsed/>
   </w:style>
-  <w:style w:type="table" w:default="1" w:styleId="TableNormal">
+  <w:style w:type="table" w:default="1" w:styleId="TableauNormal">
     <w:name w:val="Normal Table"/>
     <w:uiPriority w:val="99"/>
     <w:semiHidden/>
@@ -6774,16 +6864,16 @@
       </w:tblCellMar>
     </w:tblPr>
   </w:style>
-  <w:style w:type="numbering" w:default="1" w:styleId="NoList">
+  <w:style w:type="numbering" w:default="1" w:styleId="Aucuneliste">
     <w:name w:val="No List"/>
     <w:uiPriority w:val="99"/>
     <w:semiHidden/>
     <w:unhideWhenUsed/>
   </w:style>
-  <w:style w:type="paragraph" w:styleId="Header">
+  <w:style w:type="paragraph" w:styleId="En-tte">
     <w:name w:val="header"/>
     <w:basedOn w:val="Normal"/>
-    <w:link w:val="HeaderChar"/>
+    <w:link w:val="En-tteCar"/>
     <w:uiPriority w:val="99"/>
     <w:unhideWhenUsed/>
     <w:rsid w:val="00EE31CE"/>
@@ -6795,17 +6885,17 @@
       <w:spacing w:after="0" w:line="240" w:lineRule="auto"/>
     </w:pPr>
   </w:style>
-  <w:style w:type="character" w:customStyle="1" w:styleId="HeaderChar">
-    <w:name w:val="Header Char"/>
-    <w:basedOn w:val="DefaultParagraphFont"/>
-    <w:link w:val="Header"/>
+  <w:style w:type="character" w:customStyle="1" w:styleId="En-tteCar">
+    <w:name w:val="En-tête Car"/>
+    <w:basedOn w:val="Policepardfaut"/>
+    <w:link w:val="En-tte"/>
     <w:uiPriority w:val="99"/>
     <w:rsid w:val="00EE31CE"/>
   </w:style>
-  <w:style w:type="paragraph" w:styleId="Footer">
+  <w:style w:type="paragraph" w:styleId="Pieddepage">
     <w:name w:val="footer"/>
     <w:basedOn w:val="Normal"/>
-    <w:link w:val="FooterChar"/>
+    <w:link w:val="PieddepageCar"/>
     <w:uiPriority w:val="99"/>
     <w:unhideWhenUsed/>
     <w:rsid w:val="00EE31CE"/>
@@ -6817,10 +6907,10 @@
       <w:spacing w:after="0" w:line="240" w:lineRule="auto"/>
     </w:pPr>
   </w:style>
-  <w:style w:type="character" w:customStyle="1" w:styleId="FooterChar">
-    <w:name w:val="Footer Char"/>
-    <w:basedOn w:val="DefaultParagraphFont"/>
-    <w:link w:val="Footer"/>
+  <w:style w:type="character" w:customStyle="1" w:styleId="PieddepageCar">
+    <w:name w:val="Pied de page Car"/>
+    <w:basedOn w:val="Policepardfaut"/>
+    <w:link w:val="Pieddepage"/>
     <w:uiPriority w:val="99"/>
     <w:rsid w:val="00EE31CE"/>
   </w:style>
@@ -6841,17 +6931,17 @@
   </w:style>
   <w:style w:type="character" w:customStyle="1" w:styleId="s1">
     <w:name w:val="s1"/>
-    <w:basedOn w:val="DefaultParagraphFont"/>
+    <w:basedOn w:val="Policepardfaut"/>
     <w:rsid w:val="00EE31CE"/>
     <w:rPr>
       <w:spacing w:val="-5"/>
     </w:rPr>
   </w:style>
-  <w:style w:type="paragraph" w:styleId="Title">
+  <w:style w:type="paragraph" w:styleId="Titre">
     <w:name w:val="Title"/>
     <w:basedOn w:val="Normal"/>
     <w:next w:val="Normal"/>
-    <w:link w:val="TitleChar"/>
+    <w:link w:val="TitreCar"/>
     <w:autoRedefine/>
     <w:uiPriority w:val="10"/>
     <w:qFormat/>
@@ -6871,10 +6961,10 @@
       <w:szCs w:val="56"/>
     </w:rPr>
   </w:style>
-  <w:style w:type="character" w:customStyle="1" w:styleId="TitleChar">
-    <w:name w:val="Title Char"/>
-    <w:basedOn w:val="DefaultParagraphFont"/>
-    <w:link w:val="Title"/>
+  <w:style w:type="character" w:customStyle="1" w:styleId="TitreCar">
+    <w:name w:val="Titre Car"/>
+    <w:basedOn w:val="Policepardfaut"/>
+    <w:link w:val="Titre"/>
     <w:uiPriority w:val="10"/>
     <w:rsid w:val="0091581C"/>
     <w:rPr>
@@ -6889,7 +6979,7 @@
   </w:style>
   <w:style w:type="paragraph" w:customStyle="1" w:styleId="ESIEA">
     <w:name w:val="ESIEA"/>
-    <w:basedOn w:val="Title"/>
+    <w:basedOn w:val="Titre"/>
     <w:link w:val="ESIEACar"/>
     <w:qFormat/>
     <w:rsid w:val="007C1AA2"/>
@@ -6902,11 +6992,11 @@
       <w:outlineLvl w:val="0"/>
     </w:pPr>
   </w:style>
-  <w:style w:type="paragraph" w:styleId="Subtitle">
+  <w:style w:type="paragraph" w:styleId="Sous-titre">
     <w:name w:val="Subtitle"/>
     <w:basedOn w:val="Normal"/>
     <w:next w:val="Normal"/>
-    <w:link w:val="SubtitleChar"/>
+    <w:link w:val="Sous-titreCar"/>
     <w:autoRedefine/>
     <w:uiPriority w:val="11"/>
     <w:qFormat/>
@@ -6925,7 +7015,7 @@
   </w:style>
   <w:style w:type="character" w:customStyle="1" w:styleId="ESIEACar">
     <w:name w:val="ESIEA Car"/>
-    <w:basedOn w:val="TitleChar"/>
+    <w:basedOn w:val="TitreCar"/>
     <w:link w:val="ESIEA"/>
     <w:rsid w:val="007C1AA2"/>
     <w:rPr>
@@ -6939,11 +7029,11 @@
       <w:u w:color="36A9E1"/>
     </w:rPr>
   </w:style>
-  <w:style w:type="character" w:customStyle="1" w:styleId="Heading1Char">
-    <w:name w:val="Heading 1 Char"/>
-    <w:aliases w:val="Niveau 1 Char"/>
-    <w:basedOn w:val="DefaultParagraphFont"/>
-    <w:link w:val="Heading1"/>
+  <w:style w:type="character" w:customStyle="1" w:styleId="Titre1Car">
+    <w:name w:val="Titre 1 Car"/>
+    <w:aliases w:val="Niveau 1 Car"/>
+    <w:basedOn w:val="Policepardfaut"/>
+    <w:link w:val="Titre1"/>
     <w:uiPriority w:val="9"/>
     <w:rsid w:val="00D51BE1"/>
     <w:rPr>
@@ -6954,10 +7044,10 @@
       <w:u w:color="36A9E1"/>
     </w:rPr>
   </w:style>
-  <w:style w:type="character" w:customStyle="1" w:styleId="SubtitleChar">
-    <w:name w:val="Subtitle Char"/>
-    <w:basedOn w:val="DefaultParagraphFont"/>
-    <w:link w:val="Subtitle"/>
+  <w:style w:type="character" w:customStyle="1" w:styleId="Sous-titreCar">
+    <w:name w:val="Sous-titre Car"/>
+    <w:basedOn w:val="Policepardfaut"/>
+    <w:link w:val="Sous-titre"/>
     <w:uiPriority w:val="11"/>
     <w:rsid w:val="00D51BE1"/>
     <w:rPr>
@@ -6967,11 +7057,11 @@
       <w:sz w:val="36"/>
     </w:rPr>
   </w:style>
-  <w:style w:type="character" w:customStyle="1" w:styleId="Heading2Char">
-    <w:name w:val="Heading 2 Char"/>
-    <w:aliases w:val="Niveau 2 Char"/>
-    <w:basedOn w:val="DefaultParagraphFont"/>
-    <w:link w:val="Heading2"/>
+  <w:style w:type="character" w:customStyle="1" w:styleId="Titre2Car">
+    <w:name w:val="Titre 2 Car"/>
+    <w:aliases w:val="Niveau 2 Car"/>
+    <w:basedOn w:val="Policepardfaut"/>
+    <w:link w:val="Titre2"/>
     <w:uiPriority w:val="9"/>
     <w:rsid w:val="00943A4D"/>
     <w:rPr>
@@ -6982,10 +7072,10 @@
       <w:szCs w:val="26"/>
     </w:rPr>
   </w:style>
-  <w:style w:type="character" w:customStyle="1" w:styleId="Heading3Char">
-    <w:name w:val="Heading 3 Char"/>
-    <w:basedOn w:val="DefaultParagraphFont"/>
-    <w:link w:val="Heading3"/>
+  <w:style w:type="character" w:customStyle="1" w:styleId="Titre3Car">
+    <w:name w:val="Titre 3 Car"/>
+    <w:basedOn w:val="Policepardfaut"/>
+    <w:link w:val="Titre3"/>
     <w:uiPriority w:val="9"/>
     <w:rsid w:val="00EA759C"/>
     <w:rPr>
@@ -6995,9 +7085,9 @@
       <w:szCs w:val="24"/>
     </w:rPr>
   </w:style>
-  <w:style w:type="character" w:styleId="Emphasis">
+  <w:style w:type="character" w:styleId="Accentuation">
     <w:name w:val="Emphasis"/>
-    <w:basedOn w:val="DefaultParagraphFont"/>
+    <w:basedOn w:val="Policepardfaut"/>
     <w:uiPriority w:val="20"/>
     <w:rsid w:val="00CD2FB4"/>
     <w:rPr>
@@ -7005,9 +7095,9 @@
       <w:iCs/>
     </w:rPr>
   </w:style>
-  <w:style w:type="character" w:styleId="SubtleReference">
+  <w:style w:type="character" w:styleId="Rfrencelgre">
     <w:name w:val="Subtle Reference"/>
-    <w:basedOn w:val="DefaultParagraphFont"/>
+    <w:basedOn w:val="Policepardfaut"/>
     <w:uiPriority w:val="31"/>
     <w:rsid w:val="00CD2FB4"/>
     <w:rPr>
@@ -7015,7 +7105,7 @@
       <w:color w:val="5A5A5A" w:themeColor="text1" w:themeTint="A5"/>
     </w:rPr>
   </w:style>
-  <w:style w:type="paragraph" w:styleId="ListParagraph">
+  <w:style w:type="paragraph" w:styleId="Paragraphedeliste">
     <w:name w:val="List Paragraph"/>
     <w:basedOn w:val="Normal"/>
     <w:uiPriority w:val="34"/>
@@ -7032,9 +7122,9 @@
       <w:noProof/>
     </w:rPr>
   </w:style>
-  <w:style w:type="character" w:styleId="BookTitle">
+  <w:style w:type="character" w:styleId="Titredulivre">
     <w:name w:val="Book Title"/>
-    <w:basedOn w:val="DefaultParagraphFont"/>
+    <w:basedOn w:val="Policepardfaut"/>
     <w:uiPriority w:val="33"/>
     <w:rsid w:val="00CD2FB4"/>
     <w:rPr>
@@ -7045,9 +7135,9 @@
       <w:spacing w:val="5"/>
     </w:rPr>
   </w:style>
-  <w:style w:type="character" w:styleId="IntenseReference">
+  <w:style w:type="character" w:styleId="Rfrenceintense">
     <w:name w:val="Intense Reference"/>
-    <w:basedOn w:val="DefaultParagraphFont"/>
+    <w:basedOn w:val="Policepardfaut"/>
     <w:uiPriority w:val="32"/>
     <w:rsid w:val="00CD2FB4"/>
     <w:rPr>
@@ -7058,11 +7148,11 @@
       <w:spacing w:val="5"/>
     </w:rPr>
   </w:style>
-  <w:style w:type="paragraph" w:styleId="IntenseQuote">
+  <w:style w:type="paragraph" w:styleId="Citationintense">
     <w:name w:val="Intense Quote"/>
     <w:basedOn w:val="Normal"/>
     <w:next w:val="Normal"/>
-    <w:link w:val="IntenseQuoteChar"/>
+    <w:link w:val="CitationintenseCar"/>
     <w:uiPriority w:val="30"/>
     <w:qFormat/>
     <w:rsid w:val="007C1AA2"/>
@@ -7081,10 +7171,10 @@
       <w:color w:val="5B9BD5" w:themeColor="accent1"/>
     </w:rPr>
   </w:style>
-  <w:style w:type="character" w:customStyle="1" w:styleId="IntenseQuoteChar">
-    <w:name w:val="Intense Quote Char"/>
-    <w:basedOn w:val="DefaultParagraphFont"/>
-    <w:link w:val="IntenseQuote"/>
+  <w:style w:type="character" w:customStyle="1" w:styleId="CitationintenseCar">
+    <w:name w:val="Citation intense Car"/>
+    <w:basedOn w:val="Policepardfaut"/>
+    <w:link w:val="Citationintense"/>
     <w:uiPriority w:val="30"/>
     <w:rsid w:val="007C1AA2"/>
     <w:rPr>
@@ -7095,7 +7185,7 @@
       <w:sz w:val="24"/>
     </w:rPr>
   </w:style>
-  <w:style w:type="paragraph" w:styleId="ListNumber">
+  <w:style w:type="paragraph" w:styleId="Listenumros">
     <w:name w:val="List Number"/>
     <w:basedOn w:val="Normal"/>
     <w:uiPriority w:val="99"/>
@@ -7110,10 +7200,10 @@
       <w:contextualSpacing/>
     </w:pPr>
   </w:style>
-  <w:style w:type="paragraph" w:styleId="BalloonText">
+  <w:style w:type="paragraph" w:styleId="Textedebulles">
     <w:name w:val="Balloon Text"/>
     <w:basedOn w:val="Normal"/>
-    <w:link w:val="BalloonTextChar"/>
+    <w:link w:val="TextedebullesCar"/>
     <w:uiPriority w:val="99"/>
     <w:semiHidden/>
     <w:unhideWhenUsed/>
@@ -7127,10 +7217,10 @@
       <w:szCs w:val="18"/>
     </w:rPr>
   </w:style>
-  <w:style w:type="character" w:customStyle="1" w:styleId="BalloonTextChar">
-    <w:name w:val="Balloon Text Char"/>
-    <w:basedOn w:val="DefaultParagraphFont"/>
-    <w:link w:val="BalloonText"/>
+  <w:style w:type="character" w:customStyle="1" w:styleId="TextedebullesCar">
+    <w:name w:val="Texte de bulles Car"/>
+    <w:basedOn w:val="Policepardfaut"/>
+    <w:link w:val="Textedebulles"/>
     <w:uiPriority w:val="99"/>
     <w:semiHidden/>
     <w:rsid w:val="0053445C"/>
@@ -7143,7 +7233,7 @@
   </w:style>
   <w:style w:type="paragraph" w:customStyle="1" w:styleId="Niveau3">
     <w:name w:val="Niveau 3"/>
-    <w:basedOn w:val="Heading3"/>
+    <w:basedOn w:val="Titre3"/>
     <w:next w:val="Normal"/>
     <w:link w:val="Niveau3Car"/>
     <w:autoRedefine/>
@@ -7163,7 +7253,7 @@
   </w:style>
   <w:style w:type="character" w:customStyle="1" w:styleId="Niveau3Car">
     <w:name w:val="Niveau 3 Car"/>
-    <w:basedOn w:val="Heading3Char"/>
+    <w:basedOn w:val="Titre3Car"/>
     <w:link w:val="Niveau3"/>
     <w:rsid w:val="00DC6547"/>
     <w:rPr>
@@ -7174,11 +7264,11 @@
       <w:szCs w:val="24"/>
     </w:rPr>
   </w:style>
-  <w:style w:type="paragraph" w:styleId="Quote">
+  <w:style w:type="paragraph" w:styleId="Citation">
     <w:name w:val="Quote"/>
     <w:basedOn w:val="Normal"/>
     <w:next w:val="Normal"/>
-    <w:link w:val="QuoteChar"/>
+    <w:link w:val="CitationCar"/>
     <w:uiPriority w:val="29"/>
     <w:qFormat/>
     <w:rsid w:val="00D51BE1"/>
@@ -7193,10 +7283,10 @@
       <w:color w:val="404040" w:themeColor="text1" w:themeTint="BF"/>
     </w:rPr>
   </w:style>
-  <w:style w:type="character" w:customStyle="1" w:styleId="QuoteChar">
-    <w:name w:val="Quote Char"/>
-    <w:basedOn w:val="DefaultParagraphFont"/>
-    <w:link w:val="Quote"/>
+  <w:style w:type="character" w:customStyle="1" w:styleId="CitationCar">
+    <w:name w:val="Citation Car"/>
+    <w:basedOn w:val="Policepardfaut"/>
+    <w:link w:val="Citation"/>
     <w:uiPriority w:val="29"/>
     <w:rsid w:val="00D51BE1"/>
     <w:rPr>
@@ -7207,9 +7297,9 @@
       <w:sz w:val="24"/>
     </w:rPr>
   </w:style>
-  <w:style w:type="paragraph" w:styleId="TOCHeading">
+  <w:style w:type="paragraph" w:styleId="En-ttedetabledesmatires">
     <w:name w:val="TOC Heading"/>
-    <w:basedOn w:val="Heading1"/>
+    <w:basedOn w:val="Titre1"/>
     <w:next w:val="Normal"/>
     <w:uiPriority w:val="39"/>
     <w:unhideWhenUsed/>
@@ -7231,7 +7321,7 @@
       <w:lang w:eastAsia="fr-FR"/>
     </w:rPr>
   </w:style>
-  <w:style w:type="paragraph" w:styleId="TOC2">
+  <w:style w:type="paragraph" w:styleId="TM2">
     <w:name w:val="toc 2"/>
     <w:basedOn w:val="Normal"/>
     <w:next w:val="Normal"/>
@@ -7244,7 +7334,7 @@
       <w:ind w:left="240"/>
     </w:pPr>
   </w:style>
-  <w:style w:type="paragraph" w:styleId="TOC1">
+  <w:style w:type="paragraph" w:styleId="TM1">
     <w:name w:val="toc 1"/>
     <w:basedOn w:val="Normal"/>
     <w:next w:val="Normal"/>
@@ -7256,7 +7346,7 @@
       <w:spacing w:after="100"/>
     </w:pPr>
   </w:style>
-  <w:style w:type="paragraph" w:styleId="TOC3">
+  <w:style w:type="paragraph" w:styleId="TM3">
     <w:name w:val="toc 3"/>
     <w:basedOn w:val="Normal"/>
     <w:next w:val="Normal"/>
@@ -7269,9 +7359,9 @@
       <w:ind w:left="480"/>
     </w:pPr>
   </w:style>
-  <w:style w:type="character" w:styleId="Hyperlink">
+  <w:style w:type="character" w:styleId="Lienhypertexte">
     <w:name w:val="Hyperlink"/>
-    <w:basedOn w:val="DefaultParagraphFont"/>
+    <w:basedOn w:val="Policepardfaut"/>
     <w:uiPriority w:val="99"/>
     <w:unhideWhenUsed/>
     <w:rsid w:val="00D51BE1"/>
@@ -7280,10 +7370,10 @@
       <w:u w:val="single"/>
     </w:rPr>
   </w:style>
-  <w:style w:type="character" w:customStyle="1" w:styleId="Heading4Char">
-    <w:name w:val="Heading 4 Char"/>
-    <w:basedOn w:val="DefaultParagraphFont"/>
-    <w:link w:val="Heading4"/>
+  <w:style w:type="character" w:customStyle="1" w:styleId="Titre4Car">
+    <w:name w:val="Titre 4 Car"/>
+    <w:basedOn w:val="Policepardfaut"/>
+    <w:link w:val="Titre4"/>
     <w:uiPriority w:val="9"/>
     <w:semiHidden/>
     <w:rsid w:val="00AC4D66"/>
@@ -7295,7 +7385,7 @@
       <w:sz w:val="24"/>
     </w:rPr>
   </w:style>
-  <w:style w:type="paragraph" w:styleId="NoSpacing">
+  <w:style w:type="paragraph" w:styleId="Sansinterligne">
     <w:name w:val="No Spacing"/>
     <w:uiPriority w:val="1"/>
     <w:qFormat/>
@@ -7304,9 +7394,9 @@
       <w:spacing w:after="0"/>
     </w:pPr>
   </w:style>
-  <w:style w:type="table" w:styleId="TableGrid">
+  <w:style w:type="table" w:styleId="Grilledutableau">
     <w:name w:val="Table Grid"/>
-    <w:basedOn w:val="TableNormal"/>
+    <w:basedOn w:val="TableauNormal"/>
     <w:uiPriority w:val="59"/>
     <w:rsid w:val="002D512C"/>
     <w:pPr>
@@ -7323,9 +7413,9 @@
       </w:tblBorders>
     </w:tblPr>
   </w:style>
-  <w:style w:type="table" w:styleId="GridTable4-Accent1">
+  <w:style w:type="table" w:styleId="TableauGrille4-Accentuation1">
     <w:name w:val="Grid Table 4 Accent 1"/>
-    <w:basedOn w:val="TableNormal"/>
+    <w:basedOn w:val="TableauNormal"/>
     <w:uiPriority w:val="49"/>
     <w:pPr>
       <w:spacing w:after="0" w:line="240" w:lineRule="auto"/>
@@ -7398,9 +7488,9 @@
       </w:tcPr>
     </w:tblStylePr>
   </w:style>
-  <w:style w:type="table" w:styleId="GridTable5Dark-Accent1">
+  <w:style w:type="table" w:styleId="TableauGrille5Fonc-Accentuation1">
     <w:name w:val="Grid Table 5 Dark Accent 1"/>
-    <w:basedOn w:val="TableNormal"/>
+    <w:basedOn w:val="TableauNormal"/>
     <w:uiPriority w:val="50"/>
     <w:pPr>
       <w:spacing w:after="0" w:line="240" w:lineRule="auto"/>
@@ -7503,10 +7593,10 @@
       </w:tcPr>
     </w:tblStylePr>
   </w:style>
-  <w:style w:type="paragraph" w:styleId="CommentText">
+  <w:style w:type="paragraph" w:styleId="Commentaire">
     <w:name w:val="annotation text"/>
     <w:basedOn w:val="Normal"/>
-    <w:link w:val="CommentTextChar"/>
+    <w:link w:val="CommentaireCar"/>
     <w:uiPriority w:val="99"/>
     <w:semiHidden/>
     <w:unhideWhenUsed/>
@@ -7518,10 +7608,10 @@
       <w:szCs w:val="20"/>
     </w:rPr>
   </w:style>
-  <w:style w:type="character" w:customStyle="1" w:styleId="CommentTextChar">
-    <w:name w:val="Comment Text Char"/>
-    <w:basedOn w:val="DefaultParagraphFont"/>
-    <w:link w:val="CommentText"/>
+  <w:style w:type="character" w:customStyle="1" w:styleId="CommentaireCar">
+    <w:name w:val="Commentaire Car"/>
+    <w:basedOn w:val="Policepardfaut"/>
+    <w:link w:val="Commentaire"/>
     <w:uiPriority w:val="99"/>
     <w:semiHidden/>
     <w:rPr>
@@ -7531,9 +7621,9 @@
       <w:szCs w:val="20"/>
     </w:rPr>
   </w:style>
-  <w:style w:type="character" w:styleId="CommentReference">
+  <w:style w:type="character" w:styleId="Marquedecommentaire">
     <w:name w:val="annotation reference"/>
-    <w:basedOn w:val="DefaultParagraphFont"/>
+    <w:basedOn w:val="Policepardfaut"/>
     <w:uiPriority w:val="99"/>
     <w:semiHidden/>
     <w:unhideWhenUsed/>
@@ -7542,9 +7632,9 @@
       <w:szCs w:val="16"/>
     </w:rPr>
   </w:style>
-  <w:style w:type="character" w:styleId="PlaceholderText">
+  <w:style w:type="character" w:styleId="Textedelespacerserv">
     <w:name w:val="Placeholder Text"/>
-    <w:basedOn w:val="DefaultParagraphFont"/>
+    <w:basedOn w:val="Policepardfaut"/>
     <w:uiPriority w:val="99"/>
     <w:semiHidden/>
     <w:rsid w:val="00FC30E3"/>
@@ -7552,9 +7642,9 @@
       <w:color w:val="666666"/>
     </w:rPr>
   </w:style>
-  <w:style w:type="table" w:styleId="GridTable1Light-Accent1">
+  <w:style w:type="table" w:styleId="TableauGrille1Clair-Accentuation1">
     <w:name w:val="Grid Table 1 Light Accent 1"/>
-    <w:basedOn w:val="TableNormal"/>
+    <w:basedOn w:val="TableauNormal"/>
     <w:uiPriority w:val="46"/>
     <w:rsid w:val="00B66CEA"/>
     <w:pPr>
@@ -7609,9 +7699,9 @@
       </w:rPr>
     </w:tblStylePr>
   </w:style>
-  <w:style w:type="character" w:styleId="UnresolvedMention">
+  <w:style w:type="character" w:styleId="Mentionnonrsolue">
     <w:name w:val="Unresolved Mention"/>
-    <w:basedOn w:val="DefaultParagraphFont"/>
+    <w:basedOn w:val="Policepardfaut"/>
     <w:uiPriority w:val="99"/>
     <w:semiHidden/>
     <w:unhideWhenUsed/>
@@ -7890,27 +7980,6 @@
 </file>
 
 <file path=customXml/item2.xml><?xml version="1.0" encoding="utf-8"?>
-<?mso-contentType ?>
-<FormTemplates xmlns="http://schemas.microsoft.com/sharepoint/v3/contenttype/forms">
-  <Display>DocumentLibraryForm</Display>
-  <Edit>DocumentLibraryForm</Edit>
-  <New>DocumentLibraryForm</New>
-</FormTemplates>
-</file>
-
-<file path=customXml/item3.xml><?xml version="1.0" encoding="utf-8"?>
-<p:properties xmlns:p="http://schemas.microsoft.com/office/2006/metadata/properties" xmlns:xsi="http://www.w3.org/2001/XMLSchema-instance" xmlns:pc="http://schemas.microsoft.com/office/infopath/2007/PartnerControls">
-  <documentManagement>
-    <TaxCatchAll xmlns="cd2f74b1-2cf3-4348-b38c-a2b4ca267ba6" xsi:nil="true"/>
-    <lcf76f155ced4ddcb4097134ff3c332f xmlns="f66b72e3-dc9e-43cc-bafe-f250266d59f5">
-      <Terms xmlns="http://schemas.microsoft.com/office/infopath/2007/PartnerControls"/>
-    </lcf76f155ced4ddcb4097134ff3c332f>
-    <_Flow_SignoffStatus xmlns="f66b72e3-dc9e-43cc-bafe-f250266d59f5" xsi:nil="true"/>
-  </documentManagement>
-</p:properties>
-</file>
-
-<file path=customXml/item4.xml><?xml version="1.0" encoding="utf-8"?>
 <ct:contentTypeSchema xmlns:ct="http://schemas.microsoft.com/office/2006/metadata/contentType" xmlns:ma="http://schemas.microsoft.com/office/2006/metadata/properties/metaAttributes" ct:_="" ma:_="" ma:contentTypeName="Document" ma:contentTypeID="0x0101009CB24CACC373A942B31A8DD1E7773C4A" ma:contentTypeVersion="17" ma:contentTypeDescription="Crée un document." ma:contentTypeScope="" ma:versionID="c5175d71bb1025c65b9e8d1994a36db4">
   <xsd:schema xmlns:xsd="http://www.w3.org/2001/XMLSchema" xmlns:xs="http://www.w3.org/2001/XMLSchema" xmlns:p="http://schemas.microsoft.com/office/2006/metadata/properties" xmlns:ns2="f66b72e3-dc9e-43cc-bafe-f250266d59f5" xmlns:ns3="cd2f74b1-2cf3-4348-b38c-a2b4ca267ba6" targetNamespace="http://schemas.microsoft.com/office/2006/metadata/properties" ma:root="true" ma:fieldsID="384497a5096c3a49cef66f37adae4908" ns2:_="" ns3:_="">
     <xsd:import namespace="f66b72e3-dc9e-43cc-bafe-f250266d59f5"/>
@@ -8157,6 +8226,27 @@
 </ct:contentTypeSchema>
 </file>
 
+<file path=customXml/item3.xml><?xml version="1.0" encoding="utf-8"?>
+<p:properties xmlns:p="http://schemas.microsoft.com/office/2006/metadata/properties" xmlns:xsi="http://www.w3.org/2001/XMLSchema-instance" xmlns:pc="http://schemas.microsoft.com/office/infopath/2007/PartnerControls">
+  <documentManagement>
+    <TaxCatchAll xmlns="cd2f74b1-2cf3-4348-b38c-a2b4ca267ba6" xsi:nil="true"/>
+    <lcf76f155ced4ddcb4097134ff3c332f xmlns="f66b72e3-dc9e-43cc-bafe-f250266d59f5">
+      <Terms xmlns="http://schemas.microsoft.com/office/infopath/2007/PartnerControls"/>
+    </lcf76f155ced4ddcb4097134ff3c332f>
+    <_Flow_SignoffStatus xmlns="f66b72e3-dc9e-43cc-bafe-f250266d59f5" xsi:nil="true"/>
+  </documentManagement>
+</p:properties>
+</file>
+
+<file path=customXml/item4.xml><?xml version="1.0" encoding="utf-8"?>
+<?mso-contentType ?>
+<FormTemplates xmlns="http://schemas.microsoft.com/sharepoint/v3/contenttype/forms">
+  <Display>DocumentLibraryForm</Display>
+  <Edit>DocumentLibraryForm</Edit>
+  <New>DocumentLibraryForm</New>
+</FormTemplates>
+</file>
+
 <file path=customXml/itemProps1.xml><?xml version="1.0" encoding="utf-8"?>
 <ds:datastoreItem xmlns:ds="http://schemas.openxmlformats.org/officeDocument/2006/customXml" ds:itemID="{67946E20-1A8D-413C-A70C-A7A6EB56CF5F}">
   <ds:schemaRefs>
@@ -8166,9 +8256,20 @@
 </file>
 
 <file path=customXml/itemProps2.xml><?xml version="1.0" encoding="utf-8"?>
-<ds:datastoreItem xmlns:ds="http://schemas.openxmlformats.org/officeDocument/2006/customXml" ds:itemID="{E6864DC1-0082-4E34-85D6-4FA18F222E94}">
+<ds:datastoreItem xmlns:ds="http://schemas.openxmlformats.org/officeDocument/2006/customXml" ds:itemID="{C7321DFE-C9E2-487B-AD09-84F09B0389D5}">
   <ds:schemaRefs>
-    <ds:schemaRef ds:uri="http://schemas.microsoft.com/sharepoint/v3/contenttype/forms"/>
+    <ds:schemaRef ds:uri="http://schemas.microsoft.com/office/2006/metadata/contentType"/>
+    <ds:schemaRef ds:uri="http://schemas.microsoft.com/office/2006/metadata/properties/metaAttributes"/>
+    <ds:schemaRef ds:uri="http://www.w3.org/2001/XMLSchema"/>
+    <ds:schemaRef ds:uri="http://schemas.microsoft.com/office/2006/metadata/properties"/>
+    <ds:schemaRef ds:uri="f66b72e3-dc9e-43cc-bafe-f250266d59f5"/>
+    <ds:schemaRef ds:uri="cd2f74b1-2cf3-4348-b38c-a2b4ca267ba6"/>
+    <ds:schemaRef ds:uri="http://schemas.microsoft.com/office/2006/documentManagement/types"/>
+    <ds:schemaRef ds:uri="http://schemas.microsoft.com/office/infopath/2007/PartnerControls"/>
+    <ds:schemaRef ds:uri="http://schemas.openxmlformats.org/package/2006/metadata/core-properties"/>
+    <ds:schemaRef ds:uri="http://purl.org/dc/elements/1.1/"/>
+    <ds:schemaRef ds:uri="http://purl.org/dc/terms/"/>
+    <ds:schemaRef ds:uri="http://schemas.microsoft.com/internal/obd"/>
   </ds:schemaRefs>
 </ds:datastoreItem>
 </file>
@@ -8185,20 +8286,9 @@
 </file>
 
 <file path=customXml/itemProps4.xml><?xml version="1.0" encoding="utf-8"?>
-<ds:datastoreItem xmlns:ds="http://schemas.openxmlformats.org/officeDocument/2006/customXml" ds:itemID="{C7321DFE-C9E2-487B-AD09-84F09B0389D5}">
+<ds:datastoreItem xmlns:ds="http://schemas.openxmlformats.org/officeDocument/2006/customXml" ds:itemID="{E6864DC1-0082-4E34-85D6-4FA18F222E94}">
   <ds:schemaRefs>
-    <ds:schemaRef ds:uri="http://schemas.microsoft.com/office/2006/metadata/contentType"/>
-    <ds:schemaRef ds:uri="http://schemas.microsoft.com/office/2006/metadata/properties/metaAttributes"/>
-    <ds:schemaRef ds:uri="http://www.w3.org/2001/XMLSchema"/>
-    <ds:schemaRef ds:uri="http://schemas.microsoft.com/office/2006/metadata/properties"/>
-    <ds:schemaRef ds:uri="f66b72e3-dc9e-43cc-bafe-f250266d59f5"/>
-    <ds:schemaRef ds:uri="cd2f74b1-2cf3-4348-b38c-a2b4ca267ba6"/>
-    <ds:schemaRef ds:uri="http://schemas.microsoft.com/office/2006/documentManagement/types"/>
-    <ds:schemaRef ds:uri="http://schemas.microsoft.com/office/infopath/2007/PartnerControls"/>
-    <ds:schemaRef ds:uri="http://schemas.openxmlformats.org/package/2006/metadata/core-properties"/>
-    <ds:schemaRef ds:uri="http://purl.org/dc/elements/1.1/"/>
-    <ds:schemaRef ds:uri="http://purl.org/dc/terms/"/>
-    <ds:schemaRef ds:uri="http://schemas.microsoft.com/internal/obd"/>
+    <ds:schemaRef ds:uri="http://schemas.microsoft.com/sharepoint/v3/contenttype/forms"/>
   </ds:schemaRefs>
 </ds:datastoreItem>
 </file>
</xml_diff>

<commit_message>
Rapport v2 : grille de réglages expliquée, règle à un écart-type sourcée (conseil IA), images en fin de réponse ; notebook et README alignés
</commit_message>
<xml_diff>
--- a/questionnaire/v2/rapport_v2.docx
+++ b/questionnaire/v2/rapport_v2.docx
@@ -1422,14 +1422,10 @@
     </w:p>
     <w:p>
       <w:r>
-        <w:t>Choix du système. Le meilleur NDCG moyen est (50, 15), à 0,151 avec un écart-type de 0,004. Mais quatre réglages sont à moins d'un écart-type de ce maximum, donc on ne peut pas les départager sur le critère principal : (30, 10), (50, 15), (50, 20) et (100, 35). Prendre juste le maximum, ce serait choisir sur du bruit. On a donc utilisé la règle « à un écart-type », qui est la règle habituelle pour choisir un modèle en validation croisée : parmi les réglages qu'on ne peut pas départager, on prend celui qui e</w:t>
-      </w:r>
-      <w:r>
-        <w:t>st le meilleur sur un second critère. Avec la RMSE comme second critère, ce serait (100, 35), mais il ne propose plus que 126 films différents. Avec la variété, c'est (30, 10) : 289 films différents contre 219 pour (50, 15), et les films les moins populaires des quatre (129 avis en médiane contre 134). On a pris la variété, parce que le biais de popularité est la faiblesse principale du filtrage collaboratif d'après le cours, et parce que la RMSE n'est chez nous qu'un contrôle : aucun réglage ne la fait pas</w:t>
-      </w:r>
-      <w:r>
-        <w:t>ser sous la simple moyenne de l'utilisateur.</w:t>
-      </w:r>
+        <w:t>Choix du système. Le meilleur NDCG moyen est (50, 15), à 0,151 avec un écart-type de 0,004. Mais quatre réglages sont à moins d'un écart-type de ce maximum, donc on ne peut pas les départager sur le critère principal : (30, 10), (50, 15), (50, 20) et (100, 35). Prendre juste le maximum, ce serait choisir sur du bruit. On a donc pris comme marge l'écart-type mesuré entre les 5 parts, c'est le bruit de la mesure : tous les réglages à moins d'un écart-type du meilleur sont considérés à égalité, et on les départage sur un second critère. Cette façon de faire est une règle connue de la validation croisée, la règle « à un écart-type » (one-standard-error rule, Hastie, Tibshirani et Friedman, The Elements of Statistical Learning, 2009, chapitre 7). C'est un conseil de l'IA, basé sur cette source. Dans la règle d'origine, on prend ensuite le modèle le plus simple. Nous, on prend le meilleur sur un second critère. Avec la RMSE comme second critère, ce serait (100, 35), mais il ne propose plus que 126 films différents. Avec la variété, c'est (30, 10) : 289 films différents contre 219 pour (50, 15), et les films les moins populaires des quatre (129 avis en médiane contre 134). On a pris la variété, parce que le biais de popularité est la faiblesse principale du filtrage collaboratif d'après le cours, et parce que la RMSE n'est chez nous qu'un contrôle : aucun réglage ne la fait passer sous la simple moyenne de l'utilisateur.</w:t>
+      </w:r>
+      <w:r/>
+      <w:r/>
     </w:p>
     <w:tbl>
       <w:tblPr>
@@ -2157,6 +2153,14 @@
     <w:p>
       <w:r>
         <w:t>Figure 1 : les courbes de la validation croisée. À gauche le NDCG@10 en fonction de k, une courbe par valeur de min_voisins, avec les barres d'erreur qui donnent l'écart entre les 5 parts. Chaque courbe monte puis redescend, et le sommet se décale vers la droite quand le seuil augmente : c'est bien le rapport seuil / voisins qui compte. Les barres sont petites, le résultat est stable. À droite la RMSE en fonction de k, une seule courbe puisque le seuil n'a pas d'effet dessus.</w:t>
+      </w:r>
+    </w:p>
+    <w:p>
+      <w:r>
+        <w:t>Figure 2 : le compromis entre qualité et variété, un point par réglage. En abscisse le nombre de films différents proposés sur les 671 listes de validation, en ordonnée le NDCG@10, et la couleur donne la popularité médiane des films proposés, du violet (films quasi inconnus) au jaune (que des classiques). Plus le seuil monte, plus on part vers la gauche et vers le jaune. L'étoile rouge est le (30, 10) retenu : sur le plateau, c'est le point le plus à droite. (50, 15) et (100, 35) sont à sa gauche, aussi bon</w:t>
+      </w:r>
+      <w:r>
+        <w:t>s mais moins variés. (25, 8) à sa droite est encore plus varié mais un peu moins bon.</w:t>
       </w:r>
     </w:p>
     <w:p>
@@ -2199,14 +2203,6 @@
             </a:graphic>
           </wp:inline>
         </w:drawing>
-      </w:r>
-    </w:p>
-    <w:p>
-      <w:r>
-        <w:t>Figure 2 : le compromis entre qualité et variété, un point par réglage. En abscisse le nombre de films différents proposés sur les 671 listes de validation, en ordonnée le NDCG@10, et la couleur donne la popularité médiane des films proposés, du violet (films quasi inconnus) au jaune (que des classiques). Plus le seuil monte, plus on part vers la gauche et vers le jaune. L'étoile rouge est le (30, 10) retenu : sur le plateau, c'est le point le plus à droite. (50, 15) et (100, 35) sont à sa gauche, aussi bon</w:t>
-      </w:r>
-      <w:r>
-        <w:t>s mais moins variés. (25, 8) à sa droite est encore plus varié mais un peu moins bon.</w:t>
       </w:r>
     </w:p>
     <w:p>
@@ -3186,6 +3182,14 @@
     </w:p>
     <w:p>
       <w:r>
+        <w:t>La seconde compare le repère « films les plus notés » et les quatre systèmes, mesurés de la même façon en validation croisée : à gauche le NDCG@10 (plus haut = mieux), au milieu la RMSE (plus bas = mieux), à droite la popularité médiane des films proposés, notre mesure du biais de popularité (plus bas = moins de biais, la ligne pointillée est le film médian du catalogue, 3 avis). On y voit les constats en un coup d'œil : le user-based brut et l'item-based par somme dépassent le repère sur le top 10, le cent</w:t>
+      </w:r>
+      <w:r>
+        <w:t>ré est juste au-dessus, le centrage et l'item-based améliorent la RMSE, et l'item-based par somme est celui qui propose les films les moins populaires parmi les systèmes qui font de bonnes listes. Le repère, lui, propose les films les plus populaires de tous (160 avis en médiane) et seulement 38 films différents pour 671 utilisateurs.</w:t>
+      </w:r>
+    </w:p>
+    <w:p>
+      <w:r>
         <w:rPr>
           <w:noProof/>
         </w:rPr>
@@ -3229,14 +3233,6 @@
     </w:p>
     <w:p>
       <w:r>
-        <w:t>La seconde compare le repère « films les plus notés » et les quatre systèmes, mesurés de la même façon en validation croisée : à gauche le NDCG@10 (plus haut = mieux), au milieu la RMSE (plus bas = mieux), à droite la popularité médiane des films proposés, notre mesure du biais de popularité (plus bas = moins de biais, la ligne pointillée est le film médian du catalogue, 3 avis). On y voit les constats en un coup d'œil : le user-based brut et l'item-based par somme dépassent le repère sur le top 10, le cent</w:t>
-      </w:r>
-      <w:r>
-        <w:t>ré est juste au-dessus, le centrage et l'item-based améliorent la RMSE, et l'item-based par somme est celui qui propose les films les moins populaires parmi les systèmes qui font de bonnes listes. Le repère, lui, propose les films les plus populaires de tous (160 avis en médiane) et seulement 38 films différents pour 671 utilisateurs.</w:t>
-      </w:r>
-    </w:p>
-    <w:p>
-      <w:r>
         <w:rPr>
           <w:noProof/>
         </w:rPr>
@@ -4518,6 +4514,11 @@
     </w:p>
     <w:p>
       <w:r>
+        <w:t>La seconde image compare, genre par genre, la part des films qui portent ce genre dans le catalogue (gris clair), dans les avis du train c'est-à-dire ce que les gens notent réellement (gris), dans nos recommandations (bleu) et dans celles de l'item-based (orange). Un film pouvant avoir plusieurs genres, les parts ne font pas 100. On y voit les barres bleues qui dépassent largement le catalogue pour Crime, Thriller et Drama, et qui s'effondrent pour Comedy, Romance, Horror et Documentary.</w:t>
+      </w:r>
+    </w:p>
+    <w:p>
+      <w:r>
         <w:rPr>
           <w:noProof/>
         </w:rPr>
@@ -4556,11 +4557,6 @@
             </a:graphic>
           </wp:inline>
         </w:drawing>
-      </w:r>
-    </w:p>
-    <w:p>
-      <w:r>
-        <w:t>La seconde image compare, genre par genre, la part des films qui portent ce genre dans le catalogue (gris clair), dans les avis du train c'est-à-dire ce que les gens notent réellement (gris), dans nos recommandations (bleu) et dans celles de l'item-based (orange). Un film pouvant avoir plusieurs genres, les parts ne font pas 100. On y voit les barres bleues qui dépassent largement le catalogue pour Crime, Thriller et Drama, et qui s'effondrent pour Comedy, Romance, Horror et Documentary.</w:t>
       </w:r>
     </w:p>
     <w:p>

</xml_diff>

<commit_message>
Rapport v2 : relecture complète, chiffres alignés sur le notebook (item-based, genres, test/validation), note 0 vérifiée, renvoi en avant retiré
</commit_message>
<xml_diff>
--- a/questionnaire/v2/rapport_v2.docx
+++ b/questionnaire/v2/rapport_v2.docx
@@ -553,7 +553,7 @@
     </w:p>
     <w:p>
       <w:r>
-        <w:t>On a mis 0, comme dans le cours. Avec un 0, un film que l'un des deux utilisateurs n'a pas vu ne compte pas dans le produit scalaire, donc seuls les films vus par les deux entrent dans la similarité. C'est exactement ce qu'on veut.</w:t>
+        <w:t>On a mis 0, comme dans le cours. Avec un 0, un film que l'un des deux utilisateurs n'a pas vu ne compte pas dans le produit scalaire, donc seuls les films vus par les deux entrent dans la similarité. C'est exactement ce qu'on veut. Avant ça, on a vérifié que personne n'a jamais mis la note 0 : la note minimale du dataset est 0,5. Sinon un vrai 0 et un « pas vu » se seraient confondus.</w:t>
       </w:r>
     </w:p>
     <w:p>
@@ -603,7 +603,7 @@
         </w:numPr>
       </w:pPr>
       <w:r>
-        <w:t>le centrage puis 0 : on retire à chaque utilisateur sa note moyenne, puis on met 0, qui devient une valeur neutre entre « aimé » et « pas aimé ». C'est proche de la corrélation de Pearson. On l'a gardé comme amélioration pour l'exercice 4, où on l'a mesuré : la RMSE passe de 0,999 à 0,932 mais le top 10 ne s'améliore pas</w:t>
+        <w:t>le centrage puis 0 : on retire à chaque utilisateur sa note moyenne, puis on met 0, qui devient une valeur neutre entre « aimé » et « pas aimé ». C'est proche de la corrélation de Pearson. On l'a gardé de côté comme amélioration possible</w:t>
       </w:r>
     </w:p>
     <w:p>
@@ -2737,7 +2737,7 @@
     <w:p/>
     <w:p>
       <w:r>
-        <w:t xml:space="preserve">Ce que ça donne. Le centrage améliore nettement la prédiction des notes : la RMSE passe de 1,031 à 0,971 en validation et de 1,011 à 0,947 sur le test, la MAE de 0,778 à 0,721. Le système bat enfin la moyenne de l'utilisateur. C'est bien le gain attendu, le défaut de l'exercice 2 est corrigé. Par contre il ne fait pas de meilleures listes : en validation le NDCG baisse de 0,150 à 0,120, un écart bien supérieur au bruit entre parts (0,002 à 0,008), et changer le seuil ne le rattrape pas (0,126 avec 7, 0,070 </w:t>
+        <w:t xml:space="preserve">Ce que ça donne. Le centrage améliore nettement la prédiction des notes : la RMSE passe de 1,031 à 0,971 en validation et de 1,011 à 0,947 sur le test, la MAE de 0,778 à 0,721 sur le test. Le système bat enfin la moyenne de l'utilisateur. C'est bien le gain attendu, le défaut de l'exercice 2 est corrigé. Par contre il ne fait pas de meilleures listes : en validation le NDCG baisse de 0,150 à 0,120, un écart bien supérieur au bruit entre parts (0,002 à 0,008), et changer le seuil ne le rattrape pas (0,126 avec 7, 0,070 </w:t>
       </w:r>
       <w:r>
         <w:t>avec 13). Sur le test, une seule mesure, le centré est aussi derrière : 0,191 contre 0,201 (précision 0,144 contre 0,152, rappel 0,144 contre 0,167). Sur le biais de popularité, le centrage n'aide pas non plus : les films proposés sont plus populaires (166 avis en médiane contre 151 sur le test) et moins variés (269 films différents contre 337). Pour comparer, le film médian du catalogue a 3 avis : les deux systèmes en sont loin, le seuil de voisins les y pousse.</w:t>
@@ -2763,7 +2763,7 @@
     </w:p>
     <w:p>
       <w:r>
-        <w:t>Classement par note prédite, comme le cours : A obtient (0,4×5 + 0,3×5 + 0,3×4) / (0,4 + 0,3 + 0,3) = 4,7 et B obtient 0,1×5 / 0,1 = 5,0. B passe devant alors qu'il n'est relié qu'à un seul favori, et faiblement. C'est le même piège qu'avec les films vus par un seul voisin. Le NDCG plafonne à 0,066 en validation.</w:t>
+        <w:t>Classement par note prédite, comme le cours : A obtient (0,4×5 + 0,3×5 + 0,3×4) / (0,4 + 0,3 + 0,3) = 4,7 et B obtient 0,1×5 / 0,1 = 5,0. B passe devant alors qu'il n'est relié qu'à un seul favori, et faiblement. C'est le même piège qu'avec les films vus par un seul voisin. Le NDCG reste entre 0,059 et 0,066 en validation, selon le réglage.</w:t>
       </w:r>
     </w:p>
     <w:p>
@@ -3558,7 +3558,7 @@
     </w:p>
     <w:p>
       <w:r>
-        <w:t>Le système reste personnalisé malgré ça : sept dixièmes de chaque liste sont propres à l'utilisateur, trois dixièmes viennent du top des ventes.</w:t>
+        <w:t>Le système reste personnalisé malgré ça : sept dixièmes de chaque liste sont propres à l'utilisateur, trois dixièmes viennent du top des ventes (en moyenne, 3 des 10 films d'une liste sont aussi dans les 10 films les plus notés).</w:t>
       </w:r>
     </w:p>
     <w:p>
@@ -3578,14 +3578,10 @@
     </w:p>
     <w:p>
       <w:r>
-        <w:t>Ce qu'on a fait, et ce qu'on ferait. On a déjà tenu compte de ce biais au moment de choisir le réglage : à qualité égale, on a pris le plus varié, (30, 10) plutôt que (50, 15), et sur le test ça donne 337 films différents au lieu de 249 et une popularité médiane de 151 au lieu de 159. Ça ne suffit pas : le biais reste massif, parce que le seuil de voisins, quel qu'il soit, filtre par la popularité. Aller plus loin sur le seuil coûte de la qualité : (25, 8) propose 397 films différents et (20, 7) 427, avec d</w:t>
-      </w:r>
-      <w:r>
-        <w:t xml:space="preserve">es films moins populaires (138 et 133 avis en médiane), pour un NDCG un peu plus bas en validation (0,146 et 0,143 contre 0,150). Pour aller plus loin sans casser la qualité, deux pistes mesurées ou simples : l'item-based du bonus, qui fait mieux en NDCG avec des films moins populaires (128 avis en médiane, 410 films différents), et réserver une place ou deux de la liste à une suggestion plus inattendue, parmi les films moins vus que les voisins ont aimés, pour jouer sur la sérendipité dont parle le cours. </w:t>
-      </w:r>
-      <w:r>
-        <w:t>Le biais de popularité n'est donc pas une fatalité du système, c'est un réglage qu'on assume pour ce TP et qu'on corrigerait en production.</w:t>
-      </w:r>
+        <w:t>Ce qu'on a fait, et ce qu'on ferait. On a déjà tenu compte de ce biais au moment de choisir le réglage : à qualité égale, on a pris le plus varié, (30, 10) plutôt que (50, 15), et sur le test ça donne 337 films différents au lieu de 249 et une popularité médiane de 151 au lieu de 159. Ça ne suffit pas : le biais reste massif, parce que le seuil de voisins, quel qu'il soit, filtre par la popularité. Aller plus loin sur le seuil coûte de la qualité : sur le test, (25, 8) propose 397 films différents et (20, 7) 427, avec des films moins populaires (138 et 133 avis en médiane), mais en validation leur NDCG est un peu plus bas (0,146 et 0,143 contre 0,150). Pour aller plus loin sans casser la qualité, deux pistes : l'item-based du bonus, qui fait mieux en NDCG avec des films moins populaires (128 avis en médiane, 410 films différents), et réserver une place ou deux de la liste à une suggestion plus inattendue, parmi les films moins vus que les voisins ont aimés, pour jouer sur la sérendipité dont parle le cours. Le biais de popularité n'est donc pas une fatalité du système, c'est un réglage qu'on assume pour ce TP et qu'on corrigerait en production.</w:t>
+      </w:r>
+      <w:r/>
+      <w:r/>
     </w:p>
     <w:p>
       <w:r>
@@ -3777,7 +3773,7 @@
           </w:tcPr>
           <w:p>
             <w:r>
-              <w:t>11,6</w:t>
+              <w:t>11,5</w:t>
             </w:r>
           </w:p>
         </w:tc>
@@ -3849,8 +3845,7 @@
         <w:t xml:space="preserve">Mais à l'échelle des thèmes, c'est plus concentré. L'exemple de l'utilisateur 60 le montre. Ses préférés vont du Parrain à Castle in the Sky en passant par Gattaca et La vie est belle. Son top 10 est cohérent avec ce profil, mais sept films sur dix sont des polars (Crime ou Thriller) et </w:t>
       </w:r>
       <w:r>
-        <w:lastRenderedPageBreak/>
-        <w:t>huit sur dix des drames : Pulp Fiction, The Usual Suspects, The Dark Knight, The Big Lebowski, Les Évadés, GoodFellas, City of God. Les genres sont variés sur le papier, le ton l'est moins. C'est la conséquence du seuil de voisins : il ne laisse passer que les classiques que beaucoup de voisins ont vus, et les classiques aimés par les amateurs de cinéma d'auteur sont souvent des polars.</w:t>
+        <w:t>huit sur dix des drames : Pulp Fiction, The Usual Suspects, The Dark Knight, The Big Lebowski, The Shawshank Redemption, GoodFellas, City of God. Les genres sont variés sur le papier, le ton l'est moins. C'est la conséquence du seuil de voisins : il ne laisse passer que les classiques que beaucoup de voisins ont vus, et les classiques aimés par les amateurs de cinéma d'auteur sont souvent des polars.</w:t>
       </w:r>
     </w:p>
     <w:tbl>
@@ -4891,7 +4886,7 @@
     <w:p/>
     <w:p>
       <w:r>
-        <w:t>Fight Club, Star Wars, Se7en et Il faut sauver le soldat Ryan d'un côté, Le Parrain, Memento, 2001 et Blade Runner de l'autre. Les deux reçoivent un Seigneur des anneaux, mais pas le même. C'est là qu'on voit les sept dixièmes personnalisés. Les trois dixièmes communs sont les classiques que le seuil de voisins fait remonter chez presque tout le monde, et qui ne tombent pas ici dans la même liste.</w:t>
+        <w:t>Fight Club, Star Wars, Se7en et Il faut sauver le soldat Ryan d'un côté, Le Parrain, Memento, 2001 et Blade Runner de l'autre. Les deux reçoivent un Seigneur des anneaux, mais pas le même. C'est là qu'on voit les sept dixièmes personnalisés. Les trois dixièmes communs sont les classiques que le seuil de voisins fait remonter chez presque tout le monde, et ici, par hasard, ce ne sont pas les mêmes chez les deux.</w:t>
       </w:r>
     </w:p>
     <w:p>

</xml_diff>

<commit_message>
Rapport v2 : question 12 remplacée par la version page d'accueil, maquette insérée
</commit_message>
<xml_diff>
--- a/questionnaire/v2/rapport_v2.docx
+++ b/questionnaire/v2/rapport_v2.docx
@@ -4950,95 +4950,200 @@
     </w:p>
     <w:p>
       <w:r>
-        <w:t>Ce que nos mesures disent du système actuel. Il fait de bonnes listes (NDCG 0,201, devant le top des ventes), mais il prédit mal les notes (RMSE 1,011, moins bien que la moyenne de l'utilisateur), il ne propose que des films très vus (96 % du catalogue jamais proposé, 23 films font la moitié des recommandations), trois dixièmes de chaque liste sont communs à tout le monde, et il ne sait rien faire pour un nouvel utilisateur ou un nouveau film. Chaque amélioration ci-dessous répond à l'un de ces points.</w:t>
-      </w:r>
-    </w:p>
-    <w:p>
-      <w:r>
-        <w:t>1. Changer de base, ou combiner : l'item-based. C'est l'amélioration déjà mesurée. Avec le classement par somme, il fait mieux sur tout : NDCG 0,249 contre 0,201, RMSE 0,915 contre 1,011, 410 films différents contre 337, films moins populaires. Il est aussi plus facile à expliquer à l'utilisateur, « parce que vous avez aimé Le Parrain ». Les deux systèmes ne proposent pas les mêmes films, donc la première chose à tester est un hybride qui mélange les deux listes ou pondère leurs scores, comme le cours le dé</w:t>
-      </w:r>
-      <w:r>
-        <w:t>crit.</w:t>
-      </w:r>
-    </w:p>
-    <w:p>
-      <w:r>
-        <w:t xml:space="preserve">2. Une part de découverte. Le biais de popularité est la faiblesse principale, et on a vu qu'on ne le corrige pas par le seul choix du réglage : prendre le plus varié des réglages équivalents ne fait passer la couverture que de 3 % à 4 % du catalogue. Deux leviers simples : pénaliser le score des films très vus, et réserver une ou deux places du top 10 à une suggestion moins attendue, tirée au hasard parmi les films moins vus que les voisins ont aimés. Un peu d'aléatoire contrôlé, pas n'importe quel film : </w:t>
-      </w:r>
-      <w:r>
-        <w:t>ça donne une chance aux 96 % du catalogue jamais proposés, ça joue sur la sérendipité dont parle le cours, et ça permet de mesurer ensuite si ces suggestions plaisent. À suivre avec la couverture et la personnalisation à côté du NDCG, comme on l'a fait ici.</w:t>
-      </w:r>
-    </w:p>
-    <w:p>
-      <w:r>
-        <w:t>3. Un filtre par contenu. Le collaboratif ne peut rien pour un nouvel utilisateur sans avis ni pour un nouveau film sans note. Le catalogue a des genres, des résumés, des acteurs : un filtrage par contenu recommande des films qui ressemblent à ceux qu'on a aimés, sans avoir besoin des autres utilisateurs. En production on le combinerait en commutation : contenu pour les nouveaux, collaboratif pour les utilisateurs connus. Il servirait aussi à diversifier une liste, par exemple en évitant sept polars sur dix</w:t>
-      </w:r>
-      <w:r>
-        <w:t xml:space="preserve"> pour l'utilisateur 60.</w:t>
-      </w:r>
-    </w:p>
-    <w:p>
-      <w:r>
-        <w:lastRenderedPageBreak/>
-        <w:t>4. Passer à une approche par modèle, comme le cours le propose pour le problème de la prédiction. Nos systèmes à base de voisins ne font que compter et moyenner, rien n'est appris. Le cours présente la suite logique : concevoir un modèle qui apprend sur les notes connues pour prédire toutes les cases de la matrice. Deux formes.</w:t>
-      </w:r>
-    </w:p>
-    <w:p>
-      <w:r>
-        <w:t xml:space="preserve">La factorisation matricielle : on suppose que les goûts tiennent en quelques dimensions cachées (par exemple « histoire » contre « romance » dans l'exemple du cours), chaque utilisateur et chaque film deviennent un petit vecteur de coordonnées sur ces dimensions, et la note prédite est le produit des deux. Les vecteurs sont appris pour coller aux notes connues. Le niveau de chaque utilisateur et de chaque film est appris avec, il n'y a plus d'imputation ni de similarité à calculer, et ça s'entraîne sur des </w:t>
-      </w:r>
-      <w:r>
-        <w:t>millions d'avis.</w:t>
-      </w:r>
-    </w:p>
-    <w:p>
-      <w:r>
-        <w:t>Le machine learning au sens large : un modèle, par exemple un réseau de neurones, entraîné à prédire la note à partir de l'utilisateur, du film et de tout ce qu'on sait d'eux (comportement, genres, métadonnées). C'est le schéma du cours : informations sur les utilisateurs, comportement, informations sur les éléments, un modèle, une prédiction. C'est aussi la façon naturelle de combiner collaboratif et contenu dans un seul système.</w:t>
-      </w:r>
-    </w:p>
-    <w:p>
-      <w:r>
-        <w:t>On ne les a pas mesurés dans ce TP, qui reste sur le user-based, mais c'est ce qu'on ferait en premier pour la prédiction de notes : le user-based sans centrage est le pire prédicteur qu'on ait (RMSE 1,011, moins bien que la moyenne de l'utilisateur), le centrage donne 0,947 et l'item-based 0,915, et un modèle appris est la voie pour aller en dessous.</w:t>
-      </w:r>
-    </w:p>
-    <w:p>
-      <w:r>
-        <w:t>5. Mesurer comme en vrai. Notre test cache des avis au hasard. En production on prédit l'avenir, donc il faudrait cacher les avis les plus récents (les dates existent dans les données). Et la vraie mesure finale est le test A/B : une partie des utilisateurs reçoit le nouveau système, et on compare ce qu'ils regardent réellement, avec des signaux implicites (clics, visionnages, temps passé) plutôt que des notes que peu de gens donnent.</w:t>
-      </w:r>
-    </w:p>
-    <w:p>
-      <w:r>
-        <w:t>6. Tenir la charge. Une matrice de similarité de 671 utilisateurs se recalcule en une seconde. Avec des millions d'utilisateurs, il faut des matrices creuses, un recalcul périodique plutôt qu'à chaque requête, et des listes précalculées. L'item-based a l'avantage que la similarité entre films change lentement.</w:t>
-      </w:r>
-    </w:p>
-    <w:p>
-      <w:r>
-        <w:t>Le schéma déposé résume le système qu'on construirait : trois sources de candidats à gauche (le user-based du TP, l'item-based, le contenu pour le démarrage à froid), un assemblage hybride au milieu où la note prédite viendrait d'un modèle appris, une correction du top 10 à droite (pénalité de popularité, place pour une suggestion inattendue), et en bas la boucle de mesure, hors ligne puis en ligne, qui décide de ce qu'on garde.</w:t>
-      </w:r>
-    </w:p>
-    <w:p>
-      <w:r>
         <w:rPr>
-          <w:noProof/>
+          <w:b/>
         </w:rPr>
-        <w:lastRenderedPageBreak/>
+        <w:t>Ce qu'on sait de notre système.</w:t>
+      </w:r>
+      <w:r>
+        <w:rPr>
+          <w:b w:val="0"/>
+        </w:rPr>
+        <w:t xml:space="preserve"> Il fait de bonnes listes (NDCG 0,201, devant le top des ventes) mais il a trois limites qu'on a mesurées. Il ne propose que des films très vus : 96 % du catalogue n'apparaît jamais et 23 films font la moitié des recommandations. Il ne sait rien faire pour un nouvel utilisateur ni pour un nouveau film. Et il prédit mal les notes (RMSE 1,011, moins bien que la moyenne de l'utilisateur). Améliorer le système, ce n'est pas empiler des méthodes, c'est répondre à ces trois limites en gardant ce qui marche.</w:t>
+      </w:r>
+    </w:p>
+    <w:p>
+      <w:r>
+        <w:rPr>
+          <w:b/>
+        </w:rPr>
+        <w:t>L'idée générale : plusieurs rangées, chacune avec sa raison d'être.</w:t>
+      </w:r>
+      <w:r>
+        <w:rPr>
+          <w:b w:val="0"/>
+        </w:rPr>
+        <w:t xml:space="preserve"> Un service comme Netflix ne montre pas une liste de 10 films mais une page avec plusieurs rangées, et chaque rangée n'a pas la même logique. C'est la façon la plus simple de combiner nos systèmes au lieu d'en choisir un seul, et c'est l'hybride du cours, en version « mélange ». Voilà la page qu'on construirait, et d'où vient chaque rangée.</w:t>
+      </w:r>
+    </w:p>
+    <w:p>
+      <w:r>
+        <w:rPr>
+          <w:b w:val="0"/>
+        </w:rPr>
+        <w:t xml:space="preserve">• </w:t>
+      </w:r>
+      <w:r>
+        <w:rPr>
+          <w:b/>
+        </w:rPr>
+        <w:t>« Parce que vous avez aimé Le Parrain »</w:t>
+      </w:r>
+      <w:r>
+        <w:rPr>
+          <w:b w:val="0"/>
+        </w:rPr>
+        <w:t xml:space="preserve"> : l'item-based avec le classement par somme. C'est notre meilleur système sur tout (NDCG 0,249, films moins populaires, 410 films différents) et il a un avantage que le user-based n'a pas : on peut expliquer chaque recommandation, ce qui donne confiance.</w:t>
+      </w:r>
+    </w:p>
+    <w:p>
+      <w:r>
+        <w:rPr>
+          <w:b w:val="0"/>
+        </w:rPr>
+        <w:t xml:space="preserve">• </w:t>
+      </w:r>
+      <w:r>
+        <w:rPr>
+          <w:b/>
+        </w:rPr>
+        <w:t>« Les gens qui ont vos goûts ont aimé »</w:t>
+      </w:r>
+      <w:r>
+        <w:rPr>
+          <w:b w:val="0"/>
+        </w:rPr>
+        <w:t xml:space="preserve"> : le user-based du TP. Il propose des films différents de l'item-based, donc les deux rangées ne font pas doublon.</w:t>
+      </w:r>
+    </w:p>
+    <w:p>
+      <w:r>
+        <w:rPr>
+          <w:b w:val="0"/>
+        </w:rPr>
+        <w:t xml:space="preserve">• </w:t>
+      </w:r>
+      <w:r>
+        <w:rPr>
+          <w:b/>
+        </w:rPr>
+        <w:t>« À découvrir »</w:t>
+      </w:r>
+      <w:r>
+        <w:rPr>
+          <w:b w:val="0"/>
+        </w:rPr>
+        <w:t xml:space="preserve"> : la réponse au biais de popularité. Une rangée de films moins vus, aimés par les voisins mais qui ne passent pas le seuil, avec une part d'aléatoire pour ne pas toujours montrer les mêmes. C'est un aléatoire contrôlé, pas n'importe quel film. Ça donne une chance aux 96 % du catalogue jamais proposés, et ça joue sur la sérendipité dont parle le cours, celle qu'on a perdue avec le seuil de voisins.</w:t>
+      </w:r>
+    </w:p>
+    <w:p>
+      <w:r>
+        <w:rPr>
+          <w:b w:val="0"/>
+        </w:rPr>
+        <w:t xml:space="preserve">• </w:t>
+      </w:r>
+      <w:r>
+        <w:rPr>
+          <w:b/>
+        </w:rPr>
+        <w:t>« Tendances » et « À revoir »</w:t>
+      </w:r>
+      <w:r>
+        <w:rPr>
+          <w:b w:val="0"/>
+        </w:rPr>
+        <w:t xml:space="preserve"> : deux rangées sans aucun algorithme. Les films les plus notés du moment, qui font déjà 0,147 de NDCG à eux seuls, et les films que l'utilisateur a bien notés il y a longtemps. Ça ne coûte rien, ça marche pour tout le monde, et ça fait une base solide sur laquelle les rangées personnalisées viennent se poser.</w:t>
+      </w:r>
+    </w:p>
+    <w:p>
+      <w:r>
+        <w:rPr>
+          <w:b/>
+        </w:rPr>
+        <w:t>Le nouvel utilisateur.</w:t>
+      </w:r>
+      <w:r>
+        <w:rPr>
+          <w:b w:val="0"/>
+        </w:rPr>
+        <w:t xml:space="preserve"> Le filtrage collaboratif ne peut rien pour lui, c'est le démarrage à froid du cours. À l'inscription, on lui fait choisir quelques films ou quelques genres qu'il aime, et une rangée par contenu prend le relais : des films qui ressemblent à ceux qu'il a choisis, par leurs genres, acteurs et résumé dans le catalogue, sans avoir besoin des autres utilisateurs. Dès qu'il a noté une vingtaine de films, le collaboratif prend le dessus. C'est la commutation du cours. Pour un nouveau film sans note, même chose : c'est le contenu qui le fait apparaître.</w:t>
+      </w:r>
+    </w:p>
+    <w:p>
+      <w:r>
+        <w:rPr>
+          <w:b/>
+        </w:rPr>
+        <w:t>Le temps.</w:t>
+      </w:r>
+      <w:r>
+        <w:rPr>
+          <w:b w:val="0"/>
+        </w:rPr>
+        <w:t xml:space="preserve"> Nos données ont la date de chaque avis et on ne s'en est pas servi. Les goûts changent : ce qu'on aimait à quinze ans ne dit pas ce qu'on aime à trente. En production, on donnerait plus de poids aux avis récents pour construire le profil, et on évaluerait comme en vrai, en cachant les avis les plus récents plutôt qu'au hasard, puisque le système doit prédire l'avenir et pas le passé.</w:t>
+      </w:r>
+    </w:p>
+    <w:p>
+      <w:r>
+        <w:rPr>
+          <w:b/>
+        </w:rPr>
+        <w:t>Les notes.</w:t>
+      </w:r>
+      <w:r>
+        <w:rPr>
+          <w:b w:val="0"/>
+        </w:rPr>
+        <w:t xml:space="preserve"> Notre système est fait pour classer, pas pour prédire une note. Si l'application affiche une note prédite, on ne garderait pas le user-based brut : le centrage donne 0,947, l'item-based 0,915, et un modèle appris comme la factorisation matricielle du cours fait mieux encore. Sinon on ne s'en occupe pas, l'utilisateur voit des rangées, jamais une note.</w:t>
+      </w:r>
+    </w:p>
+    <w:p>
+      <w:r>
+        <w:rPr>
+          <w:b/>
+        </w:rPr>
+        <w:t>Comment savoir si c'est mieux.</w:t>
+      </w:r>
+      <w:r>
+        <w:rPr>
+          <w:b w:val="0"/>
+        </w:rPr>
+        <w:t xml:space="preserve"> Nos métriques hors ligne ont une limite : elles ne récompensent que les films déjà notés, donc elles ne peuvent pas mesurer une découverte. La seule vraie mesure, c'est le test A/B : une partie des utilisateurs reçoit la nouvelle page, et on regarde ce qu'ils regardent réellement, combien de temps, s'ils reviennent. On garderait à côté les mesures qu'on a utilisées ici, couverture et personnalisation, pour vérifier que la rangée « À découvrir » fait bien son travail.</w:t>
+      </w:r>
+    </w:p>
+    <w:p>
+      <w:r>
+        <w:rPr>
+          <w:b/>
+        </w:rPr>
+        <w:t>La figure déposée</w:t>
+      </w:r>
+      <w:r>
+        <w:rPr>
+          <w:b w:val="0"/>
+        </w:rPr>
+        <w:t xml:space="preserve"> est la maquette de cette page d'accueil, avec pour chaque rangée le système qui la remplit et le chiffre du TP qui justifie sa place.</w:t>
+      </w:r>
+    </w:p>
+    <w:p>
+      <w:r>
         <w:drawing>
-          <wp:inline distT="0" distB="0" distL="0" distR="0" wp14:anchorId="1224AEEA" wp14:editId="24570114">
-            <wp:extent cx="5760000" cy="2936778"/>
-            <wp:effectExtent l="0" t="0" r="0" b="0"/>
+          <wp:inline xmlns:a="http://schemas.openxmlformats.org/drawingml/2006/main" xmlns:pic="http://schemas.openxmlformats.org/drawingml/2006/picture">
+            <wp:extent cx="5760720" cy="3190553"/>
             <wp:docPr id="10" name="Picture 10"/>
             <wp:cNvGraphicFramePr>
-              <a:graphicFrameLocks xmlns:a="http://schemas.openxmlformats.org/drawingml/2006/main" noChangeAspect="1"/>
+              <a:graphicFrameLocks noChangeAspect="1"/>
             </wp:cNvGraphicFramePr>
-            <a:graphic xmlns:a="http://schemas.openxmlformats.org/drawingml/2006/main">
+            <a:graphic>
               <a:graphicData uri="http://schemas.openxmlformats.org/drawingml/2006/picture">
-                <pic:pic xmlns:pic="http://schemas.openxmlformats.org/drawingml/2006/picture">
+                <pic:pic>
                   <pic:nvPicPr>
-                    <pic:cNvPr id="0" name="ex5_q12_schema_production.png"/>
+                    <pic:cNvPr id="0" name="ex5_q12_page_accueil.png"/>
                     <pic:cNvPicPr/>
                   </pic:nvPicPr>
                   <pic:blipFill>
-                    <a:blip r:embed="rId22"/>
+                    <a:blip r:embed="rId30"/>
                     <a:stretch>
                       <a:fillRect/>
                     </a:stretch>
@@ -5046,11 +5151,9 @@
                   <pic:spPr>
                     <a:xfrm>
                       <a:off x="0" y="0"/>
-                      <a:ext cx="5760000" cy="2936778"/>
+                      <a:ext cx="5760720" cy="3190553"/>
                     </a:xfrm>
-                    <a:prstGeom prst="rect">
-                      <a:avLst/>
-                    </a:prstGeom>
+                    <a:prstGeom prst="rect"/>
                   </pic:spPr>
                 </pic:pic>
               </a:graphicData>

</xml_diff>

<commit_message>
Rapport v2 : question 12 resserrée, factorisation et charge intégrées comme amélioration du user-based, copie du rendu à jour
</commit_message>
<xml_diff>
--- a/questionnaire/v2/rapport_v2.docx
+++ b/questionnaire/v2/rapport_v2.docx
@@ -4959,7 +4959,7 @@
         <w:rPr>
           <w:b w:val="0"/>
         </w:rPr>
-        <w:t xml:space="preserve"> Il fait de bonnes listes (NDCG 0,201, devant le top des ventes) mais il a trois limites qu'on a mesurées. Il ne propose que des films très vus : 96 % du catalogue n'apparaît jamais et 23 films font la moitié des recommandations. Il ne sait rien faire pour un nouvel utilisateur ni pour un nouveau film. Et il prédit mal les notes (RMSE 1,011, moins bien que la moyenne de l'utilisateur). Améliorer le système, ce n'est pas empiler des méthodes, c'est répondre à ces trois limites en gardant ce qui marche.</w:t>
+        <w:t xml:space="preserve"> Il fait de bonnes listes (NDCG 0,201, devant le top des ventes), mais on a mesuré trois limites. Il ne propose que des films très vus : 96 % du catalogue n'apparaît jamais et 23 films font la moitié des recommandations. Il ne sait rien faire pour un nouvel utilisateur ni pour un nouveau film. Et il prédit mal les notes (RMSE 1,011, moins bien que la moyenne de l'utilisateur). On ne veut pas empiler des méthodes, on veut répondre à ces trois limites en gardant ce qui marche.</w:t>
       </w:r>
     </w:p>
     <w:p>
@@ -4967,13 +4967,13 @@
         <w:rPr>
           <w:b/>
         </w:rPr>
-        <w:t>L'idée générale : plusieurs rangées, chacune avec sa raison d'être.</w:t>
+        <w:t>L'idée : une page avec plusieurs rangées.</w:t>
       </w:r>
       <w:r>
         <w:rPr>
           <w:b w:val="0"/>
         </w:rPr>
-        <w:t xml:space="preserve"> Un service comme Netflix ne montre pas une liste de 10 films mais une page avec plusieurs rangées, et chaque rangée n'a pas la même logique. C'est la façon la plus simple de combiner nos systèmes au lieu d'en choisir un seul, et c'est l'hybride du cours, en version « mélange ». Voilà la page qu'on construirait, et d'où vient chaque rangée.</w:t>
+        <w:t xml:space="preserve"> Un service comme Netflix ne montre pas une liste de 10 films mais plusieurs rangées, et chaque rangée a sa logique. C'est la façon la plus simple de combiner nos systèmes au lieu d'en choisir un seul, c'est l'hybride « mélange » du cours. Voilà la page qu'on ferait.</w:t>
       </w:r>
     </w:p>
     <w:p>
@@ -4993,7 +4993,7 @@
         <w:rPr>
           <w:b w:val="0"/>
         </w:rPr>
-        <w:t xml:space="preserve"> : l'item-based avec le classement par somme. C'est notre meilleur système sur tout (NDCG 0,249, films moins populaires, 410 films différents) et il a un avantage que le user-based n'a pas : on peut expliquer chaque recommandation, ce qui donne confiance.</w:t>
+        <w:t xml:space="preserve"> : l'item-based avec le classement par somme, notre meilleur système (NDCG 0,249, 410 films différents, films moins populaires). En plus, chaque recommandation s'explique, et ça donne confiance.</w:t>
       </w:r>
     </w:p>
     <w:p>
@@ -5013,7 +5013,7 @@
         <w:rPr>
           <w:b w:val="0"/>
         </w:rPr>
-        <w:t xml:space="preserve"> : le user-based du TP. Il propose des films différents de l'item-based, donc les deux rangées ne font pas doublon.</w:t>
+        <w:t xml:space="preserve"> : le user-based du TP. Ses listes ne sont pas celles de l'item-based, donc pas de doublon.</w:t>
       </w:r>
     </w:p>
     <w:p>
@@ -5033,7 +5033,7 @@
         <w:rPr>
           <w:b w:val="0"/>
         </w:rPr>
-        <w:t xml:space="preserve"> : la réponse au biais de popularité. Une rangée de films moins vus, aimés par les voisins mais qui ne passent pas le seuil, avec une part d'aléatoire pour ne pas toujours montrer les mêmes. C'est un aléatoire contrôlé, pas n'importe quel film. Ça donne une chance aux 96 % du catalogue jamais proposés, et ça joue sur la sérendipité dont parle le cours, celle qu'on a perdue avec le seuil de voisins.</w:t>
+        <w:t xml:space="preserve"> : la réponse au biais de popularité. Des films moins vus que les voisins ont aimés mais qui ne passent pas le seuil, avec un peu d'aléatoire pour ne pas montrer toujours les mêmes. Un aléatoire contrôlé, pas n'importe quel film. Ça donne une chance aux 96 % du catalogue jamais proposés et ça ramène la sérendipité du cours, celle qu'on a perdue avec le seuil de voisins.</w:t>
       </w:r>
     </w:p>
     <w:p>
@@ -5053,7 +5053,7 @@
         <w:rPr>
           <w:b w:val="0"/>
         </w:rPr>
-        <w:t xml:space="preserve"> : deux rangées sans aucun algorithme. Les films les plus notés du moment, qui font déjà 0,147 de NDCG à eux seuls, et les films que l'utilisateur a bien notés il y a longtemps. Ça ne coûte rien, ça marche pour tout le monde, et ça fait une base solide sur laquelle les rangées personnalisées viennent se poser.</w:t>
+        <w:t xml:space="preserve"> : deux rangées sans algorithme. Les films les plus notés, qui font déjà 0,147 de NDCG tout seuls, et les films que l'utilisateur a bien notés il y a longtemps. Ça ne coûte rien et ça marche pour tout le monde.</w:t>
       </w:r>
     </w:p>
     <w:p>
@@ -5067,7 +5067,7 @@
         <w:rPr>
           <w:b w:val="0"/>
         </w:rPr>
-        <w:t xml:space="preserve"> Le filtrage collaboratif ne peut rien pour lui, c'est le démarrage à froid du cours. À l'inscription, on lui fait choisir quelques films ou quelques genres qu'il aime, et une rangée par contenu prend le relais : des films qui ressemblent à ceux qu'il a choisis, par leurs genres, acteurs et résumé dans le catalogue, sans avoir besoin des autres utilisateurs. Dès qu'il a noté une vingtaine de films, le collaboratif prend le dessus. C'est la commutation du cours. Pour un nouveau film sans note, même chose : c'est le contenu qui le fait apparaître.</w:t>
+        <w:t xml:space="preserve"> Le collaboratif ne peut rien pour lui, c'est le démarrage à froid du cours. À l'inscription on lui fait choisir quelques films ou quelques genres, et une rangée par contenu prend le relais : des films qui ressemblent à ceux qu'il a choisis (genres, acteurs, résumé), sans avoir besoin des autres utilisateurs. Après quelques dizaines de notes, le collaboratif prend le dessus, c'est la commutation du cours. Un nouveau film sans note, pareil : c'est le contenu qui le fait apparaître.</w:t>
       </w:r>
     </w:p>
     <w:p>
@@ -5081,7 +5081,7 @@
         <w:rPr>
           <w:b w:val="0"/>
         </w:rPr>
-        <w:t xml:space="preserve"> Nos données ont la date de chaque avis et on ne s'en est pas servi. Les goûts changent : ce qu'on aimait à quinze ans ne dit pas ce qu'on aime à trente. En production, on donnerait plus de poids aux avis récents pour construire le profil, et on évaluerait comme en vrai, en cachant les avis les plus récents plutôt qu'au hasard, puisque le système doit prédire l'avenir et pas le passé.</w:t>
+        <w:t xml:space="preserve"> On a la date de chaque avis et on ne s'en est pas servi. Les goûts changent. En production on donnerait plus de poids aux avis récents, et on évaluerait en cachant les avis les plus récents plutôt qu'au hasard, parce que le système doit prédire l'avenir, pas le passé.</w:t>
       </w:r>
     </w:p>
     <w:p>
@@ -5089,13 +5089,13 @@
         <w:rPr>
           <w:b/>
         </w:rPr>
-        <w:t>Les notes.</w:t>
+        <w:t>Ce qu'on changerait dans le user-based lui-même.</w:t>
       </w:r>
       <w:r>
         <w:rPr>
           <w:b w:val="0"/>
         </w:rPr>
-        <w:t xml:space="preserve"> Notre système est fait pour classer, pas pour prédire une note. Si l'application affiche une note prédite, on ne garderait pas le user-based brut : le centrage donne 0,947, l'item-based 0,915, et un modèle appris comme la factorisation matricielle du cours fait mieux encore. Sinon on ne s'en occupe pas, l'utilisateur voit des rangées, jamais une note.</w:t>
+        <w:t xml:space="preserve"> Ses défauts viennent du même endroit : la matrice des avis est vide à 98,6 % et on a mis 0 dans les trous. Les similarités reposent sur quelques films en commun, et la note prédite est une moyenne de voisins qui ignore le niveau de l'utilisateur. Le cours donne la suite logique : au lieu d'imputer les cases vides, on les apprend. C'est la factorisation matricielle : chaque utilisateur et chaque film reçoivent quelques coordonnées cachées (« histoire » contre « romance » dans l'exemple du cours), ajustées pour coller aux notes connues, et la note prédite est le produit des deux. Plus d'imputation, plus de similarité à calculer, et le niveau de chacun est appris avec. Ça tient aussi la charge : notre matrice de similarité entre 671 utilisateurs se recalcule en une seconde, mais avec des millions d'utilisateurs on ne peut plus la refaire à chaque requête. Avec un modèle appris on garde un petit vecteur par utilisateur et par film, on réentraîne la nuit et on précalcule les rangées. Si l'application affichait des notes prédites, c'est ce modèle qu'on mettrait à la place du user-based brut, là où le centrage (0,947) et l'item-based (0,915) ne font qu'une partie du chemin.</w:t>
       </w:r>
     </w:p>
     <w:p>
@@ -5109,7 +5109,7 @@
         <w:rPr>
           <w:b w:val="0"/>
         </w:rPr>
-        <w:t xml:space="preserve"> Nos métriques hors ligne ont une limite : elles ne récompensent que les films déjà notés, donc elles ne peuvent pas mesurer une découverte. La seule vraie mesure, c'est le test A/B : une partie des utilisateurs reçoit la nouvelle page, et on regarde ce qu'ils regardent réellement, combien de temps, s'ils reviennent. On garderait à côté les mesures qu'on a utilisées ici, couverture et personnalisation, pour vérifier que la rangée « À découvrir » fait bien son travail.</w:t>
+        <w:t xml:space="preserve"> Nos métriques hors ligne ne récompensent que les films déjà notés, donc elles ne voient pas une découverte. La vraie mesure, c'est le test A/B : une partie des utilisateurs reçoit la nouvelle page et on regarde ce qu'ils regardent vraiment, combien de temps, s'ils reviennent. On garde à côté la couverture et la personnalisation, pour vérifier que la rangée « À découvrir » fait son travail.</w:t>
       </w:r>
     </w:p>
     <w:p>
@@ -5123,7 +5123,7 @@
         <w:rPr>
           <w:b w:val="0"/>
         </w:rPr>
-        <w:t xml:space="preserve"> est la maquette de cette page d'accueil, avec pour chaque rangée le système qui la remplit et le chiffre du TP qui justifie sa place.</w:t>
+        <w:t xml:space="preserve"> est la maquette de cette page, avec pour chaque rangée le système qui la remplit et le chiffre du TP qui justifie sa place.</w:t>
       </w:r>
     </w:p>
     <w:p>

</xml_diff>

<commit_message>
Rapport v2 : questions 6 et 7 resserrées (explications de figures, bonus item-based condensé), copie du rendu à jour
</commit_message>
<xml_diff>
--- a/questionnaire/v2/rapport_v2.docx
+++ b/questionnaire/v2/rapport_v2.docx
@@ -643,11 +643,9 @@
     </w:p>
     <w:p>
       <w:r>
-        <w:t>Deux hyperparamètres. Le premier est k, le nombre de voisins qu'on moyenne. Le deuxième, min_voisins, on l'a ajouté nous-mêmes : c'est le nombre de voisins qui doivent avoir vu un film pour qu'on ait le droit de le recommander. Sans ce seuil, le top 10 était plein de films vus par un seul voisin qui avait mis 5, et un film noté 5 sur un seul avis passait devant Pulp Fiction à 4,6 sur 21 avis. On sait que ce seuil a un effet de bord : plus il est haut, plus il ne laisse passer que des films très vus, donc il</w:t>
-      </w:r>
-      <w:r>
-        <w:t xml:space="preserve"> renforce le biais de popularité dont parle le cours. Du coup on a suivi, pour chaque réglage, la popularité des films proposés et le nombre de films différents, en plus des métriques. Au départ on avait mis k = 30 et min_voisins = 3 un peu au doigt mouillé. Pour aller plus vite, on écrit un réglage (k, min_voisins).</w:t>
-      </w:r>
+        <w:t>Deux hyperparamètres. Le premier est k, le nombre de voisins qu'on moyenne. Le deuxième, min_voisins, on l'a ajouté nous-mêmes : c'est le nombre de voisins qui doivent avoir vu un film pour qu'on ait le droit de le recommander. Sans ce seuil, le top 10 était plein de films vus par un seul voisin qui avait mis 5, et un film noté 5 sur un seul avis passait devant Pulp Fiction à 4,6 sur 21 avis. On sait que ce seuil a un effet de bord : plus il est haut, plus il ne laisse passer que des films très vus, donc il renforce le biais de popularité dont parle le cours. Du coup on a suivi, pour chaque réglage, la popularité des films proposés et le nombre de films différents, en plus des métriques. Au départ on avait mis k = 30 et min_voisins = 3 un peu au doigt mouillé. Dans la suite, un réglage s'écrit (k, min_voisins).</w:t>
+      </w:r>
+      <w:r/>
     </w:p>
     <w:p>
       <w:r>
@@ -1422,7 +1420,7 @@
     </w:p>
     <w:p>
       <w:r>
-        <w:t>Choix du système. Le meilleur NDCG moyen est (50, 15), à 0,151 avec un écart-type de 0,004. Mais quatre réglages sont à moins d'un écart-type de ce maximum, donc on ne peut pas les départager sur le critère principal : (30, 10), (50, 15), (50, 20) et (100, 35). Prendre juste le maximum, ce serait choisir sur du bruit. On a donc pris comme marge l'écart-type mesuré entre les 5 parts, c'est le bruit de la mesure : tous les réglages à moins d'un écart-type du meilleur sont considérés à égalité, et on les départage sur un second critère. Cette façon de faire est une règle connue de la validation croisée, la règle « à un écart-type » (one-standard-error rule, Hastie, Tibshirani et Friedman, The Elements of Statistical Learning, 2009, chapitre 7). C'est un conseil de l'IA, basé sur cette source. Dans la règle d'origine, on prend ensuite le modèle le plus simple. Nous, on prend le meilleur sur un second critère. Avec la RMSE comme second critère, ce serait (100, 35), mais il ne propose plus que 126 films différents. Avec la variété, c'est (30, 10) : 289 films différents contre 219 pour (50, 15), et les films les moins populaires des quatre (129 avis en médiane contre 134). On a pris la variété, parce que le biais de popularité est la faiblesse principale du filtrage collaboratif d'après le cours, et parce que la RMSE n'est chez nous qu'un contrôle : aucun réglage ne la fait passer sous la simple moyenne de l'utilisateur.</w:t>
+        <w:t>Choix du système. Le meilleur NDCG moyen est (50, 15), à 0,151 avec un écart-type de 0,004. Mais quatre réglages sont à moins d'un écart-type de ce maximum, donc on ne peut pas les départager sur le critère principal : (30, 10), (50, 15), (50, 20) et (100, 35). Prendre juste le maximum, ce serait choisir sur du bruit. On a donc pris comme marge l'écart-type mesuré entre les 5 parts : tous les réglages à moins d'un écart-type du meilleur sont à égalité, et on les départage sur un second critère. C'est une règle connue de la validation croisée, la règle « à un écart-type » (one-standard-error rule, Hastie, Tibshirani et Friedman, The Elements of Statistical Learning, 2009, chapitre 7), un conseil de l'IA basé sur cette source. La règle d'origine prend ensuite le modèle le plus simple, nous on prend le meilleur sur un second critère. Le tableau ci-dessous montre les quatre : avec la RMSE ce serait (100, 35), qui ne propose plus que 126 films différents. Avec la variété, c'est (30, 10) : 289 films différents contre 219 pour (50, 15), et les films les moins populaires des quatre. On a pris la variété, parce que le biais de popularité est la faiblesse principale du filtrage collaboratif d'après le cours, et parce que la RMSE n'est chez nous qu'un contrôle : aucun réglage ne la fait passer sous la simple moyenne de l'utilisateur.</w:t>
       </w:r>
       <w:r/>
       <w:r/>
@@ -2142,7 +2140,7 @@
     <w:p/>
     <w:p>
       <w:r>
-        <w:t>Le système réglé passe devant le repère qui donne les films les plus notés à tout le monde, et le test confirme que la variété n'a rien coûté : (30, 10) fait même un peu mieux que (50, 15) sur le top 10 (0,201 contre 0,191), avec une RMSE un peu moins bonne (1,011 contre 0,999). Le prix se voit dans les deux dernières lignes : en exigeant qu'un film ait été vu par 10 des 30 voisins, on ne garde que des films très vus, 151 avis en médiane alors que le film médian du catalogue en a 3. On l'assume pour ce TP.</w:t>
+        <w:t>Le système réglé passe nettement devant le repère des films les plus notés, et le test confirme que la variété n'a rien coûté : (30, 10) fait même un peu mieux que (50, 15) sur le top 10. Le prix se voit dans les deux dernières lignes : en exigeant qu'un film ait été vu par 10 des 30 voisins, on ne garde que des films très vus, 151 avis en médiane quand le film médian du catalogue en a 3. On l'assume pour ce TP.</w:t>
       </w:r>
     </w:p>
     <w:p>
@@ -2152,16 +2150,14 @@
     </w:p>
     <w:p>
       <w:r>
-        <w:t>Figure 1 : les courbes de la validation croisée. À gauche le NDCG@10 en fonction de k, une courbe par valeur de min_voisins, avec les barres d'erreur qui donnent l'écart entre les 5 parts. Chaque courbe monte puis redescend, et le sommet se décale vers la droite quand le seuil augmente : c'est bien le rapport seuil / voisins qui compte. Les barres sont petites, le résultat est stable. À droite la RMSE en fonction de k, une seule courbe puisque le seuil n'a pas d'effet dessus.</w:t>
-      </w:r>
-    </w:p>
-    <w:p>
-      <w:r>
-        <w:t>Figure 2 : le compromis entre qualité et variété, un point par réglage. En abscisse le nombre de films différents proposés sur les 671 listes de validation, en ordonnée le NDCG@10, et la couleur donne la popularité médiane des films proposés, du violet (films quasi inconnus) au jaune (que des classiques). Plus le seuil monte, plus on part vers la gauche et vers le jaune. L'étoile rouge est le (30, 10) retenu : sur le plateau, c'est le point le plus à droite. (50, 15) et (100, 35) sont à sa gauche, aussi bon</w:t>
-      </w:r>
-      <w:r>
-        <w:t>s mais moins variés. (25, 8) à sa droite est encore plus varié mais un peu moins bon.</w:t>
-      </w:r>
+        <w:t>Figure 1 : les courbes de la validation croisée. À gauche le NDCG@10 selon k, une courbe par valeur de min_voisins, avec l'écart entre les 5 parts en barre d'erreur. Chaque courbe monte puis redescend, et le sommet se décale vers la droite quand le seuil augmente : c'est le rapport seuil / voisins qui compte. À droite la RMSE selon k, une seule courbe puisque le seuil n'a pas d'effet dessus.</w:t>
+      </w:r>
+    </w:p>
+    <w:p>
+      <w:r>
+        <w:t>Figure 2 : un point par réglage, le nombre de films différents proposés en abscisse, le NDCG@10 en ordonnée, et la couleur pour la popularité médiane des films proposés (violet : films peu vus, jaune : que des classiques). Plus le seuil monte, plus on part vers la gauche et vers le jaune. L'étoile rouge est le (30, 10) retenu : sur le plateau, c'est le point le plus à droite. (50, 15) et (100, 35) sont aussi bons mais moins variés, (25, 8) est plus varié mais un peu moins bon.</w:t>
+      </w:r>
+      <w:r/>
     </w:p>
     <w:p>
       <w:r>
@@ -2258,20 +2254,18 @@
     </w:p>
     <w:p>
       <w:r>
-        <w:t>Le choix : le centrage des notes. On l'a choisi parce qu'il vise le défaut mesuré à l'exercice 2 : notre système ignore le niveau de chaque utilisateur. Un utilisateur sévère reçoit les notes de voisins plus généreux, et une moyenne pondérée reste toujours entre la plus basse et la plus haute note des voisins, donc elle ne peut pas suivre quelqu'un qui note toujours haut ou toujours bas. Résultat : une RMSE de 1,011, moins bonne que si on prédisait simplement la moyenne de l'utilisateur (0,954).</w:t>
-      </w:r>
-    </w:p>
-    <w:p>
-      <w:r>
-        <w:t>Ce que fait le centrage. Avant de calculer les similarités, on retire à chaque utilisateur sa note moyenne. Un 4 chez quelqu'un qui met 4,5 partout devient -0,5, un 4 chez quelqu'un qui met 2,5 partout devient +1,5. Deux utilisateurs sont alors similaires s'ils aiment et détestent les mêmes films, pas s'ils notent au même niveau. Pour prédire, on moyenne ces écarts chez les voisins puis on rajoute la moyenne de l'utilisateur, qui retrouve son niveau. Avec des notes centrées, une similarité peut devenir néga</w:t>
-      </w:r>
-      <w:r>
-        <w:t>tive (goûts opposés), et on la ramène à 0 pour ne pas prendre ces gens comme voisins : 54 % des paires d'utilisateurs gardent une similarité positive, contre 82 % sans centrage. Les voisins choisis ne sont donc plus les mêmes.</w:t>
-      </w:r>
-    </w:p>
-    <w:p>
-      <w:r>
-        <w:t>Comparaison, sur le même réglage (30, 10). D'abord en validation croisée (mêmes 5 parts qu'à la question précédente), puis une seule fois sur le test. Le seuil de 10 ayant été réglé pour le système brut, on a aussi essayé 7 et 13 pour le centré. On met en première ligne le repère sans modèle qui propose à tout le monde les 10 films les plus notés qu'il n'a pas vus : il n'a pas de RMSE puisqu'il ne prédit aucune note, et c'est le niveau à dépasser.</w:t>
+        <w:t>Le choix : le centrage des notes. On l'a choisi parce qu'il vise le défaut mesuré à l'exercice 2 : notre système ignore le niveau de chaque utilisateur. Une moyenne pondérée reste entre la plus basse et la plus haute note des voisins, donc elle ne peut pas suivre quelqu'un qui note toujours haut ou toujours bas. Résultat : une RMSE de 1,011, moins bonne que si on prédisait simplement la moyenne de l'utilisateur (0,954).</w:t>
+      </w:r>
+    </w:p>
+    <w:p>
+      <w:r>
+        <w:t>Ce que fait le centrage. Avant de calculer les similarités, on retire à chaque utilisateur sa note moyenne. Un 4 chez quelqu'un qui met 4,5 partout devient -0,5, un 4 chez quelqu'un qui met 2,5 partout devient +1,5. Deux utilisateurs sont alors similaires s'ils aiment et détestent les mêmes films, pas s'ils notent au même niveau. Pour prédire, on moyenne ces écarts chez les voisins puis on rajoute la moyenne de l'utilisateur. Avec des notes centrées, une similarité peut devenir négative (goûts opposés) : on la ramène à 0 pour ne pas prendre ces gens comme voisins. 54 % des paires d'utilisateurs gardent une similarité positive, contre 82 % sans centrage, donc les voisins choisis ne sont plus les mêmes.</w:t>
+      </w:r>
+      <w:r/>
+    </w:p>
+    <w:p>
+      <w:r>
+        <w:t>Comparaison, sur le même réglage (30, 10). D'abord en validation croisée (mêmes 5 parts qu'à la question précédente), puis une seule fois sur le test. Le seuil de 10 ayant été réglé pour le système brut, on a aussi essayé 7 et 13 pour le centré. La première ligne est le repère sans modèle, les 10 films les plus notés que l'utilisateur n'a pas vus : pas de RMSE puisqu'il ne prédit aucune note, et c'est le niveau à dépasser.</w:t>
       </w:r>
     </w:p>
     <w:tbl>
@@ -2737,11 +2731,9 @@
     <w:p/>
     <w:p>
       <w:r>
-        <w:t xml:space="preserve">Ce que ça donne. Le centrage améliore nettement la prédiction des notes : la RMSE passe de 1,031 à 0,971 en validation et de 1,011 à 0,947 sur le test, la MAE de 0,778 à 0,721 sur le test. Le système bat enfin la moyenne de l'utilisateur. C'est bien le gain attendu, le défaut de l'exercice 2 est corrigé. Par contre il ne fait pas de meilleures listes : en validation le NDCG baisse de 0,150 à 0,120, un écart bien supérieur au bruit entre parts (0,002 à 0,008), et changer le seuil ne le rattrape pas (0,126 avec 7, 0,070 </w:t>
-      </w:r>
-      <w:r>
-        <w:t>avec 13). Sur le test, une seule mesure, le centré est aussi derrière : 0,191 contre 0,201 (précision 0,144 contre 0,152, rappel 0,144 contre 0,167). Sur le biais de popularité, le centrage n'aide pas non plus : les films proposés sont plus populaires (166 avis en médiane contre 151 sur le test) et moins variés (269 films différents contre 337). Pour comparer, le film médian du catalogue a 3 avis : les deux systèmes en sont loin, le seuil de voisins les y pousse.</w:t>
-      </w:r>
+        <w:t>Ce que ça donne. Le centrage améliore nettement la prédiction des notes : la RMSE passe de 1,031 à 0,971 en validation et de 1,011 à 0,947 sur le test. Le système bat enfin la moyenne de l'utilisateur, le défaut de l'exercice 2 est corrigé. Par contre il ne fait pas de meilleures listes : en validation le NDCG baisse de 0,150 à 0,120, bien plus que le bruit entre parts (0,002 à 0,008), et changer le seuil ne rattrape rien (0,126 avec 7, 0,070 avec 13). Sur le test, le centré est aussi derrière : 0,191 contre 0,201. Et sur le biais de popularité il n'aide pas non plus : films proposés plus populaires (166 avis en médiane contre 151 sur le test) et moins variés (269 films différents contre 337).</w:t>
+      </w:r>
+      <w:r/>
     </w:p>
     <w:p>
       <w:r>
@@ -2758,18 +2750,7 @@
     </w:p>
     <w:p>
       <w:r>
-        <w:t>Le point qui change tout, c'est la règle pour classer les candidats. Exemple : un utilisateur a pour favoris Le Parrain (5), Pulp Fiction (5) et Alien (4). Le film A ressemble aux trois (similarités 0,4, 0,3 et 0,3), le film B ne ressemble qu'au Parrain (0,1).</w:t>
-      </w:r>
-    </w:p>
-    <w:p>
-      <w:r>
-        <w:t>Classement par note prédite, comme le cours : A obtient (0,4×5 + 0,3×5 + 0,3×4) / (0,4 + 0,3 + 0,3) = 4,7 et B obtient 0,1×5 / 0,1 = 5,0. B passe devant alors qu'il n'est relié qu'à un seul favori, et faiblement. C'est le même piège qu'avec les films vus par un seul voisin. Le NDCG reste entre 0,059 et 0,066 en validation, selon le réglage.</w:t>
-      </w:r>
-    </w:p>
-    <w:p>
-      <w:r>
-        <w:lastRenderedPageBreak/>
-        <w:t>Classement par somme, sans diviser : A obtient 4,7 et B obtient 0,5. Être relié à plusieurs favoris compte. Le NDCG monte à 0,153, au niveau du user-based, sans seuil de voisins. Le score sert seulement à ordonner, la note affichée reste la moyenne pondérée.</w:t>
+        <w:t>Le point qui change tout, c'est la règle pour classer les candidats. Exemple : un utilisateur a pour favoris Le Parrain (5), Pulp Fiction (5) et Alien (4). Le film A ressemble aux trois (similarités 0,4, 0,3 et 0,3), le film B ne ressemble qu'au Parrain (0,1). Classé par note prédite, comme le cours, A obtient (0,4×5 + 0,3×5 + 0,3×4) / (0,4 + 0,3 + 0,3) = 4,7 et B obtient 0,1×5 / 0,1 = 5,0 : B passe devant alors qu'il n'est relié qu'à un seul favori, et faiblement. C'est le même piège qu'avec les films vus par un seul voisin, et le NDCG reste entre 0,059 et 0,066 en validation. Classé par somme, sans diviser, A obtient 4,7 et B 0,5 : être relié à plusieurs favoris compte, et le NDCG monte à 0,153, au niveau du user-based, sans seuil de voisins. Le score sert seulement à ordonner, la note affichée reste la moyenne pondérée.</w:t>
       </w:r>
     </w:p>
     <w:p>
@@ -3166,27 +3147,21 @@
     <w:p/>
     <w:p>
       <w:r>
-        <w:t>L'item-based prédit mieux les notes parce qu'il part des notes de l'utilisateur lui-même (son niveau est conservé sans centrage) et que les similarités entre films sont plus fiables : un film populaire est noté par des centaines de personnes, deux utilisateurs n'ont que quelques dizaines de films en commun. Avec le classement par somme, il fait aussi bien que le user-based en validation et mieux sur le test (0,249 contre 0,201), avec des films moins populaires (128 avis en médiane contre 151) et plus de fil</w:t>
-      </w:r>
-      <w:r>
-        <w:t>ms différents (410 contre 337). Le user-based reste le système du TP, construit et réglé dans les exercices précédents, et l'item-based est notre première piste d'amélioration.</w:t>
-      </w:r>
-    </w:p>
-    <w:p>
-      <w:r>
-        <w:t>Les deux figures déposées. La première montre ce que le centrage change dans les similarités entre utilisateurs (les 224 785 paires du train). Sans centrage, toutes les similarités sont positives et tassées entre 0 et 0,2 (médiane 0,06), avec 17 % de paires exactement à 0 qui n'ont aucun film en commun. Avec centrage, la répartition se recentre sur 0 et 29 % des paires passent en négatif : ce sont les utilisateurs aux goûts opposés, qu'on ramène à 0 et qui ne peuvent plus être voisins. C'est pour ça que les</w:t>
-      </w:r>
-      <w:r>
-        <w:t xml:space="preserve"> voisins changent, et donc les listes.</w:t>
-      </w:r>
-    </w:p>
-    <w:p>
-      <w:r>
-        <w:t>La seconde compare le repère « films les plus notés » et les quatre systèmes, mesurés de la même façon en validation croisée : à gauche le NDCG@10 (plus haut = mieux), au milieu la RMSE (plus bas = mieux), à droite la popularité médiane des films proposés, notre mesure du biais de popularité (plus bas = moins de biais, la ligne pointillée est le film médian du catalogue, 3 avis). On y voit les constats en un coup d'œil : le user-based brut et l'item-based par somme dépassent le repère sur le top 10, le cent</w:t>
-      </w:r>
-      <w:r>
-        <w:t>ré est juste au-dessus, le centrage et l'item-based améliorent la RMSE, et l'item-based par somme est celui qui propose les films les moins populaires parmi les systèmes qui font de bonnes listes. Le repère, lui, propose les films les plus populaires de tous (160 avis en médiane) et seulement 38 films différents pour 671 utilisateurs.</w:t>
-      </w:r>
+        <w:t>Avec le classement par somme, l'item-based fait aussi bien que le user-based en validation et mieux sur le test (0,249 contre 0,201), avec des films moins populaires (128 avis en médiane contre 151) et plus de films différents (410 contre 337). Il prédit aussi mieux les notes, parce qu'il part des notes de l'utilisateur lui-même. Le user-based reste le système du TP, réglé aux questions précédentes, et l'item-based est notre première piste d'amélioration.</w:t>
+      </w:r>
+      <w:r/>
+    </w:p>
+    <w:p>
+      <w:r>
+        <w:t>Les deux figures déposées. La première montre ce que le centrage change dans les similarités entre utilisateurs (les 224 785 paires du train). Sans centrage, tout est positif et tassé entre 0 et 0,2 (médiane 0,06). Avec centrage, la répartition se recentre sur 0 et 29 % des paires passent en négatif : ce sont les goûts opposés, ramenés à 0, qui ne peuvent plus être voisins.</w:t>
+      </w:r>
+      <w:r/>
+    </w:p>
+    <w:p>
+      <w:r>
+        <w:t>La seconde compare le repère et les quatre systèmes, mesurés de la même façon en validation croisée : à gauche le NDCG@10 (plus haut = mieux), au milieu la RMSE (plus bas = mieux), à droite la popularité médiane des films proposés, notre mesure du biais de popularité (plus bas = moins de biais, la ligne pointillée est le film médian du catalogue, 3 avis). Le user-based brut et l'item-based par somme dépassent le repère sur le top 10, le centrage et l'item-based améliorent la RMSE, et le repère propose les films les plus populaires de tous, avec seulement 38 films différents.</w:t>
+      </w:r>
+      <w:r/>
     </w:p>
     <w:p>
       <w:r>

</xml_diff>

<commit_message>
Rapport v2 : questions 8 à 11 en phrases fluides (plus d'amorces en deux mots), définition Larousse citée
</commit_message>
<xml_diff>
--- a/questionnaire/v2/rapport_v2.docx
+++ b/questionnaire/v2/rapport_v2.docx
@@ -3266,12 +3266,12 @@
     </w:p>
     <w:p>
       <w:r>
-        <w:t>Ce qu'on appelle populaire. Au sens du dictionnaire, ce qui a la faveur du plus grand nombre. Pour un film du dataset, on n'a pas le nombre de spectateurs, on a le nombre d'avis dans le train : c'est notre mesure de popularité. Le film médian du catalogue a 3 avis, et 88 % des films en ont moins de 20.</w:t>
-      </w:r>
-    </w:p>
-    <w:p>
-      <w:r>
-        <w:t>Oui, nettement. Le film médian proposé par notre système a 151 avis, le film le moins vu qu'il propose en a 12, et 58 % des recommandations sont dans le top 50 des films les plus notés. La figure le montre : la moitié du catalogue a 1 ou 2 avis, et le système ne propose rien en dessous de 10 avis. 94 % de ses recommandations vont à des films de 50 avis et plus, une tranche qui ne représente que 4 % du catalogue.</w:t>
+        <w:t>Pour dire si le système favorise les films populaires, il faut d'abord dire ce qu'on appelle populaire. Le Larousse donne « qui a la faveur de la population, du plus grand nombre ». Pour un film du dataset, on n'a pas le nombre de spectateurs, mais on a le nombre d'avis dans le train, et c'est ce qu'on prend comme mesure de popularité. Le film médian du catalogue a 3 avis, et 88 % des films en ont moins de 20.</w:t>
+      </w:r>
+    </w:p>
+    <w:p>
+      <w:r>
+        <w:t>La réponse est oui, et nettement. Le film médian proposé par notre système a 151 avis, le film le moins vu qu'il propose en a 12, et 58 % des recommandations sont dans le top 50 des films les plus notés. Alors que la moitié du catalogue a 1 ou 2 avis, le système ne propose rien en dessous de 10 avis, et 94 % de ses recommandations vont à des films de 50 avis et plus, une tranche qui ne représente que 4 % du catalogue.</w:t>
       </w:r>
     </w:p>
     <w:tbl>
@@ -3518,42 +3518,22 @@
     </w:p>
     <w:p>
       <w:r>
-        <w:t>Est-ce une bonne chose ? C'est une question métier, et notre réponse est oui en partie.</w:t>
-      </w:r>
-    </w:p>
-    <w:p>
-      <w:r>
-        <w:t>Ce qui plaide pour :</w:t>
-      </w:r>
-    </w:p>
-    <w:p>
-      <w:r>
-        <w:t>Un film populaire l'est parce qu'il plaît au plus grand nombre. Proposer The Shawshank Redemption à quelqu'un qui aime les classiques est rarement une erreur. Les métriques le confirment : ce seuil a fait passer le NDCG de 0,060 à 0,201, et le repère qui ne propose que les films les plus notés fait déjà 0,147.</w:t>
-      </w:r>
-    </w:p>
-    <w:p>
-      <w:r>
-        <w:t>Le système reste personnalisé malgré ça : sept dixièmes de chaque liste sont propres à l'utilisateur, trois dixièmes viennent du top des ventes (en moyenne, 3 des 10 films d'une liste sont aussi dans les 10 films les plus notés).</w:t>
-      </w:r>
-    </w:p>
-    <w:p>
-      <w:r>
-        <w:t>Ce qui plaide contre :</w:t>
-      </w:r>
-    </w:p>
-    <w:p>
-      <w:r>
-        <w:t>Pas de découverte. L'utilisateur connaît probablement déjà ces films, ou les aurait trouvés sans nous.</w:t>
-      </w:r>
-    </w:p>
-    <w:p>
-      <w:r>
-        <w:t>Pour la plateforme, 96 % du catalogue n'est jamais proposé. Ces films ne seront jamais valorisés.</w:t>
-      </w:r>
-    </w:p>
-    <w:p>
-      <w:r>
-        <w:t>Ce qu'on a fait, et ce qu'on ferait. On a déjà tenu compte de ce biais au moment de choisir le réglage : à qualité égale, on a pris le plus varié, (30, 10) plutôt que (50, 15), et sur le test ça donne 337 films différents au lieu de 249 et une popularité médiane de 151 au lieu de 159. Ça ne suffit pas : le biais reste massif, parce que le seuil de voisins, quel qu'il soit, filtre par la popularité. Aller plus loin sur le seuil coûte de la qualité : sur le test, (25, 8) propose 397 films différents et (20, 7) 427, avec des films moins populaires (138 et 133 avis en médiane), mais en validation leur NDCG est un peu plus bas (0,146 et 0,143 contre 0,150). Pour aller plus loin sans casser la qualité, deux pistes : l'item-based du bonus, qui fait mieux en NDCG avec des films moins populaires (128 avis en médiane, 410 films différents), et réserver une place ou deux de la liste à une suggestion plus inattendue, parmi les films moins vus que les voisins ont aimés, pour jouer sur la sérendipité dont parle le cours. Le biais de popularité n'est donc pas une fatalité du système, c'est un réglage qu'on assume pour ce TP et qu'on corrigerait en production.</w:t>
+        <w:t>Est-ce que c'est une bonne chose ? C'est plus une question métier qu'une question technique, et notre réponse est oui, en partie.</w:t>
+      </w:r>
+    </w:p>
+    <w:p>
+      <w:r>
+        <w:t>Ce qui plaide pour, d'abord. Un film populaire l'est parce qu'il plaît au plus grand nombre, et proposer The Shawshank Redemption à quelqu'un qui aime les classiques est rarement une erreur. Les métriques le confirment : ce seuil a fait passer le NDCG de 0,060 à 0,201, et le repère qui ne propose que les films les plus notés fait déjà 0,147. Et le système reste personnalisé malgré tout : en moyenne, 3 des 10 films d'une liste sont aussi dans les 10 films les plus notés, les 7 autres sont propres à l'utilisateur.</w:t>
+      </w:r>
+    </w:p>
+    <w:p>
+      <w:r>
+        <w:t>Ce qui plaide contre, ensuite. Il n'y a pas de découverte : l'utilisateur connaît probablement déjà ces films, ou les aurait trouvés sans nous. Et pour la plateforme, 96 % du catalogue n'est jamais proposé, donc jamais valorisé.</w:t>
+      </w:r>
+    </w:p>
+    <w:p>
+      <w:r>
+        <w:t>On a déjà tenu compte de ce biais au moment de choisir le réglage : à qualité égale, on a pris le plus varié, (30, 10) plutôt que (50, 15), et sur le test ça donne 337 films différents au lieu de 249 et une popularité médiane de 151 au lieu de 159. Ça ne suffit pas : le biais reste massif, parce que le seuil de voisins, quel qu'il soit, filtre par la popularité. Aller plus loin sur le seuil coûte de la qualité : sur le test, (25, 8) propose 397 films différents et (20, 7) 427, avec des films moins populaires (138 et 133 avis en médiane), mais en validation leur NDCG est un peu plus bas (0,146 et 0,143 contre 0,150). Pour aller plus loin sans casser la qualité, deux pistes : l'item-based du bonus, qui fait mieux en NDCG avec des films moins populaires (128 avis en médiane, 410 films différents), et réserver une place ou deux de la liste à une suggestion plus inattendue, parmi les films moins vus que les voisins ont aimés, pour jouer sur la sérendipité dont parle le cours. Le biais de popularité n'est donc pas une fatalité du système, c'est un réglage qu'on assume pour ce TP et qu'on corrigerait en production.</w:t>
       </w:r>
       <w:r/>
       <w:r/>
@@ -3619,11 +3599,9 @@
     </w:p>
     <w:p>
       <w:r>
-        <w:t>Comment on mesure. La diversité d'une liste, c'est : est-ce que les dix films proposés se ressemblent tous, ou couvrent des choses différentes ? On l'a mesurée avec les genres du catalogue (chaque film a une liste de genres, comme Crime, Drama, Thriller). Deux mesures par liste : le nombre de genres différents couverts par les 10 films, et la part des 45 paires de films de la liste qui n'ont aucun genre en commun (0 = tous les films se ressemblent, 1 = ils sont tous différents). Pour savoir si un chiffre es</w:t>
-      </w:r>
-      <w:r>
-        <w:t>t bon, on mesure la même chose sur les dix films préférés de chaque utilisateur : ça donne la variété de ses propres goûts.</w:t>
-      </w:r>
+        <w:t>Pour une liste, être diverse veut dire que les dix films proposés ne se ressemblent pas tous. On l'a mesuré avec les genres du catalogue (chaque film a une liste de genres, comme Crime, Drama, Thriller), avec deux mesures par liste : le nombre de genres différents couverts par les 10 films, et la part des 45 paires de films de la liste qui n'ont aucun genre en commun (0 = tous les films se ressemblent, 1 = ils sont tous différents). Pour savoir si un chiffre est bon, on mesure la même chose sur les dix films préférés de chaque utilisateur : ça donne la variété de ses propres goûts.</w:t>
+      </w:r>
+      <w:r/>
     </w:p>
     <w:tbl>
       <w:tblPr>
@@ -3812,7 +3790,7 @@
     <w:p/>
     <w:p>
       <w:r>
-        <w:t>Réponse : diverses en genres, autant que les goûts de l'utilisateur. Un top 10 du système couvre 10,7 genres différents en moyenne et 43 % de ses paires de films n'ont aucun genre en commun, contre 10,3 et 39 % pour les dix films préférés de l'utilisateur. Le système reproduit la variété des goûts de chacun, un peu plus. Le repère des films les plus notés est le plus varié (11,5 et 54 %), ce qui est logique : il mélange tout sans tenir compte de personne, la variété n'est pas un mérite chez lui.</w:t>
+        <w:t>Sur les genres, oui, les listes sont diverses, autant que les goûts de l'utilisateur. Un top 10 du système couvre 10,7 genres différents en moyenne et 43 % de ses paires de films n'ont aucun genre en commun, contre 10,3 et 39 % pour les dix films préférés de l'utilisateur. Le système reproduit la variété des goûts de chacun, un peu plus. Le repère des films les plus notés est le plus varié (11,5 et 54 %), ce qui est logique : il mélange tout sans tenir compte de personne, la variété n'est pas un mérite chez lui.</w:t>
       </w:r>
     </w:p>
     <w:p>
@@ -3968,7 +3946,7 @@
     </w:p>
     <w:p>
       <w:r>
-        <w:t>Ce qu'on mesure. La question précédente regardait une liste à la fois. Ici on regarde les 671 listes ensemble, soit 6 642 recommandations (24 utilisateurs ont une liste plus courte que 10) : combien de films différents y apparaissent, quelle part du catalogue ça représente, et à quel point les recommandations se concentrent sur quelques titres. Un système peut faire des listes variées pour chacun et quand même proposer les mêmes cinquante films à tout le monde.</w:t>
+        <w:t>La question précédente regardait une liste à la fois. Ici on regarde les 671 listes ensemble, soit 6 642 recommandations (24 utilisateurs ont une liste plus courte que 10) : combien de films différents y apparaissent, quelle part du catalogue ça représente, et à quel point les recommandations se concentrent sur quelques titres. Un système peut faire des listes variées pour chacun et quand même proposer les mêmes cinquante films à tout le monde.</w:t>
       </w:r>
     </w:p>
     <w:tbl>
@@ -4215,7 +4193,7 @@
     <w:p/>
     <w:p>
       <w:r>
-        <w:t>Réponse : non. Le système retenu ne propose que 337 films différents, 4 % du catalogue. 23 films suffisent à faire la moitié de toutes les recommandations, et les 10 films les plus proposés en font 31 %. Concrètement, The Shawshank Redemption est proposé à 296 utilisateurs sur 671, The Godfather à 260, Schindler's List à 257, Pulp Fiction à 238, The Usual Suspects à 219. Chaque liste est variée (question précédente), mais toutes puisent dans le même petit réservoir de classiques.</w:t>
+        <w:t>Au global, non, les recommandations ne sont pas diverses. Le système retenu ne propose que 337 films différents, 4 % du catalogue. 23 films suffisent à faire la moitié de toutes les recommandations, et les 10 films les plus proposés en font 31 %. Concrètement, The Shawshank Redemption est proposé à 296 utilisateurs sur 671, The Godfather à 260, Schindler's List à 257, Pulp Fiction à 238, The Usual Suspects à 219. Chaque liste est variée (question précédente), mais toutes puisent dans le même petit réservoir de classiques.</w:t>
       </w:r>
     </w:p>
     <w:tbl>
@@ -4454,19 +4432,15 @@
     </w:p>
     <w:p>
       <w:r>
-        <w:t>Par genres, le même déséquilibre. On a regardé quelle part des films proposés porte chaque genre, comparée au catalogue. Le système sur-représente le polar et le drame : Crime passe de 14 % des films du catalogue à 34 % des films proposés, Thriller de 23 % à 33 %, Drama de 51 % à 56 %, War de 3 % à 8 %, History de 4 % à 8 %. À l'inverse, la comédie tombe de 37 % à 14 %, la romance de 20 % à 9 %, l'horreur de 10 % à 1,5 %, l'animation de 5 % à 2,6 %, le documentaire de 5 % à 0,1 %, et deux genres ne sont jam</w:t>
-      </w:r>
-      <w:r>
-        <w:t>ais proposés (Foreign, TV Movie). L'item-based est plus proche du catalogue sur la comédie (29 %) et l'animation (7 %), mais il sur-représente l'action et l'aventure. Ce n'est pas seulement que le système propose peu de films : il propose surtout un certain type de films, les classiques du polar et du drame que beaucoup de gens ont vus et bien notés.</w:t>
-      </w:r>
-    </w:p>
-    <w:p>
-      <w:r>
-        <w:t>Le lien avec le cours. Le cours donne au filtrage collaboratif un avantage, la sérendipité naturelle, des recommandations auxquelles on ne s'attend pas, et un inconvénient, le biais de popularité. Notre seuil de voisins fait pencher la balance du mauvais côté : en ne gardant que les films vus par 10 voisins sur 30, il amplifie le biais de popularité et il fait perdre la sérendipité, puisqu'un film inattendu est presque toujours un film peu vu. Au global, le système se comporte plus comme un top des ventes p</w:t>
-      </w:r>
-      <w:r>
-        <w:t>ersonnalisé que comme un système de découverte.</w:t>
-      </w:r>
+        <w:t>Par genres, on retrouve le même déséquilibre. On a regardé quelle part des films proposés porte chaque genre, comparée au catalogue. Le système sur-représente le polar et le drame : Crime passe de 14 % des films du catalogue à 34 % des films proposés, Thriller de 23 % à 33 %, Drama de 51 % à 56 %, War de 3 % à 8 %, History de 4 % à 8 %. À l'inverse, la comédie tombe de 37 % à 14 %, la romance de 20 % à 9 %, l'horreur de 10 % à 1,5 %, l'animation de 5 % à 2,6 %, le documentaire de 5 % à 0,1 %, et deux genres ne sont jamais proposés (Foreign, TV Movie). L'item-based est plus proche du catalogue sur la comédie (29 %) et l'animation (7 %), mais il sur-représente l'action et l'aventure. Ce n'est pas seulement que le système propose peu de films : il propose surtout un certain type de films, les classiques du polar et du drame que beaucoup de gens ont vus et bien notés.</w:t>
+      </w:r>
+      <w:r/>
+    </w:p>
+    <w:p>
+      <w:r>
+        <w:t>Ça rejoint le cours, qui donne au filtrage collaboratif un avantage, la sérendipité naturelle, des recommandations auxquelles on ne s'attend pas, et un inconvénient, le biais de popularité. Notre seuil de voisins fait pencher la balance du mauvais côté : en ne gardant que les films vus par 10 voisins sur 30, il amplifie le biais de popularité et il fait perdre la sérendipité, puisqu'un film inattendu est presque toujours un film peu vu. Au global, le système se comporte plus comme un top des ventes personnalisé que comme un système de découverte.</w:t>
+      </w:r>
+      <w:r/>
     </w:p>
     <w:p>
       <w:r>
@@ -4582,7 +4556,7 @@
     </w:p>
     <w:p>
       <w:r>
-        <w:t>Ce qu'on mesure. Personnalisé veut dire que deux utilisateurs aux goûts différents reçoivent des listes différentes. Un système pas du tout personnalisé donnerait la même liste à tout le monde, soit 10 films en commun entre n'importe quels deux utilisateurs. On a donc compté, pour chaque paire d'utilisateurs (224 785 paires), le nombre de films en commun entre leurs deux top 10, et aussi le nombre de films en commun entre la liste d'un utilisateur et le top des ventes.</w:t>
+        <w:t>Personnalisé veut dire que deux utilisateurs aux goûts différents reçoivent des listes différentes. Un système pas du tout personnalisé donnerait la même liste à tout le monde, soit 10 films en commun entre n'importe quels deux utilisateurs. On a donc compté, pour chaque paire d'utilisateurs (224 785 paires), le nombre de films en commun entre leurs deux top 10, et aussi le nombre de films en commun entre la liste d'un utilisateur et le top des ventes.</w:t>
       </w:r>
     </w:p>
     <w:tbl>
@@ -4783,15 +4757,13 @@
     <w:p/>
     <w:p>
       <w:r>
-        <w:t xml:space="preserve">Réponse : oui, mais moins qu'on ne le croirait. Deux utilisateurs pris au hasard ont en moyenne 1,5 film en commun sur 10, et plus d'une paire sur quatre n'en a aucun. Le repère des films les plus notés, lui, donne presque la même liste à tout le monde : 5,4 films en commun (ce n'est pas 10 parce que chacun a déjà vu certains de ces films, qu'on ne lui propose pas). Donc les listes suivent bien les goûts. Mais 3,0 des 10 films d'une liste viennent du top des ventes : en gros, trois dixièmes de chaque liste </w:t>
-      </w:r>
-      <w:r>
-        <w:t>sont communs à tout le monde et sept dixièmes sont propres à l'utilisateur. L'item-based est plus personnalisé (1,1 film en commun, 43 % des paires sans aucun).</w:t>
-      </w:r>
-    </w:p>
-    <w:p>
-      <w:r>
-        <w:t>Un exemple pour le voir. On a pris les deux utilisateurs les plus opposés sur les films d'action : le 298, qui les adore (4,6 de moyenne sur ce genre), et le 457, qui les déteste (1,9). Ils n'ont aucun film en commun dans leurs top 10, et les listes racontent bien leurs goûts.</w:t>
+        <w:t>Oui, les recommandations sont personnalisées, mais moins qu'on ne le croirait. Deux utilisateurs pris au hasard ont en moyenne 1,5 film en commun sur 10, et plus d'une paire sur quatre n'en a aucun. Le repère des films les plus notés, lui, donne presque la même liste à tout le monde : 5,4 films en commun (ce n'est pas 10 parce que chacun a déjà vu certains de ces films, qu'on ne lui propose pas). Donc les listes suivent bien les goûts. Mais 3,0 des 10 films d'une liste viennent du top des ventes : en gros, trois dixièmes de chaque liste sont communs à tout le monde et sept dixièmes sont propres à l'utilisateur. L'item-based est plus personnalisé (1,1 film en commun, 43 % des paires sans aucun).</w:t>
+      </w:r>
+      <w:r/>
+    </w:p>
+    <w:p>
+      <w:r>
+        <w:t>Pour le voir sur un exemple, on a pris les deux utilisateurs les plus opposés sur les films d'action : le 298, qui les adore (4,6 de moyenne sur ce genre), et le 457, qui les déteste (1,9). Ils n'ont aucun film en commun dans leurs top 10, et les listes racontent bien leurs goûts.</w:t>
       </w:r>
     </w:p>
     <w:tbl>

</xml_diff>

<commit_message>
Rapport v2 : relecture finale (titres alignés sur les tableaux, tournures pour/contre, minuscule après deux-points)
</commit_message>
<xml_diff>
--- a/questionnaire/v2/rapport_v2.docx
+++ b/questionnaire/v2/rapport_v2.docx
@@ -1402,21 +1402,12 @@
     <w:p/>
     <w:p>
       <w:r>
-        <w:t>Stabilité</w:t>
-      </w:r>
-      <w:r>
-        <w:t> :</w:t>
-      </w:r>
-      <w:r>
-        <w:t xml:space="preserve"> Entre les 5 parts, l'écart-type du NDCG est entre 0,002 et 0,008. Donc deux réglages à moins de 0,01 l'un de l'autre, on ne peut pas les départager. Ce qu'on voit dans le tableau, </w:t>
-      </w:r>
-      <w:r>
-        <w:lastRenderedPageBreak/>
-        <w:t xml:space="preserve">c'est que les deux réglages vont ensemble : ce qui compte, c'est le rapport entre le seuil et le nombre de voisins, à peu près un tiers. Sur cette diagonale, (30, 10), (50, 15) et (100, 35) donnent tous 0,15 et le plateau commence vers k = 25. Là c'est stable. Dès qu'on s'en écarte, ça décroche dans les deux sens : trop de seuil </w:t>
-      </w:r>
-      <w:r>
-        <w:t>et les listes se vident (à k = 50, passer de 15 à 25 divise le NDCG par 1,6), pas assez de seuil et on retombe sur des films vus par un seul voisin ((100, 3) tombe à 0,008). Il faut donc régler les deux ensemble, pas l'un après l'autre.</w:t>
-      </w:r>
+        <w:t>Stabilité : entre les 5 parts, l'écart-type du NDCG est entre 0,002 et 0,008. Donc deux réglages à moins de 0,01 l'un de l'autre, on ne peut pas les départager. Ce qu'on voit dans le tableau, c'est que les deux réglages vont ensemble : ce qui compte, c'est le rapport entre le seuil et le nombre de voisins, à peu près un tiers. Sur cette diagonale, (30, 10), (50, 15) et (100, 35) donnent tous 0,15 et le plateau commence vers k = 25. Là c'est stable. Dès qu'on s'en écarte, ça décroche dans les deux sens : trop de seuil et les listes se vident (à k = 50, passer de 15 à 25 divise le NDCG par 1,6), pas assez de seuil et on retombe sur des films vus par un seul voisin ((100, 3) tombe à 0,008). Il faut donc régler les deux ensemble, pas l'un après l'autre.</w:t>
+      </w:r>
+      <w:r/>
+      <w:r/>
+      <w:r/>
+      <w:r/>
     </w:p>
     <w:p>
       <w:r>
@@ -3523,12 +3514,12 @@
     </w:p>
     <w:p>
       <w:r>
-        <w:t>Ce qui plaide pour, d'abord. Un film populaire l'est parce qu'il plaît au plus grand nombre, et proposer The Shawshank Redemption à quelqu'un qui aime les classiques est rarement une erreur. Les métriques le confirment : ce seuil a fait passer le NDCG de 0,060 à 0,201, et le repère qui ne propose que les films les plus notés fait déjà 0,147. Et le système reste personnalisé malgré tout : en moyenne, 3 des 10 films d'une liste sont aussi dans les 10 films les plus notés, les 7 autres sont propres à l'utilisateur.</w:t>
-      </w:r>
-    </w:p>
-    <w:p>
-      <w:r>
-        <w:t>Ce qui plaide contre, ensuite. Il n'y a pas de découverte : l'utilisateur connaît probablement déjà ces films, ou les aurait trouvés sans nous. Et pour la plateforme, 96 % du catalogue n'est jamais proposé, donc jamais valorisé.</w:t>
+        <w:t>Ce qui plaide pour, d'abord : un film populaire l'est parce qu'il plaît au plus grand nombre, et proposer The Shawshank Redemption à quelqu'un qui aime les classiques est rarement une erreur. Les métriques le confirment : ce seuil a fait passer le NDCG de 0,060 à 0,201, et le repère qui ne propose que les films les plus notés fait déjà 0,147. Et le système reste personnalisé malgré tout : en moyenne, 3 des 10 films d'une liste sont aussi dans les 10 films les plus notés, les 7 autres sont propres à l'utilisateur.</w:t>
+      </w:r>
+    </w:p>
+    <w:p>
+      <w:r>
+        <w:t>Ce qui plaide contre, ensuite : il n'y a pas de découverte, l'utilisateur connaît probablement déjà ces films, ou les aurait trouvés sans nous. Et pour la plateforme, 96 % du catalogue n'est jamais proposé, donc jamais valorisé.</w:t>
       </w:r>
     </w:p>
     <w:p>
@@ -3795,11 +3786,9 @@
     </w:p>
     <w:p>
       <w:r>
-        <w:t xml:space="preserve">Mais à l'échelle des thèmes, c'est plus concentré. L'exemple de l'utilisateur 60 le montre. Ses préférés vont du Parrain à Castle in the Sky en passant par Gattaca et La vie est belle. Son top 10 est cohérent avec ce profil, mais sept films sur dix sont des polars (Crime ou Thriller) et </w:t>
-      </w:r>
-      <w:r>
-        <w:t>huit sur dix des drames : Pulp Fiction, The Usual Suspects, The Dark Knight, The Big Lebowski, The Shawshank Redemption, GoodFellas, City of God. Les genres sont variés sur le papier, le ton l'est moins. C'est la conséquence du seuil de voisins : il ne laisse passer que les classiques que beaucoup de voisins ont vus, et les classiques aimés par les amateurs de cinéma d'auteur sont souvent des polars.</w:t>
-      </w:r>
+        <w:t>Mais à l'échelle des thèmes, c'est plus concentré. L'exemple de l'utilisateur 60 le montre. Ses préférés vont de The Godfather à Castle in the Sky en passant par Gattaca et Life Is Beautiful. Son top 10 est cohérent avec ce profil, mais sept films sur dix sont des polars (Crime ou Thriller) et huit sur dix des drames : Pulp Fiction, The Usual Suspects, The Dark Knight, The Big Lebowski, The Shawshank Redemption, GoodFellas, City of God. Les genres sont variés sur le papier, le ton l'est moins. C'est la conséquence du seuil de voisins : il ne laisse passer que les classiques que beaucoup de voisins ont vus, et les classiques aimés par les amateurs de cinéma d'auteur sont souvent des polars.</w:t>
+      </w:r>
+      <w:r/>
     </w:p>
     <w:tbl>
       <w:tblPr>
@@ -4833,7 +4822,7 @@
     <w:p/>
     <w:p>
       <w:r>
-        <w:t>Fight Club, Star Wars, Se7en et Il faut sauver le soldat Ryan d'un côté, Le Parrain, Memento, 2001 et Blade Runner de l'autre. Les deux reçoivent un Seigneur des anneaux, mais pas le même. C'est là qu'on voit les sept dixièmes personnalisés. Les trois dixièmes communs sont les classiques que le seuil de voisins fait remonter chez presque tout le monde, et ici, par hasard, ce ne sont pas les mêmes chez les deux.</w:t>
+        <w:t>Fight Club, Star Wars, Se7en et Saving Private Ryan d'un côté, The Godfather, Memento, 2001 et Blade Runner de l'autre. Les deux reçoivent un Lord of the Rings, mais pas le même. C'est là qu'on voit les sept dixièmes personnalisés. Les trois dixièmes communs sont les classiques que le seuil de voisins fait remonter chez presque tout le monde, et ici, par hasard, ce ne sont pas les mêmes chez les deux.</w:t>
       </w:r>
     </w:p>
     <w:p>

</xml_diff>

<commit_message>
Script unique : maquette de la page d'accueil dessinée par le code ; les dix figures déposées sont celles du script
</commit_message>
<xml_diff>
--- a/questionnaire/v2/rapport_v2.docx
+++ b/questionnaire/v2/rapport_v2.docx
@@ -2157,7 +2157,7 @@
         </w:rPr>
         <w:drawing>
           <wp:inline distT="0" distB="0" distL="0" distR="0" wp14:anchorId="5290F89A" wp14:editId="1E9DFF0B">
-            <wp:extent cx="5760000" cy="1972256"/>
+            <wp:extent cx="5760000" cy="1973297"/>
             <wp:effectExtent l="0" t="0" r="0" b="0"/>
             <wp:docPr id="1" name="Picture 1"/>
             <wp:cNvGraphicFramePr>
@@ -2179,7 +2179,7 @@
                   <pic:spPr>
                     <a:xfrm>
                       <a:off x="0" y="0"/>
-                      <a:ext cx="5760000" cy="1972256"/>
+                      <a:ext cx="5760000" cy="1973297"/>
                     </a:xfrm>
                     <a:prstGeom prst="rect">
                       <a:avLst/>
@@ -2200,7 +2200,7 @@
         <w:lastRenderedPageBreak/>
         <w:drawing>
           <wp:inline distT="0" distB="0" distL="0" distR="0" wp14:anchorId="2E4E0D55" wp14:editId="03624289">
-            <wp:extent cx="5760000" cy="3240000"/>
+            <wp:extent cx="5760000" cy="3243818"/>
             <wp:effectExtent l="0" t="0" r="0" b="0"/>
             <wp:docPr id="2" name="Picture 2"/>
             <wp:cNvGraphicFramePr>
@@ -2222,7 +2222,7 @@
                   <pic:spPr>
                     <a:xfrm>
                       <a:off x="0" y="0"/>
-                      <a:ext cx="5760000" cy="3240000"/>
+                      <a:ext cx="5760000" cy="3243818"/>
                     </a:xfrm>
                     <a:prstGeom prst="rect">
                       <a:avLst/>
@@ -3162,7 +3162,7 @@
         <w:lastRenderedPageBreak/>
         <w:drawing>
           <wp:inline distT="0" distB="0" distL="0" distR="0" wp14:anchorId="6B9F2E46" wp14:editId="54BF2F96">
-            <wp:extent cx="5760000" cy="1955229"/>
+            <wp:extent cx="5760000" cy="1956687"/>
             <wp:effectExtent l="0" t="0" r="0" b="0"/>
             <wp:docPr id="3" name="Picture 3"/>
             <wp:cNvGraphicFramePr>
@@ -3184,7 +3184,7 @@
                   <pic:spPr>
                     <a:xfrm>
                       <a:off x="0" y="0"/>
-                      <a:ext cx="5760000" cy="1955229"/>
+                      <a:ext cx="5760000" cy="1956687"/>
                     </a:xfrm>
                     <a:prstGeom prst="rect">
                       <a:avLst/>
@@ -3204,7 +3204,7 @@
         </w:rPr>
         <w:drawing>
           <wp:inline distT="0" distB="0" distL="0" distR="0" wp14:anchorId="45916695" wp14:editId="76193AD7">
-            <wp:extent cx="5760000" cy="1604347"/>
+            <wp:extent cx="5760000" cy="1599161"/>
             <wp:effectExtent l="0" t="0" r="0" b="0"/>
             <wp:docPr id="4" name="Picture 4"/>
             <wp:cNvGraphicFramePr>
@@ -3226,7 +3226,7 @@
                   <pic:spPr>
                     <a:xfrm>
                       <a:off x="0" y="0"/>
-                      <a:ext cx="5760000" cy="1604347"/>
+                      <a:ext cx="5760000" cy="1599161"/>
                     </a:xfrm>
                     <a:prstGeom prst="rect">
                       <a:avLst/>
@@ -3545,7 +3545,7 @@
         </w:rPr>
         <w:drawing>
           <wp:inline distT="0" distB="0" distL="0" distR="0" wp14:anchorId="40F34CB5" wp14:editId="50D2864F">
-            <wp:extent cx="5760000" cy="2524045"/>
+            <wp:extent cx="5760000" cy="2523428"/>
             <wp:effectExtent l="0" t="0" r="0" b="0"/>
             <wp:docPr id="5" name="Picture 5"/>
             <wp:cNvGraphicFramePr>
@@ -3567,7 +3567,7 @@
                   <pic:spPr>
                     <a:xfrm>
                       <a:off x="0" y="0"/>
-                      <a:ext cx="5760000" cy="2524045"/>
+                      <a:ext cx="5760000" cy="2523428"/>
                     </a:xfrm>
                     <a:prstGeom prst="rect">
                       <a:avLst/>
@@ -3890,7 +3890,7 @@
         </w:rPr>
         <w:drawing>
           <wp:inline distT="0" distB="0" distL="0" distR="0" wp14:anchorId="37775446" wp14:editId="77E8D785">
-            <wp:extent cx="5760000" cy="2066605"/>
+            <wp:extent cx="5760000" cy="2064135"/>
             <wp:effectExtent l="0" t="0" r="0" b="0"/>
             <wp:docPr id="6" name="Picture 6"/>
             <wp:cNvGraphicFramePr>
@@ -3912,7 +3912,7 @@
                   <pic:spPr>
                     <a:xfrm>
                       <a:off x="0" y="0"/>
-                      <a:ext cx="5760000" cy="2066605"/>
+                      <a:ext cx="5760000" cy="2064135"/>
                     </a:xfrm>
                     <a:prstGeom prst="rect">
                       <a:avLst/>
@@ -4457,7 +4457,7 @@
         </w:rPr>
         <w:drawing>
           <wp:inline distT="0" distB="0" distL="0" distR="0" wp14:anchorId="3AA0FE35" wp14:editId="4D44F884">
-            <wp:extent cx="5760000" cy="2030504"/>
+            <wp:extent cx="5760000" cy="2037463"/>
             <wp:effectExtent l="0" t="0" r="0" b="0"/>
             <wp:docPr id="7" name="Picture 7"/>
             <wp:cNvGraphicFramePr>
@@ -4479,7 +4479,7 @@
                   <pic:spPr>
                     <a:xfrm>
                       <a:off x="0" y="0"/>
-                      <a:ext cx="5760000" cy="2030504"/>
+                      <a:ext cx="5760000" cy="2037463"/>
                     </a:xfrm>
                     <a:prstGeom prst="rect">
                       <a:avLst/>
@@ -4499,7 +4499,7 @@
         </w:rPr>
         <w:drawing>
           <wp:inline distT="0" distB="0" distL="0" distR="0" wp14:anchorId="69FEC1CF" wp14:editId="6D5E0494">
-            <wp:extent cx="5760000" cy="3494831"/>
+            <wp:extent cx="5760000" cy="3508045"/>
             <wp:effectExtent l="0" t="0" r="0" b="0"/>
             <wp:docPr id="8" name="Picture 8"/>
             <wp:cNvGraphicFramePr>
@@ -4521,7 +4521,7 @@
                   <pic:spPr>
                     <a:xfrm>
                       <a:off x="0" y="0"/>
-                      <a:ext cx="5760000" cy="3494831"/>
+                      <a:ext cx="5760000" cy="3508045"/>
                     </a:xfrm>
                     <a:prstGeom prst="rect">
                       <a:avLst/>
@@ -4841,7 +4841,7 @@
         </w:rPr>
         <w:drawing>
           <wp:inline distT="0" distB="0" distL="0" distR="0" wp14:anchorId="4AE28E90" wp14:editId="7083FA42">
-            <wp:extent cx="5760000" cy="2524045"/>
+            <wp:extent cx="5760000" cy="2523428"/>
             <wp:effectExtent l="0" t="0" r="0" b="0"/>
             <wp:docPr id="9" name="Picture 9"/>
             <wp:cNvGraphicFramePr>
@@ -4863,7 +4863,7 @@
                   <pic:spPr>
                     <a:xfrm>
                       <a:off x="0" y="0"/>
-                      <a:ext cx="5760000" cy="2524045"/>
+                      <a:ext cx="5760000" cy="2523428"/>
                     </a:xfrm>
                     <a:prstGeom prst="rect">
                       <a:avLst/>
@@ -5066,7 +5066,7 @@
       <w:r>
         <w:drawing>
           <wp:inline xmlns:a="http://schemas.openxmlformats.org/drawingml/2006/main" xmlns:pic="http://schemas.openxmlformats.org/drawingml/2006/picture">
-            <wp:extent cx="5760720" cy="3190553"/>
+            <wp:extent cx="5760720" cy="2899253"/>
             <wp:docPr id="10" name="Picture 10"/>
             <wp:cNvGraphicFramePr>
               <a:graphicFrameLocks noChangeAspect="1"/>
@@ -5087,7 +5087,7 @@
                   <pic:spPr>
                     <a:xfrm>
                       <a:off x="0" y="0"/>
-                      <a:ext cx="5760720" cy="3190553"/>
+                      <a:ext cx="5760720" cy="2899253"/>
                     </a:xfrm>
                     <a:prstGeom prst="rect"/>
                   </pic:spPr>

</xml_diff>

<commit_message>
Rapport v2 : ligne k = 100 du tableau NDCG remise dans les bonnes colonnes (25, 35, 50)
</commit_message>
<xml_diff>
--- a/questionnaire/v2/rapport_v2.docx
+++ b/questionnaire/v2/rapport_v2.docx
@@ -1170,6 +1170,14 @@
             <w:tcW w:w="1008" w:type="dxa"/>
           </w:tcPr>
           <w:p>
+            <w:r/>
+          </w:p>
+        </w:tc>
+        <w:tc>
+          <w:tcPr>
+            <w:tcW w:w="1008" w:type="dxa"/>
+          </w:tcPr>
+          <w:p>
             <w:r>
               <w:t>0,137</w:t>
             </w:r>
@@ -1194,12 +1202,6 @@
               <w:t>0,056</w:t>
             </w:r>
           </w:p>
-        </w:tc>
-        <w:tc>
-          <w:tcPr>
-            <w:tcW w:w="1008" w:type="dxa"/>
-          </w:tcPr>
-          <w:p/>
         </w:tc>
       </w:tr>
     </w:tbl>

</xml_diff>